<commit_message>
Refresh Nature reporting summary worksheet
</commit_message>
<xml_diff>
--- a/output/doc/RMTGuard_external_review_packet_2026-05-12.docx
+++ b/output/doc/RMTGuard_external_review_packet_2026-05-12.docx
@@ -27,7 +27,7 @@
     </w:p>
     <w:p>
       <w:r>
-        <w:t>Generated: 2026-05-12 12:52:37</w:t>
+        <w:t>Generated: 2026-05-12 13:01:50</w:t>
       </w:r>
     </w:p>
     <w:tbl>
@@ -221,7 +221,7 @@
       <w:r>
         <w:drawing>
           <wp:inline xmlns:a="http://schemas.openxmlformats.org/drawingml/2006/main" xmlns:pic="http://schemas.openxmlformats.org/drawingml/2006/picture">
-            <wp:extent cx="5120640" cy="7680192"/>
+            <wp:extent cx="5120640" cy="7993418"/>
             <wp:docPr id="1" name="Picture 1"/>
             <wp:cNvGraphicFramePr>
               <a:graphicFrameLocks noChangeAspect="1"/>
@@ -242,7 +242,7 @@
                   <pic:spPr>
                     <a:xfrm>
                       <a:off x="0" y="0"/>
-                      <a:ext cx="5120640" cy="7680192"/>
+                      <a:ext cx="5120640" cy="7993418"/>
                     </a:xfrm>
                     <a:prstGeom prst="rect"/>
                   </pic:spPr>
@@ -330,7 +330,7 @@
         <w:pStyle w:val="ListBullet"/>
       </w:pPr>
       <w:r>
-        <w:t>Items checked: 26</w:t>
+        <w:t>Items checked: 28</w:t>
       </w:r>
     </w:p>
     <w:p>
@@ -378,7 +378,7 @@
         <w:pStyle w:val="ListBullet"/>
       </w:pPr>
       <w:r>
-        <w:t>journal_route: 2</w:t>
+        <w:t>journal_route: 3</w:t>
       </w:r>
     </w:p>
     <w:p>
@@ -394,7 +394,7 @@
         <w:pStyle w:val="ListBullet"/>
       </w:pPr>
       <w:r>
-        <w:t>manuscript_text: 3</w:t>
+        <w:t>manuscript_text: 4</w:t>
       </w:r>
     </w:p>
     <w:p>
@@ -499,1731 +499,6 @@
     <w:p>
       <w:r>
         <w:t xml:space="preserve">  Nature Methods remains the preferred route.</w:t>
-      </w:r>
-    </w:p>
-    <w:p>
-      <w:pPr>
-        <w:pStyle w:val="Heading2"/>
-      </w:pPr>
-      <w:r>
-        <w:t>Frozen Items</w:t>
-      </w:r>
-    </w:p>
-    <w:tbl>
-      <w:tblPr>
-        <w:tblStyle w:val="TableGrid"/>
-        <w:tblW w:type="auto" w:w="0"/>
-        <w:tblLook w:firstColumn="1" w:firstRow="1" w:lastColumn="0" w:lastRow="0" w:noHBand="0" w:noVBand="1" w:val="04A0"/>
-      </w:tblPr>
-      <w:tblGrid>
-        <w:gridCol w:w="1680"/>
-        <w:gridCol w:w="1680"/>
-        <w:gridCol w:w="1680"/>
-        <w:gridCol w:w="1680"/>
-        <w:gridCol w:w="1680"/>
-        <w:gridCol w:w="1680"/>
-      </w:tblGrid>
-      <w:tr>
-        <w:tc>
-          <w:tcPr>
-            <w:tcW w:type="dxa" w:w="1680"/>
-          </w:tcPr>
-          <w:p>
-            <w:r>
-              <w:t>ID</w:t>
-            </w:r>
-          </w:p>
-        </w:tc>
-        <w:tc>
-          <w:tcPr>
-            <w:tcW w:type="dxa" w:w="1680"/>
-          </w:tcPr>
-          <w:p>
-            <w:r>
-              <w:t>Category</w:t>
-            </w:r>
-          </w:p>
-        </w:tc>
-        <w:tc>
-          <w:tcPr>
-            <w:tcW w:type="dxa" w:w="1680"/>
-          </w:tcPr>
-          <w:p>
-            <w:r>
-              <w:t>Exists</w:t>
-            </w:r>
-          </w:p>
-        </w:tc>
-        <w:tc>
-          <w:tcPr>
-            <w:tcW w:type="dxa" w:w="1680"/>
-          </w:tcPr>
-          <w:p>
-            <w:r>
-              <w:t>Role</w:t>
-            </w:r>
-          </w:p>
-        </w:tc>
-        <w:tc>
-          <w:tcPr>
-            <w:tcW w:type="dxa" w:w="1680"/>
-          </w:tcPr>
-          <w:p>
-            <w:r>
-              <w:t>Claim boundary</w:t>
-            </w:r>
-          </w:p>
-        </w:tc>
-        <w:tc>
-          <w:tcPr>
-            <w:tcW w:type="dxa" w:w="1680"/>
-          </w:tcPr>
-          <w:p>
-            <w:r>
-              <w:t>Next action</w:t>
-            </w:r>
-          </w:p>
-        </w:tc>
-      </w:tr>
-      <w:tr>
-        <w:tc>
-          <w:tcPr>
-            <w:tcW w:type="dxa" w:w="1680"/>
-          </w:tcPr>
-          <w:p>
-            <w:r>
-              <w:t>release_github_zenodo</w:t>
-            </w:r>
-          </w:p>
-        </w:tc>
-        <w:tc>
-          <w:tcPr>
-            <w:tcW w:type="dxa" w:w="1680"/>
-          </w:tcPr>
-          <w:p>
-            <w:r>
-              <w:t>release</w:t>
-            </w:r>
-          </w:p>
-        </w:tc>
-        <w:tc>
-          <w:tcPr>
-            <w:tcW w:type="dxa" w:w="1680"/>
-          </w:tcPr>
-          <w:p>
-            <w:r>
-              <w:t>True</w:t>
-            </w:r>
-          </w:p>
-        </w:tc>
-        <w:tc>
-          <w:tcPr>
-            <w:tcW w:type="dxa" w:w="1680"/>
-          </w:tcPr>
-          <w:p>
-            <w:r>
-              <w:t>Public code/release evidence</w:t>
-            </w:r>
-          </w:p>
-        </w:tc>
-        <w:tc>
-          <w:tcPr>
-            <w:tcW w:type="dxa" w:w="1680"/>
-          </w:tcPr>
-          <w:p>
-            <w:r>
-              <w:t>Supports code availability only; does not prove scientific acceptance.</w:t>
-            </w:r>
-          </w:p>
-        </w:tc>
-        <w:tc>
-          <w:tcPr>
-            <w:tcW w:type="dxa" w:w="1680"/>
-          </w:tcPr>
-          <w:p>
-            <w:r>
-              <w:t>Re-check repository, release, and DOI immediately before submission.</w:t>
-            </w:r>
-          </w:p>
-        </w:tc>
-      </w:tr>
-      <w:tr>
-        <w:tc>
-          <w:tcPr>
-            <w:tcW w:type="dxa" w:w="1680"/>
-          </w:tcPr>
-          <w:p>
-            <w:r>
-              <w:t>nature_go_no_go</w:t>
-            </w:r>
-          </w:p>
-        </w:tc>
-        <w:tc>
-          <w:tcPr>
-            <w:tcW w:type="dxa" w:w="1680"/>
-          </w:tcPr>
-          <w:p>
-            <w:r>
-              <w:t>journal_route</w:t>
-            </w:r>
-          </w:p>
-        </w:tc>
-        <w:tc>
-          <w:tcPr>
-            <w:tcW w:type="dxa" w:w="1680"/>
-          </w:tcPr>
-          <w:p>
-            <w:r>
-              <w:t>True</w:t>
-            </w:r>
-          </w:p>
-        </w:tc>
-        <w:tc>
-          <w:tcPr>
-            <w:tcW w:type="dxa" w:w="1680"/>
-          </w:tcPr>
-          <w:p>
-            <w:r>
-              <w:t>Nature Methods go/no-go control packet</w:t>
-            </w:r>
-          </w:p>
-        </w:tc>
-        <w:tc>
-          <w:tcPr>
-            <w:tcW w:type="dxa" w:w="1680"/>
-          </w:tcPr>
-          <w:p>
-            <w:r>
-              <w:t>Presubmission may be considered; full submission remains gated.</w:t>
-            </w:r>
-          </w:p>
-        </w:tc>
-        <w:tc>
-          <w:tcPr>
-            <w:tcW w:type="dxa" w:w="1680"/>
-          </w:tcPr>
-          <w:p>
-            <w:r>
-              <w:t>Update after final author acknowledgement and figure freeze.</w:t>
-            </w:r>
-          </w:p>
-        </w:tc>
-      </w:tr>
-      <w:tr>
-        <w:tc>
-          <w:tcPr>
-            <w:tcW w:type="dxa" w:w="1680"/>
-          </w:tcPr>
-          <w:p>
-            <w:r>
-              <w:t>genome_biology_fallback</w:t>
-            </w:r>
-          </w:p>
-        </w:tc>
-        <w:tc>
-          <w:tcPr>
-            <w:tcW w:type="dxa" w:w="1680"/>
-          </w:tcPr>
-          <w:p>
-            <w:r>
-              <w:t>journal_route</w:t>
-            </w:r>
-          </w:p>
-        </w:tc>
-        <w:tc>
-          <w:tcPr>
-            <w:tcW w:type="dxa" w:w="1680"/>
-          </w:tcPr>
-          <w:p>
-            <w:r>
-              <w:t>True</w:t>
-            </w:r>
-          </w:p>
-        </w:tc>
-        <w:tc>
-          <w:tcPr>
-            <w:tcW w:type="dxa" w:w="1680"/>
-          </w:tcPr>
-          <w:p>
-            <w:r>
-              <w:t>Genome Biology fallback packet</w:t>
-            </w:r>
-          </w:p>
-        </w:tc>
-        <w:tc>
-          <w:tcPr>
-            <w:tcW w:type="dxa" w:w="1680"/>
-          </w:tcPr>
-          <w:p>
-            <w:r>
-              <w:t>Fallback route if Nature Methods novelty/stability bar is not met.</w:t>
-            </w:r>
-          </w:p>
-        </w:tc>
-        <w:tc>
-          <w:tcPr>
-            <w:tcW w:type="dxa" w:w="1680"/>
-          </w:tcPr>
-          <w:p>
-            <w:r>
-              <w:t>Refresh after any editorial feedback.</w:t>
-            </w:r>
-          </w:p>
-        </w:tc>
-      </w:tr>
-      <w:tr>
-        <w:tc>
-          <w:tcPr>
-            <w:tcW w:type="dxa" w:w="1680"/>
-          </w:tcPr>
-          <w:p>
-            <w:r>
-              <w:t>figure1_algorithm</w:t>
-            </w:r>
-          </w:p>
-        </w:tc>
-        <w:tc>
-          <w:tcPr>
-            <w:tcW w:type="dxa" w:w="1680"/>
-          </w:tcPr>
-          <w:p>
-            <w:r>
-              <w:t>figure</w:t>
-            </w:r>
-          </w:p>
-        </w:tc>
-        <w:tc>
-          <w:tcPr>
-            <w:tcW w:type="dxa" w:w="1680"/>
-          </w:tcPr>
-          <w:p>
-            <w:r>
-              <w:t>True</w:t>
-            </w:r>
-          </w:p>
-        </w:tc>
-        <w:tc>
-          <w:tcPr>
-            <w:tcW w:type="dxa" w:w="1680"/>
-          </w:tcPr>
-          <w:p>
-            <w:r>
-              <w:t>Figure 1 algorithm diagnostics PDF</w:t>
-            </w:r>
-          </w:p>
-        </w:tc>
-        <w:tc>
-          <w:tcPr>
-            <w:tcW w:type="dxa" w:w="1680"/>
-          </w:tcPr>
-          <w:p>
-            <w:r>
-              <w:t>Algorithm overview and diagnostic logic; avoid claiming mathematical novelty beyond RMT-guarded workflow.</w:t>
-            </w:r>
-          </w:p>
-        </w:tc>
-        <w:tc>
-          <w:tcPr>
-            <w:tcW w:type="dxa" w:w="1680"/>
-          </w:tcPr>
-          <w:p>
-            <w:r>
-              <w:t>Regenerate after final algorithm text freeze.</w:t>
-            </w:r>
-          </w:p>
-        </w:tc>
-      </w:tr>
-      <w:tr>
-        <w:tc>
-          <w:tcPr>
-            <w:tcW w:type="dxa" w:w="1680"/>
-          </w:tcPr>
-          <w:p>
-            <w:r>
-              <w:t>figure1_source</w:t>
-            </w:r>
-          </w:p>
-        </w:tc>
-        <w:tc>
-          <w:tcPr>
-            <w:tcW w:type="dxa" w:w="1680"/>
-          </w:tcPr>
-          <w:p>
-            <w:r>
-              <w:t>source_data</w:t>
-            </w:r>
-          </w:p>
-        </w:tc>
-        <w:tc>
-          <w:tcPr>
-            <w:tcW w:type="dxa" w:w="1680"/>
-          </w:tcPr>
-          <w:p>
-            <w:r>
-              <w:t>True</w:t>
-            </w:r>
-          </w:p>
-        </w:tc>
-        <w:tc>
-          <w:tcPr>
-            <w:tcW w:type="dxa" w:w="1680"/>
-          </w:tcPr>
-          <w:p>
-            <w:r>
-              <w:t>Figure 1 source data</w:t>
-            </w:r>
-          </w:p>
-        </w:tc>
-        <w:tc>
-          <w:tcPr>
-            <w:tcW w:type="dxa" w:w="1680"/>
-          </w:tcPr>
-          <w:p>
-            <w:r>
-              <w:t>Supports plotted diagnostic examples only.</w:t>
-            </w:r>
-          </w:p>
-        </w:tc>
-        <w:tc>
-          <w:tcPr>
-            <w:tcW w:type="dxa" w:w="1680"/>
-          </w:tcPr>
-          <w:p>
-            <w:r>
-              <w:t>Verify exact panel mapping before submission.</w:t>
-            </w:r>
-          </w:p>
-        </w:tc>
-      </w:tr>
-      <w:tr>
-        <w:tc>
-          <w:tcPr>
-            <w:tcW w:type="dxa" w:w="1680"/>
-          </w:tcPr>
-          <w:p>
-            <w:r>
-              <w:t>figure2_synthetic</w:t>
-            </w:r>
-          </w:p>
-        </w:tc>
-        <w:tc>
-          <w:tcPr>
-            <w:tcW w:type="dxa" w:w="1680"/>
-          </w:tcPr>
-          <w:p>
-            <w:r>
-              <w:t>figure</w:t>
-            </w:r>
-          </w:p>
-        </w:tc>
-        <w:tc>
-          <w:tcPr>
-            <w:tcW w:type="dxa" w:w="1680"/>
-          </w:tcPr>
-          <w:p>
-            <w:r>
-              <w:t>True</w:t>
-            </w:r>
-          </w:p>
-        </w:tc>
-        <w:tc>
-          <w:tcPr>
-            <w:tcW w:type="dxa" w:w="1680"/>
-          </w:tcPr>
-          <w:p>
-            <w:r>
-              <w:t>Figure 2 synthetic benchmark PDF</w:t>
-            </w:r>
-          </w:p>
-        </w:tc>
-        <w:tc>
-          <w:tcPr>
-            <w:tcW w:type="dxa" w:w="1680"/>
-          </w:tcPr>
-          <w:p>
-            <w:r>
-              <w:t>Supports null/rare-state and synthetic behavior claims under tested settings.</w:t>
-            </w:r>
-          </w:p>
-        </w:tc>
-        <w:tc>
-          <w:tcPr>
-            <w:tcW w:type="dxa" w:w="1680"/>
-          </w:tcPr>
-          <w:p>
-            <w:r>
-              <w:t>Cross-check against 50-repeat calibration before final text.</w:t>
-            </w:r>
-          </w:p>
-        </w:tc>
-      </w:tr>
-      <w:tr>
-        <w:tc>
-          <w:tcPr>
-            <w:tcW w:type="dxa" w:w="1680"/>
-          </w:tcPr>
-          <w:p>
-            <w:r>
-              <w:t>realistic_null_calibration</w:t>
-            </w:r>
-          </w:p>
-        </w:tc>
-        <w:tc>
-          <w:tcPr>
-            <w:tcW w:type="dxa" w:w="1680"/>
-          </w:tcPr>
-          <w:p>
-            <w:r>
-              <w:t>statistics</w:t>
-            </w:r>
-          </w:p>
-        </w:tc>
-        <w:tc>
-          <w:tcPr>
-            <w:tcW w:type="dxa" w:w="1680"/>
-          </w:tcPr>
-          <w:p>
-            <w:r>
-              <w:t>True</w:t>
-            </w:r>
-          </w:p>
-        </w:tc>
-        <w:tc>
-          <w:tcPr>
-            <w:tcW w:type="dxa" w:w="1680"/>
-          </w:tcPr>
-          <w:p>
-            <w:r>
-              <w:t>50-repeat realistic null and rare-state calibration report</w:t>
-            </w:r>
-          </w:p>
-        </w:tc>
-        <w:tc>
-          <w:tcPr>
-            <w:tcW w:type="dxa" w:w="1680"/>
-          </w:tcPr>
-          <w:p>
-            <w:r>
-              <w:t>Supports controlled false-signal behavior in tested null families; weak rare-state setting remains a limitation.</w:t>
-            </w:r>
-          </w:p>
-        </w:tc>
-        <w:tc>
-          <w:tcPr>
-            <w:tcW w:type="dxa" w:w="1680"/>
-          </w:tcPr>
-          <w:p>
-            <w:r>
-              <w:t>Keep low-prevalence weak-effect limitation visible.</w:t>
-            </w:r>
-          </w:p>
-        </w:tc>
-      </w:tr>
-      <w:tr>
-        <w:tc>
-          <w:tcPr>
-            <w:tcW w:type="dxa" w:w="1680"/>
-          </w:tcPr>
-          <w:p>
-            <w:r>
-              <w:t>figure3_public_benchmark</w:t>
-            </w:r>
-          </w:p>
-        </w:tc>
-        <w:tc>
-          <w:tcPr>
-            <w:tcW w:type="dxa" w:w="1680"/>
-          </w:tcPr>
-          <w:p>
-            <w:r>
-              <w:t>figure</w:t>
-            </w:r>
-          </w:p>
-        </w:tc>
-        <w:tc>
-          <w:tcPr>
-            <w:tcW w:type="dxa" w:w="1680"/>
-          </w:tcPr>
-          <w:p>
-            <w:r>
-              <w:t>True</w:t>
-            </w:r>
-          </w:p>
-        </w:tc>
-        <w:tc>
-          <w:tcPr>
-            <w:tcW w:type="dxa" w:w="1680"/>
-          </w:tcPr>
-          <w:p>
-            <w:r>
-              <w:t>Figure 3 public benchmark PDF</w:t>
-            </w:r>
-          </w:p>
-        </w:tc>
-        <w:tc>
-          <w:tcPr>
-            <w:tcW w:type="dxa" w:w="1680"/>
-          </w:tcPr>
-          <w:p>
-            <w:r>
-              <w:t>Does not support broad stability superiority against all baselines.</w:t>
-            </w:r>
-          </w:p>
-        </w:tc>
-        <w:tc>
-          <w:tcPr>
-            <w:tcW w:type="dxa" w:w="1680"/>
-          </w:tcPr>
-          <w:p>
-            <w:r>
-              <w:t>Use bounded language and include no-call decision map.</w:t>
-            </w:r>
-          </w:p>
-        </w:tc>
-      </w:tr>
-      <w:tr>
-        <w:tc>
-          <w:tcPr>
-            <w:tcW w:type="dxa" w:w="1680"/>
-          </w:tcPr>
-          <w:p>
-            <w:r>
-              <w:t>figure3_seurat_paired</w:t>
-            </w:r>
-          </w:p>
-        </w:tc>
-        <w:tc>
-          <w:tcPr>
-            <w:tcW w:type="dxa" w:w="1680"/>
-          </w:tcPr>
-          <w:p>
-            <w:r>
-              <w:t>figure</w:t>
-            </w:r>
-          </w:p>
-        </w:tc>
-        <w:tc>
-          <w:tcPr>
-            <w:tcW w:type="dxa" w:w="1680"/>
-          </w:tcPr>
-          <w:p>
-            <w:r>
-              <w:t>True</w:t>
-            </w:r>
-          </w:p>
-        </w:tc>
-        <w:tc>
-          <w:tcPr>
-            <w:tcW w:type="dxa" w:w="1680"/>
-          </w:tcPr>
-          <w:p>
-            <w:r>
-              <w:t>Official Seurat paired comparison forest plot</w:t>
-            </w:r>
-          </w:p>
-        </w:tc>
-        <w:tc>
-          <w:tcPr>
-            <w:tcW w:type="dxa" w:w="1680"/>
-          </w:tcPr>
-          <w:p>
-            <w:r>
-              <w:t>Supports paired comparison reporting; not a universal RMTGuard win.</w:t>
-            </w:r>
-          </w:p>
-        </w:tc>
-        <w:tc>
-          <w:tcPr>
-            <w:tcW w:type="dxa" w:w="1680"/>
-          </w:tcPr>
-          <w:p>
-            <w:r>
-              <w:t>Ensure comparator methods and paired-test assumptions are stated.</w:t>
-            </w:r>
-          </w:p>
-        </w:tc>
-      </w:tr>
-      <w:tr>
-        <w:tc>
-          <w:tcPr>
-            <w:tcW w:type="dxa" w:w="1680"/>
-          </w:tcPr>
-          <w:p>
-            <w:r>
-              <w:t>no_call_decision_map</w:t>
-            </w:r>
-          </w:p>
-        </w:tc>
-        <w:tc>
-          <w:tcPr>
-            <w:tcW w:type="dxa" w:w="1680"/>
-          </w:tcPr>
-          <w:p>
-            <w:r>
-              <w:t>figure</w:t>
-            </w:r>
-          </w:p>
-        </w:tc>
-        <w:tc>
-          <w:tcPr>
-            <w:tcW w:type="dxa" w:w="1680"/>
-          </w:tcPr>
-          <w:p>
-            <w:r>
-              <w:t>True</w:t>
-            </w:r>
-          </w:p>
-        </w:tc>
-        <w:tc>
-          <w:tcPr>
-            <w:tcW w:type="dxa" w:w="1680"/>
-          </w:tcPr>
-          <w:p>
-            <w:r>
-              <w:t>Figure 3 callability/no-call decision map</w:t>
-            </w:r>
-          </w:p>
-        </w:tc>
-        <w:tc>
-          <w:tcPr>
-            <w:tcW w:type="dxa" w:w="1680"/>
-          </w:tcPr>
-          <w:p>
-            <w:r>
-              <w:t>Supports transparent no-call/caveat behavior; no-call rows cannot be converted into discovery claims.</w:t>
-            </w:r>
-          </w:p>
-        </w:tc>
-        <w:tc>
-          <w:tcPr>
-            <w:tcW w:type="dxa" w:w="1680"/>
-          </w:tcPr>
-          <w:p>
-            <w:r>
-              <w:t>Keep in main or supplement depending on final Figure 3 layout.</w:t>
-            </w:r>
-          </w:p>
-        </w:tc>
-      </w:tr>
-      <w:tr>
-        <w:tc>
-          <w:tcPr>
-            <w:tcW w:type="dxa" w:w="1680"/>
-          </w:tcPr>
-          <w:p>
-            <w:r>
-              <w:t>no_call_source</w:t>
-            </w:r>
-          </w:p>
-        </w:tc>
-        <w:tc>
-          <w:tcPr>
-            <w:tcW w:type="dxa" w:w="1680"/>
-          </w:tcPr>
-          <w:p>
-            <w:r>
-              <w:t>source_data</w:t>
-            </w:r>
-          </w:p>
-        </w:tc>
-        <w:tc>
-          <w:tcPr>
-            <w:tcW w:type="dxa" w:w="1680"/>
-          </w:tcPr>
-          <w:p>
-            <w:r>
-              <w:t>True</w:t>
-            </w:r>
-          </w:p>
-        </w:tc>
-        <w:tc>
-          <w:tcPr>
-            <w:tcW w:type="dxa" w:w="1680"/>
-          </w:tcPr>
-          <w:p>
-            <w:r>
-              <w:t>Figure 3 no-call source data</w:t>
-            </w:r>
-          </w:p>
-        </w:tc>
-        <w:tc>
-          <w:tcPr>
-            <w:tcW w:type="dxa" w:w="1680"/>
-          </w:tcPr>
-          <w:p>
-            <w:r>
-              <w:t>Machine-readable basis for no-call/caveat decisions.</w:t>
-            </w:r>
-          </w:p>
-        </w:tc>
-        <w:tc>
-          <w:tcPr>
-            <w:tcW w:type="dxa" w:w="1680"/>
-          </w:tcPr>
-          <w:p>
-            <w:r>
-              <w:t>Verify thresholds remain consistent with Methods.</w:t>
-            </w:r>
-          </w:p>
-        </w:tc>
-      </w:tr>
-      <w:tr>
-        <w:tc>
-          <w:tcPr>
-            <w:tcW w:type="dxa" w:w="1680"/>
-          </w:tcPr>
-          <w:p>
-            <w:r>
-              <w:t>topology_stress</w:t>
-            </w:r>
-          </w:p>
-        </w:tc>
-        <w:tc>
-          <w:tcPr>
-            <w:tcW w:type="dxa" w:w="1680"/>
-          </w:tcPr>
-          <w:p>
-            <w:r>
-              <w:t>figure</w:t>
-            </w:r>
-          </w:p>
-        </w:tc>
-        <w:tc>
-          <w:tcPr>
-            <w:tcW w:type="dxa" w:w="1680"/>
-          </w:tcPr>
-          <w:p>
-            <w:r>
-              <w:t>True</w:t>
-            </w:r>
-          </w:p>
-        </w:tc>
-        <w:tc>
-          <w:tcPr>
-            <w:tcW w:type="dxa" w:w="1680"/>
-          </w:tcPr>
-          <w:p>
-            <w:r>
-              <w:t>Synthetic topology stress benchmark PDF</w:t>
-            </w:r>
-          </w:p>
-        </w:tc>
-        <w:tc>
-          <w:tcPr>
-            <w:tcW w:type="dxa" w:w="1680"/>
-          </w:tcPr>
-          <w:p>
-            <w:r>
-              <w:t>Supports synthetic topology preservation monitor; not proof of real trajectory correctness.</w:t>
-            </w:r>
-          </w:p>
-        </w:tc>
-        <w:tc>
-          <w:tcPr>
-            <w:tcW w:type="dxa" w:w="1680"/>
-          </w:tcPr>
-          <w:p>
-            <w:r>
-              <w:t>Keep together with real-data topology monitor.</w:t>
-            </w:r>
-          </w:p>
-        </w:tc>
-      </w:tr>
-      <w:tr>
-        <w:tc>
-          <w:tcPr>
-            <w:tcW w:type="dxa" w:w="1680"/>
-          </w:tcPr>
-          <w:p>
-            <w:r>
-              <w:t>topology_stress_source</w:t>
-            </w:r>
-          </w:p>
-        </w:tc>
-        <w:tc>
-          <w:tcPr>
-            <w:tcW w:type="dxa" w:w="1680"/>
-          </w:tcPr>
-          <w:p>
-            <w:r>
-              <w:t>source_data</w:t>
-            </w:r>
-          </w:p>
-        </w:tc>
-        <w:tc>
-          <w:tcPr>
-            <w:tcW w:type="dxa" w:w="1680"/>
-          </w:tcPr>
-          <w:p>
-            <w:r>
-              <w:t>True</w:t>
-            </w:r>
-          </w:p>
-        </w:tc>
-        <w:tc>
-          <w:tcPr>
-            <w:tcW w:type="dxa" w:w="1680"/>
-          </w:tcPr>
-          <w:p>
-            <w:r>
-              <w:t>Synthetic topology stress summary</w:t>
-            </w:r>
-          </w:p>
-        </w:tc>
-        <w:tc>
-          <w:tcPr>
-            <w:tcW w:type="dxa" w:w="1680"/>
-          </w:tcPr>
-          <w:p>
-            <w:r>
-              <w:t>20-repeat synthetic line/branch/loop evidence.</w:t>
-            </w:r>
-          </w:p>
-        </w:tc>
-        <w:tc>
-          <w:tcPr>
-            <w:tcW w:type="dxa" w:w="1680"/>
-          </w:tcPr>
-          <w:p>
-            <w:r>
-              <w:t>Mention CONCORD-style inspiration without claiming CONCORD reimplementation.</w:t>
-            </w:r>
-          </w:p>
-        </w:tc>
-      </w:tr>
-      <w:tr>
-        <w:tc>
-          <w:tcPr>
-            <w:tcW w:type="dxa" w:w="1680"/>
-          </w:tcPr>
-          <w:p>
-            <w:r>
-              <w:t>realdata_topology</w:t>
-            </w:r>
-          </w:p>
-        </w:tc>
-        <w:tc>
-          <w:tcPr>
-            <w:tcW w:type="dxa" w:w="1680"/>
-          </w:tcPr>
-          <w:p>
-            <w:r>
-              <w:t>figure</w:t>
-            </w:r>
-          </w:p>
-        </w:tc>
-        <w:tc>
-          <w:tcPr>
-            <w:tcW w:type="dxa" w:w="1680"/>
-          </w:tcPr>
-          <w:p>
-            <w:r>
-              <w:t>True</w:t>
-            </w:r>
-          </w:p>
-        </w:tc>
-        <w:tc>
-          <w:tcPr>
-            <w:tcW w:type="dxa" w:w="1680"/>
-          </w:tcPr>
-          <w:p>
-            <w:r>
-              <w:t>Paul15 real-data topology monitor PDF</w:t>
-            </w:r>
-          </w:p>
-        </w:tc>
-        <w:tc>
-          <w:tcPr>
-            <w:tcW w:type="dxa" w:w="1680"/>
-          </w:tcPr>
-          <w:p>
-            <w:r>
-              <w:t>Mixed trade-off evidence; supports topology monitoring, not broad topology superiority.</w:t>
-            </w:r>
-          </w:p>
-        </w:tc>
-        <w:tc>
-          <w:tcPr>
-            <w:tcW w:type="dxa" w:w="1680"/>
-          </w:tcPr>
-          <w:p>
-            <w:r>
-              <w:t>Optional: add second real trajectory/perturbation dataset if targeting Nature Methods.</w:t>
-            </w:r>
-          </w:p>
-        </w:tc>
-      </w:tr>
-      <w:tr>
-        <w:tc>
-          <w:tcPr>
-            <w:tcW w:type="dxa" w:w="1680"/>
-          </w:tcPr>
-          <w:p>
-            <w:r>
-              <w:t>realdata_topology_source</w:t>
-            </w:r>
-          </w:p>
-        </w:tc>
-        <w:tc>
-          <w:tcPr>
-            <w:tcW w:type="dxa" w:w="1680"/>
-          </w:tcPr>
-          <w:p>
-            <w:r>
-              <w:t>source_data</w:t>
-            </w:r>
-          </w:p>
-        </w:tc>
-        <w:tc>
-          <w:tcPr>
-            <w:tcW w:type="dxa" w:w="1680"/>
-          </w:tcPr>
-          <w:p>
-            <w:r>
-              <w:t>True</w:t>
-            </w:r>
-          </w:p>
-        </w:tc>
-        <w:tc>
-          <w:tcPr>
-            <w:tcW w:type="dxa" w:w="1680"/>
-          </w:tcPr>
-          <w:p>
-            <w:r>
-              <w:t>Paul15 real-data topology source data</w:t>
-            </w:r>
-          </w:p>
-        </w:tc>
-        <w:tc>
-          <w:tcPr>
-            <w:tcW w:type="dxa" w:w="1680"/>
-          </w:tcPr>
-          <w:p>
-            <w:r>
-              <w:t>Annotation-derived topology metrics only; not experimentally measured pseudotime.</w:t>
-            </w:r>
-          </w:p>
-        </w:tc>
-        <w:tc>
-          <w:tcPr>
-            <w:tcW w:type="dxa" w:w="1680"/>
-          </w:tcPr>
-          <w:p>
-            <w:r>
-              <w:t>Keep limitation in legend and Results.</w:t>
-            </w:r>
-          </w:p>
-        </w:tc>
-      </w:tr>
-      <w:tr>
-        <w:tc>
-          <w:tcPr>
-            <w:tcW w:type="dxa" w:w="1680"/>
-          </w:tcPr>
-          <w:p>
-            <w:r>
-              <w:t>sclens_direct_comparator</w:t>
-            </w:r>
-          </w:p>
-        </w:tc>
-        <w:tc>
-          <w:tcPr>
-            <w:tcW w:type="dxa" w:w="1680"/>
-          </w:tcPr>
-          <w:p>
-            <w:r>
-              <w:t>competitor</w:t>
-            </w:r>
-          </w:p>
-        </w:tc>
-        <w:tc>
-          <w:tcPr>
-            <w:tcW w:type="dxa" w:w="1680"/>
-          </w:tcPr>
-          <w:p>
-            <w:r>
-              <w:t>True</w:t>
-            </w:r>
-          </w:p>
-        </w:tc>
-        <w:tc>
-          <w:tcPr>
-            <w:tcW w:type="dxa" w:w="1680"/>
-          </w:tcPr>
-          <w:p>
-            <w:r>
-              <w:t>Direct scLENSpy n_rand_matrix=20 comparator report</w:t>
-            </w:r>
-          </w:p>
-        </w:tc>
-        <w:tc>
-          <w:tcPr>
-            <w:tcW w:type="dxa" w:w="1680"/>
-          </w:tcPr>
-          <w:p>
-            <w:r>
-              <w:t>Supports direct competitor coverage on PBMC3k/Kang only.</w:t>
-            </w:r>
-          </w:p>
-        </w:tc>
-        <w:tc>
-          <w:tcPr>
-            <w:tcW w:type="dxa" w:w="1680"/>
-          </w:tcPr>
-          <w:p>
-            <w:r>
-              <w:t>Avoid claiming all scLENS variants or all datasets are covered.</w:t>
-            </w:r>
-          </w:p>
-        </w:tc>
-      </w:tr>
-      <w:tr>
-        <w:tc>
-          <w:tcPr>
-            <w:tcW w:type="dxa" w:w="1680"/>
-          </w:tcPr>
-          <w:p>
-            <w:r>
-              <w:t>figure4_strengthened</w:t>
-            </w:r>
-          </w:p>
-        </w:tc>
-        <w:tc>
-          <w:tcPr>
-            <w:tcW w:type="dxa" w:w="1680"/>
-          </w:tcPr>
-          <w:p>
-            <w:r>
-              <w:t>figure</w:t>
-            </w:r>
-          </w:p>
-        </w:tc>
-        <w:tc>
-          <w:tcPr>
-            <w:tcW w:type="dxa" w:w="1680"/>
-          </w:tcPr>
-          <w:p>
-            <w:r>
-              <w:t>True</w:t>
-            </w:r>
-          </w:p>
-        </w:tc>
-        <w:tc>
-          <w:tcPr>
-            <w:tcW w:type="dxa" w:w="1680"/>
-          </w:tcPr>
-          <w:p>
-            <w:r>
-              <w:t>Strengthened PDAC/TME Figure 4 PDF</w:t>
-            </w:r>
-          </w:p>
-        </w:tc>
-        <w:tc>
-          <w:tcPr>
-            <w:tcW w:type="dxa" w:w="1680"/>
-          </w:tcPr>
-          <w:p>
-            <w:r>
-              <w:t>Bounded public-data application; no mechanism, prognosis, therapy-response, spatial, or protein-validation claim.</w:t>
-            </w:r>
-          </w:p>
-        </w:tc>
-        <w:tc>
-          <w:tcPr>
-            <w:tcW w:type="dxa" w:w="1680"/>
-          </w:tcPr>
-          <w:p>
-            <w:r>
-              <w:t>Needs corresponding-author acknowledgement before external use.</w:t>
-            </w:r>
-          </w:p>
-        </w:tc>
-      </w:tr>
-      <w:tr>
-        <w:tc>
-          <w:tcPr>
-            <w:tcW w:type="dxa" w:w="1680"/>
-          </w:tcPr>
-          <w:p>
-            <w:r>
-              <w:t>figure4_source</w:t>
-            </w:r>
-          </w:p>
-        </w:tc>
-        <w:tc>
-          <w:tcPr>
-            <w:tcW w:type="dxa" w:w="1680"/>
-          </w:tcPr>
-          <w:p>
-            <w:r>
-              <w:t>source_data</w:t>
-            </w:r>
-          </w:p>
-        </w:tc>
-        <w:tc>
-          <w:tcPr>
-            <w:tcW w:type="dxa" w:w="1680"/>
-          </w:tcPr>
-          <w:p>
-            <w:r>
-              <w:t>True</w:t>
-            </w:r>
-          </w:p>
-        </w:tc>
-        <w:tc>
-          <w:tcPr>
-            <w:tcW w:type="dxa" w:w="1680"/>
-          </w:tcPr>
-          <w:p>
-            <w:r>
-              <w:t>Strengthened Figure 4 source data</w:t>
-            </w:r>
-          </w:p>
-        </w:tc>
-        <w:tc>
-          <w:tcPr>
-            <w:tcW w:type="dxa" w:w="1680"/>
-          </w:tcPr>
-          <w:p>
-            <w:r>
-              <w:t>Supports marker/pathway/atlas-use-case panels only.</w:t>
-            </w:r>
-          </w:p>
-        </w:tc>
-        <w:tc>
-          <w:tcPr>
-            <w:tcW w:type="dxa" w:w="1680"/>
-          </w:tcPr>
-          <w:p>
-            <w:r>
-              <w:t>Confirm caption wording with authors.</w:t>
-            </w:r>
-          </w:p>
-        </w:tc>
-      </w:tr>
-      <w:tr>
-        <w:tc>
-          <w:tcPr>
-            <w:tcW w:type="dxa" w:w="1680"/>
-          </w:tcPr>
-          <w:p>
-            <w:r>
-              <w:t>figure5_ablation</w:t>
-            </w:r>
-          </w:p>
-        </w:tc>
-        <w:tc>
-          <w:tcPr>
-            <w:tcW w:type="dxa" w:w="1680"/>
-          </w:tcPr>
-          <w:p>
-            <w:r>
-              <w:t>figure</w:t>
-            </w:r>
-          </w:p>
-        </w:tc>
-        <w:tc>
-          <w:tcPr>
-            <w:tcW w:type="dxa" w:w="1680"/>
-          </w:tcPr>
-          <w:p>
-            <w:r>
-              <w:t>True</w:t>
-            </w:r>
-          </w:p>
-        </w:tc>
-        <w:tc>
-          <w:tcPr>
-            <w:tcW w:type="dxa" w:w="1680"/>
-          </w:tcPr>
-          <w:p>
-            <w:r>
-              <w:t>Real-data ablation forest plot</w:t>
-            </w:r>
-          </w:p>
-        </w:tc>
-        <w:tc>
-          <w:tcPr>
-            <w:tcW w:type="dxa" w:w="1680"/>
-          </w:tcPr>
-          <w:p>
-            <w:r>
-              <w:t>Supports component contribution discussion with tested datasets and repeats only.</w:t>
-            </w:r>
-          </w:p>
-        </w:tc>
-        <w:tc>
-          <w:tcPr>
-            <w:tcW w:type="dxa" w:w="1680"/>
-          </w:tcPr>
-          <w:p>
-            <w:r>
-              <w:t>Avoid universal component-necessity wording.</w:t>
-            </w:r>
-          </w:p>
-        </w:tc>
-      </w:tr>
-      <w:tr>
-        <w:tc>
-          <w:tcPr>
-            <w:tcW w:type="dxa" w:w="1680"/>
-          </w:tcPr>
-          <w:p>
-            <w:r>
-              <w:t>component_ablation_report</w:t>
-            </w:r>
-          </w:p>
-        </w:tc>
-        <w:tc>
-          <w:tcPr>
-            <w:tcW w:type="dxa" w:w="1680"/>
-          </w:tcPr>
-          <w:p>
-            <w:r>
-              <w:t>statistics</w:t>
-            </w:r>
-          </w:p>
-        </w:tc>
-        <w:tc>
-          <w:tcPr>
-            <w:tcW w:type="dxa" w:w="1680"/>
-          </w:tcPr>
-          <w:p>
-            <w:r>
-              <w:t>True</w:t>
-            </w:r>
-          </w:p>
-        </w:tc>
-        <w:tc>
-          <w:tcPr>
-            <w:tcW w:type="dxa" w:w="1680"/>
-          </w:tcPr>
-          <w:p>
-            <w:r>
-              <w:t>20-repeat synthetic component ablation report</w:t>
-            </w:r>
-          </w:p>
-        </w:tc>
-        <w:tc>
-          <w:tcPr>
-            <w:tcW w:type="dxa" w:w="1680"/>
-          </w:tcPr>
-          <w:p>
-            <w:r>
-              <w:t>Supports marginal component discussion for tested synthetic settings.</w:t>
-            </w:r>
-          </w:p>
-        </w:tc>
-        <w:tc>
-          <w:tcPr>
-            <w:tcW w:type="dxa" w:w="1680"/>
-          </w:tcPr>
-          <w:p>
-            <w:r>
-              <w:t>Pair with real-data ablation annotation report.</w:t>
-            </w:r>
-          </w:p>
-        </w:tc>
-      </w:tr>
-      <w:tr>
-        <w:tc>
-          <w:tcPr>
-            <w:tcW w:type="dxa" w:w="1680"/>
-          </w:tcPr>
-          <w:p>
-            <w:r>
-              <w:t>realdata_ablation_report</w:t>
-            </w:r>
-          </w:p>
-        </w:tc>
-        <w:tc>
-          <w:tcPr>
-            <w:tcW w:type="dxa" w:w="1680"/>
-          </w:tcPr>
-          <w:p>
-            <w:r>
-              <w:t>statistics</w:t>
-            </w:r>
-          </w:p>
-        </w:tc>
-        <w:tc>
-          <w:tcPr>
-            <w:tcW w:type="dxa" w:w="1680"/>
-          </w:tcPr>
-          <w:p>
-            <w:r>
-              <w:t>True</w:t>
-            </w:r>
-          </w:p>
-        </w:tc>
-        <w:tc>
-          <w:tcPr>
-            <w:tcW w:type="dxa" w:w="1680"/>
-          </w:tcPr>
-          <w:p>
-            <w:r>
-              <w:t>Real-data ablation annotation report</w:t>
-            </w:r>
-          </w:p>
-        </w:tc>
-        <w:tc>
-          <w:tcPr>
-            <w:tcW w:type="dxa" w:w="1680"/>
-          </w:tcPr>
-          <w:p>
-            <w:r>
-              <w:t>Supports annotation/batch ablation checks on included labeled datasets.</w:t>
-            </w:r>
-          </w:p>
-        </w:tc>
-        <w:tc>
-          <w:tcPr>
-            <w:tcW w:type="dxa" w:w="1680"/>
-          </w:tcPr>
-          <w:p>
-            <w:r>
-              <w:t>Keep dataset coverage explicit.</w:t>
-            </w:r>
-          </w:p>
-        </w:tc>
-      </w:tr>
-      <w:tr>
-        <w:tc>
-          <w:tcPr>
-            <w:tcW w:type="dxa" w:w="1680"/>
-          </w:tcPr>
-          <w:p>
-            <w:r>
-              <w:t>gantt</w:t>
-            </w:r>
-          </w:p>
-        </w:tc>
-        <w:tc>
-          <w:tcPr>
-            <w:tcW w:type="dxa" w:w="1680"/>
-          </w:tcPr>
-          <w:p>
-            <w:r>
-              <w:t>project_management</w:t>
-            </w:r>
-          </w:p>
-        </w:tc>
-        <w:tc>
-          <w:tcPr>
-            <w:tcW w:type="dxa" w:w="1680"/>
-          </w:tcPr>
-          <w:p>
-            <w:r>
-              <w:t>True</w:t>
-            </w:r>
-          </w:p>
-        </w:tc>
-        <w:tc>
-          <w:tcPr>
-            <w:tcW w:type="dxa" w:w="1680"/>
-          </w:tcPr>
-          <w:p>
-            <w:r>
-              <w:t>Current project Gantt chart</w:t>
-            </w:r>
-          </w:p>
-        </w:tc>
-        <w:tc>
-          <w:tcPr>
-            <w:tcW w:type="dxa" w:w="1680"/>
-          </w:tcPr>
-          <w:p>
-            <w:r>
-              <w:t>Project-management status only; not scientific evidence.</w:t>
-            </w:r>
-          </w:p>
-        </w:tc>
-        <w:tc>
-          <w:tcPr>
-            <w:tcW w:type="dxa" w:w="1680"/>
-          </w:tcPr>
-          <w:p>
-            <w:r>
-              <w:t>Refresh after each major benchmark addition.</w:t>
-            </w:r>
-          </w:p>
-        </w:tc>
-      </w:tr>
-      <w:tr>
-        <w:tc>
-          <w:tcPr>
-            <w:tcW w:type="dxa" w:w="1680"/>
-          </w:tcPr>
-          <w:p>
-            <w:r>
-              <w:t>manual_author_actions</w:t>
-            </w:r>
-          </w:p>
-        </w:tc>
-        <w:tc>
-          <w:tcPr>
-            <w:tcW w:type="dxa" w:w="1680"/>
-          </w:tcPr>
-          <w:p>
-            <w:r>
-              <w:t>manual_blocker</w:t>
-            </w:r>
-          </w:p>
-        </w:tc>
-        <w:tc>
-          <w:tcPr>
-            <w:tcW w:type="dxa" w:w="1680"/>
-          </w:tcPr>
-          <w:p>
-            <w:r>
-              <w:t>True</w:t>
-            </w:r>
-          </w:p>
-        </w:tc>
-        <w:tc>
-          <w:tcPr>
-            <w:tcW w:type="dxa" w:w="1680"/>
-          </w:tcPr>
-          <w:p>
-            <w:r>
-              <w:t>Manual author action checklist</w:t>
-            </w:r>
-          </w:p>
-        </w:tc>
-        <w:tc>
-          <w:tcPr>
-            <w:tcW w:type="dxa" w:w="1680"/>
-          </w:tcPr>
-          <w:p>
-            <w:r>
-              <w:t>Tracks actions Codex cannot certify alone.</w:t>
-            </w:r>
-          </w:p>
-        </w:tc>
-        <w:tc>
-          <w:tcPr>
-            <w:tcW w:type="dxa" w:w="1680"/>
-          </w:tcPr>
-          <w:p>
-            <w:r>
-              <w:t>Authors must verify funding, COI, ethics, and Figure 4 acknowledgement.</w:t>
-            </w:r>
-          </w:p>
-        </w:tc>
-      </w:tr>
-      <w:tr>
-        <w:tc>
-          <w:tcPr>
-            <w:tcW w:type="dxa" w:w="1680"/>
-          </w:tcPr>
-          <w:p>
-            <w:r>
-              <w:t>results_freeze_aligned_draft</w:t>
-            </w:r>
-          </w:p>
-        </w:tc>
-        <w:tc>
-          <w:tcPr>
-            <w:tcW w:type="dxa" w:w="1680"/>
-          </w:tcPr>
-          <w:p>
-            <w:r>
-              <w:t>manuscript_text</w:t>
-            </w:r>
-          </w:p>
-        </w:tc>
-        <w:tc>
-          <w:tcPr>
-            <w:tcW w:type="dxa" w:w="1680"/>
-          </w:tcPr>
-          <w:p>
-            <w:r>
-              <w:t>True</w:t>
-            </w:r>
-          </w:p>
-        </w:tc>
-        <w:tc>
-          <w:tcPr>
-            <w:tcW w:type="dxa" w:w="1680"/>
-          </w:tcPr>
-          <w:p>
-            <w:r>
-              <w:t>Freeze-aligned Results draft</w:t>
-            </w:r>
-          </w:p>
-        </w:tc>
-        <w:tc>
-          <w:tcPr>
-            <w:tcW w:type="dxa" w:w="1680"/>
-          </w:tcPr>
-          <w:p>
-            <w:r>
-              <w:t>Draft Results text only; every paragraph remains bounded by current evidence and is not final journal prose.</w:t>
-            </w:r>
-          </w:p>
-        </w:tc>
-        <w:tc>
-          <w:tcPr>
-            <w:tcW w:type="dxa" w:w="1680"/>
-          </w:tcPr>
-          <w:p>
-            <w:r>
-              <w:t>Use as source-controlled starting text for the next manuscript assembly pass.</w:t>
-            </w:r>
-          </w:p>
-        </w:tc>
-      </w:tr>
-      <w:tr>
-        <w:tc>
-          <w:tcPr>
-            <w:tcW w:type="dxa" w:w="1680"/>
-          </w:tcPr>
-          <w:p>
-            <w:r>
-              <w:t>figure_legends_freeze_aligned</w:t>
-            </w:r>
-          </w:p>
-        </w:tc>
-        <w:tc>
-          <w:tcPr>
-            <w:tcW w:type="dxa" w:w="1680"/>
-          </w:tcPr>
-          <w:p>
-            <w:r>
-              <w:t>manuscript_text</w:t>
-            </w:r>
-          </w:p>
-        </w:tc>
-        <w:tc>
-          <w:tcPr>
-            <w:tcW w:type="dxa" w:w="1680"/>
-          </w:tcPr>
-          <w:p>
-            <w:r>
-              <w:t>True</w:t>
-            </w:r>
-          </w:p>
-        </w:tc>
-        <w:tc>
-          <w:tcPr>
-            <w:tcW w:type="dxa" w:w="1680"/>
-          </w:tcPr>
-          <w:p>
-            <w:r>
-              <w:t>Freeze-aligned figure legends draft</w:t>
-            </w:r>
-          </w:p>
-        </w:tc>
-        <w:tc>
-          <w:tcPr>
-            <w:tcW w:type="dxa" w:w="1680"/>
-          </w:tcPr>
-          <w:p>
-            <w:r>
-              <w:t>Draft captions only; legends must not upgrade caveated or no-call evidence.</w:t>
-            </w:r>
-          </w:p>
-        </w:tc>
-        <w:tc>
-          <w:tcPr>
-            <w:tcW w:type="dxa" w:w="1680"/>
-          </w:tcPr>
-          <w:p>
-            <w:r>
-              <w:t>Use as caption source and revise only after final figure layout is chosen.</w:t>
-            </w:r>
-          </w:p>
-        </w:tc>
-      </w:tr>
-      <w:tr>
-        <w:tc>
-          <w:tcPr>
-            <w:tcW w:type="dxa" w:w="1680"/>
-          </w:tcPr>
-          <w:p>
-            <w:r>
-              <w:t>freeze_aligned_text_audit</w:t>
-            </w:r>
-          </w:p>
-        </w:tc>
-        <w:tc>
-          <w:tcPr>
-            <w:tcW w:type="dxa" w:w="1680"/>
-          </w:tcPr>
-          <w:p>
-            <w:r>
-              <w:t>manuscript_text</w:t>
-            </w:r>
-          </w:p>
-        </w:tc>
-        <w:tc>
-          <w:tcPr>
-            <w:tcW w:type="dxa" w:w="1680"/>
-          </w:tcPr>
-          <w:p>
-            <w:r>
-              <w:t>True</w:t>
-            </w:r>
-          </w:p>
-        </w:tc>
-        <w:tc>
-          <w:tcPr>
-            <w:tcW w:type="dxa" w:w="1680"/>
-          </w:tcPr>
-          <w:p>
-            <w:r>
-              <w:t>Machine-readable claim audit for freeze-aligned text</w:t>
-            </w:r>
-          </w:p>
-        </w:tc>
-        <w:tc>
-          <w:tcPr>
-            <w:tcW w:type="dxa" w:w="1680"/>
-          </w:tcPr>
-          <w:p>
-            <w:r>
-              <w:t>Controls wording boundaries; does not certify journal acceptance.</w:t>
-            </w:r>
-          </w:p>
-        </w:tc>
-        <w:tc>
-          <w:tcPr>
-            <w:tcW w:type="dxa" w:w="1680"/>
-          </w:tcPr>
-          <w:p>
-            <w:r>
-              <w:t>Re-run after any Results or legend change.</w:t>
-            </w:r>
-          </w:p>
-        </w:tc>
-      </w:tr>
-    </w:tbl>
-    <w:p>
-      <w:pPr>
-        <w:pStyle w:val="Heading2"/>
-      </w:pPr>
-      <w:r>
-        <w:t>Use In Manuscript Planning</w:t>
-      </w:r>
-    </w:p>
-    <w:p>
-      <w:r>
-        <w:t>Use this file as the source-of-truth checklist before drafting Results,</w:t>
-      </w:r>
-    </w:p>
-    <w:p>
-      <w:r>
-        <w:t>figure legends, cover letter claims, and response-to-reviewer language.</w:t>
-      </w:r>
-    </w:p>
-    <w:p>
-      <w:r>
-        <w:t>Any claim not represented here should be treated as unsupported until a</w:t>
-      </w:r>
-    </w:p>
-    <w:p>
-      <w:r>
-        <w:t>new evidence item is added and this freeze is regenerated.</w:t>
       </w:r>
     </w:p>
     <w:p>
@@ -3496,6 +1771,704 @@
         <w:pStyle w:val="Heading1"/>
       </w:pPr>
       <w:r>
+        <w:t>Nature reporting-summary worksheet</w:t>
+      </w:r>
+    </w:p>
+    <w:p>
+      <w:pPr>
+        <w:pStyle w:val="Heading2"/>
+      </w:pPr>
+      <w:r>
+        <w:t>Nature Reporting Summary Draft</w:t>
+      </w:r>
+    </w:p>
+    <w:p>
+      <w:r>
+        <w:t>This file is generated by python scripts/build_reporting_summary_draft.py.</w:t>
+      </w:r>
+    </w:p>
+    <w:p>
+      <w:pPr>
+        <w:pStyle w:val="Heading2"/>
+      </w:pPr>
+      <w:r>
+        <w:t>Boundary</w:t>
+      </w:r>
+    </w:p>
+    <w:p>
+      <w:r>
+        <w:t>This is a draft worksheet, not the official Nature Portfolio reporting summary form. The corresponding author must verify and transfer the final answers during submission.</w:t>
+      </w:r>
+    </w:p>
+    <w:p>
+      <w:pPr>
+        <w:pStyle w:val="Heading2"/>
+      </w:pPr>
+      <w:r>
+        <w:t>Status</w:t>
+      </w:r>
+    </w:p>
+    <w:p>
+      <w:pPr>
+        <w:pStyle w:val="ListBullet"/>
+      </w:pPr>
+      <w:r>
+        <w:t>Blocked rows: 0.</w:t>
+      </w:r>
+    </w:p>
+    <w:p>
+      <w:pPr>
+        <w:pStyle w:val="ListBullet"/>
+      </w:pPr>
+      <w:r>
+        <w:t>Manual/author-completion rows: 3.</w:t>
+      </w:r>
+    </w:p>
+    <w:p>
+      <w:pPr>
+        <w:pStyle w:val="ListBullet"/>
+      </w:pPr>
+      <w:r>
+        <w:t>Acceptance guarantee: impossible; this worksheet only reduces reporting omission risk.</w:t>
+      </w:r>
+    </w:p>
+    <w:p>
+      <w:pPr>
+        <w:pStyle w:val="Heading2"/>
+      </w:pPr>
+      <w:r>
+        <w:t>Blocked Rows</w:t>
+      </w:r>
+    </w:p>
+    <w:p>
+      <w:pPr>
+        <w:pStyle w:val="ListBullet"/>
+      </w:pPr>
+      <w:r>
+        <w:t>none</w:t>
+      </w:r>
+    </w:p>
+    <w:p>
+      <w:pPr>
+        <w:pStyle w:val="Heading2"/>
+      </w:pPr>
+      <w:r>
+        <w:t>Manual Or Release-Refresh Rows</w:t>
+      </w:r>
+    </w:p>
+    <w:p>
+      <w:pPr>
+        <w:pStyle w:val="ListBullet"/>
+      </w:pPr>
+      <w:r>
+        <w:t>Statistics / Multiple testing and uncertainty (needs_author_completion): Add final marker/pathway multiple-testing details if those analyses enter the main text.</w:t>
+      </w:r>
+    </w:p>
+    <w:p>
+      <w:pPr>
+        <w:pStyle w:val="ListBullet"/>
+      </w:pPr>
+      <w:r>
+        <w:t>Software / Code DOI (needs_release_refresh): Create a new GitHub Release/Zenodo archive if the final manuscript depends on post-v0.1.0 files.</w:t>
+      </w:r>
+    </w:p>
+    <w:p>
+      <w:pPr>
+        <w:pStyle w:val="ListBullet"/>
+      </w:pPr>
+      <w:r>
+        <w:t>Reporting summary / Official form status (pending_manual): Transfer verified answers into the official submission system.</w:t>
+      </w:r>
+    </w:p>
+    <w:p>
+      <w:pPr>
+        <w:pStyle w:val="Heading2"/>
+      </w:pPr>
+      <w:r>
+        <w:t>Draft Responses</w:t>
+      </w:r>
+    </w:p>
+    <w:p>
+      <w:pPr>
+        <w:pStyle w:val="Heading3"/>
+      </w:pPr>
+      <w:r>
+        <w:t>Data - Public dataset sources</w:t>
+      </w:r>
+    </w:p>
+    <w:p>
+      <w:pPr>
+        <w:pStyle w:val="ListBullet"/>
+      </w:pPr>
+      <w:r>
+        <w:t>Status: ready_for_author_check</w:t>
+      </w:r>
+    </w:p>
+    <w:p>
+      <w:pPr>
+        <w:pStyle w:val="ListBullet"/>
+      </w:pPr>
+      <w:r>
+        <w:t>Draft response: All datasets are public scRNA-seq datasets listed in metadata/datasets.tsv: pbmc3k_10x, pbmc68k_zheng2017, kang_ifnb_pbmc, baron_pancreas, tabula_sapiens_selected, pdac_gse154778, pdac_gse263733, pbmc_multisite.</w:t>
+      </w:r>
+    </w:p>
+    <w:p>
+      <w:pPr>
+        <w:pStyle w:val="ListBullet"/>
+      </w:pPr>
+      <w:r>
+        <w:t>Evidence: metadata/datasets.tsv</w:t>
+      </w:r>
+    </w:p>
+    <w:p>
+      <w:pPr>
+        <w:pStyle w:val="ListBullet"/>
+      </w:pPr>
+      <w:r>
+        <w:t>Author action required: Verify every accession and URL before submission.</w:t>
+      </w:r>
+    </w:p>
+    <w:p>
+      <w:pPr>
+        <w:pStyle w:val="ListBullet"/>
+      </w:pPr>
+      <w:r>
+        <w:t>Notes: Accessions listed: SRP073767, GSE96583, GSE84133, Tabula Sapiens, GSE154778, GSE263733, TBD.</w:t>
+      </w:r>
+    </w:p>
+    <w:p>
+      <w:pPr>
+        <w:pStyle w:val="Heading3"/>
+      </w:pPr>
+      <w:r>
+        <w:t>Data - Human data privacy and ethics</w:t>
+      </w:r>
+    </w:p>
+    <w:p>
+      <w:pPr>
+        <w:pStyle w:val="ListBullet"/>
+      </w:pPr>
+      <w:r>
+        <w:t>Status: ready_for_author_check</w:t>
+      </w:r>
+    </w:p>
+    <w:p>
+      <w:pPr>
+        <w:pStyle w:val="ListBullet"/>
+      </w:pPr>
+      <w:r>
+        <w:t>Draft response: No private clinical data are used in the current manuscript package; all main evidence is derived from public datasets.</w:t>
+      </w:r>
+    </w:p>
+    <w:p>
+      <w:pPr>
+        <w:pStyle w:val="ListBullet"/>
+      </w:pPr>
+      <w:r>
+        <w:t>Evidence: metadata/datasets.tsv</w:t>
+      </w:r>
+    </w:p>
+    <w:p>
+      <w:pPr>
+        <w:pStyle w:val="ListBullet"/>
+      </w:pPr>
+      <w:r>
+        <w:t>Author action required: Confirm no controlled-access or identifiable patient-level data were added outside this repository.</w:t>
+      </w:r>
+    </w:p>
+    <w:p>
+      <w:pPr>
+        <w:pStyle w:val="ListBullet"/>
+      </w:pPr>
+      <w:r>
+        <w:t>Notes: This is an analysis/privacy statement, not an IRB determination.</w:t>
+      </w:r>
+    </w:p>
+    <w:p>
+      <w:pPr>
+        <w:pStyle w:val="Heading3"/>
+      </w:pPr>
+      <w:r>
+        <w:t>Data - Data exclusion and preprocessing</w:t>
+      </w:r>
+    </w:p>
+    <w:p>
+      <w:pPr>
+        <w:pStyle w:val="ListBullet"/>
+      </w:pPr>
+      <w:r>
+        <w:t>Status: ready_for_author_check</w:t>
+      </w:r>
+    </w:p>
+    <w:p>
+      <w:pPr>
+        <w:pStyle w:val="ListBullet"/>
+      </w:pPr>
+      <w:r>
+        <w:t>Draft response: Large raw and processed matrices are excluded from GitHub; datasets are regenerated from public accessions and scripts. QC/filtering, normalization, HVG selection, RMT spectrum diagnostics, and benchmark outputs are recorded in scripts and result manifests.</w:t>
+      </w:r>
+    </w:p>
+    <w:p>
+      <w:pPr>
+        <w:pStyle w:val="ListBullet"/>
+      </w:pPr>
+      <w:r>
+        <w:t>Evidence: scripts/prepare_phase1_datasets.py; benchmarks/run_phase1_benchmark.py; metadata/datasets.tsv</w:t>
+      </w:r>
+    </w:p>
+    <w:p>
+      <w:pPr>
+        <w:pStyle w:val="ListBullet"/>
+      </w:pPr>
+      <w:r>
+        <w:t>Author action required: Confirm the Methods section lists final QC thresholds and any dataset-specific exclusions.</w:t>
+      </w:r>
+    </w:p>
+    <w:p>
+      <w:pPr>
+        <w:pStyle w:val="ListBullet"/>
+      </w:pPr>
+      <w:r>
+        <w:t>Notes: Do not leave QC decisions implicit in the reporting summary.</w:t>
+      </w:r>
+    </w:p>
+    <w:p>
+      <w:pPr>
+        <w:pStyle w:val="Heading3"/>
+      </w:pPr>
+      <w:r>
+        <w:t>Statistics - Randomization and blinding</w:t>
+      </w:r>
+    </w:p>
+    <w:p>
+      <w:pPr>
+        <w:pStyle w:val="ListBullet"/>
+      </w:pPr>
+      <w:r>
+        <w:t>Status: ready_for_author_check</w:t>
+      </w:r>
+    </w:p>
+    <w:p>
+      <w:pPr>
+        <w:pStyle w:val="ListBullet"/>
+      </w:pPr>
+      <w:r>
+        <w:t>Draft response: This is a computational methods study using public datasets and simulations. Experimental randomization/blinding is not applicable; computational randomness is controlled with explicit random_state values and repeated subsampling benchmarks.</w:t>
+      </w:r>
+    </w:p>
+    <w:p>
+      <w:pPr>
+        <w:pStyle w:val="ListBullet"/>
+      </w:pPr>
+      <w:r>
+        <w:t>Evidence: results/gates/gate_evidence.tsv</w:t>
+      </w:r>
+    </w:p>
+    <w:p>
+      <w:pPr>
+        <w:pStyle w:val="ListBullet"/>
+      </w:pPr>
+      <w:r>
+        <w:t>Author action required: Confirm this wording fits the official form's available options.</w:t>
+      </w:r>
+    </w:p>
+    <w:p>
+      <w:pPr>
+        <w:pStyle w:val="ListBullet"/>
+      </w:pPr>
+      <w:r>
+        <w:t>Notes: For benchmark comparisons, report seed/repeat settings rather than experimental blinding.</w:t>
+      </w:r>
+    </w:p>
+    <w:p>
+      <w:pPr>
+        <w:pStyle w:val="Heading3"/>
+      </w:pPr>
+      <w:r>
+        <w:t>Statistics - Sample size and replication</w:t>
+      </w:r>
+    </w:p>
+    <w:p>
+      <w:pPr>
+        <w:pStyle w:val="ListBullet"/>
+      </w:pPr>
+      <w:r>
+        <w:t>Status: ready_for_author_check</w:t>
+      </w:r>
+    </w:p>
+    <w:p>
+      <w:pPr>
+        <w:pStyle w:val="ListBullet"/>
+      </w:pPr>
+      <w:r>
+        <w:t>Draft response: No prospective sample-size calculation was performed. The method is evaluated by 50-repeat realistic-null and rare-state calibration, repeated-subsampling real-data benchmarks, official Seurat/JackStraw comparator rows, scLENSpy comparator rows, topology stress tests, and public PDAC/TME application data.</w:t>
+      </w:r>
+    </w:p>
+    <w:p>
+      <w:pPr>
+        <w:pStyle w:val="ListBullet"/>
+      </w:pPr>
+      <w:r>
+        <w:t>Evidence: docs/current_evidence_freeze_2026-05-12.md</w:t>
+      </w:r>
+    </w:p>
+    <w:p>
+      <w:pPr>
+        <w:pStyle w:val="ListBullet"/>
+      </w:pPr>
+      <w:r>
+        <w:t>Author action required: Confirm final manuscript still uses the same benchmark set.</w:t>
+      </w:r>
+    </w:p>
+    <w:p>
+      <w:pPr>
+        <w:pStyle w:val="ListBullet"/>
+      </w:pPr>
+      <w:r>
+        <w:t>Notes: This supports computational reproducibility, not prospective clinical power.</w:t>
+      </w:r>
+    </w:p>
+    <w:p>
+      <w:pPr>
+        <w:pStyle w:val="Heading3"/>
+      </w:pPr>
+      <w:r>
+        <w:t>Statistics - Multiple testing and uncertainty</w:t>
+      </w:r>
+    </w:p>
+    <w:p>
+      <w:pPr>
+        <w:pStyle w:val="ListBullet"/>
+      </w:pPr>
+      <w:r>
+        <w:t>Status: needs_author_completion</w:t>
+      </w:r>
+    </w:p>
+    <w:p>
+      <w:pPr>
+        <w:pStyle w:val="ListBullet"/>
+      </w:pPr>
+      <w:r>
+        <w:t>Draft response: The primary benchmarks use pre-specified gate thresholds for false signal PCs, rare-state ARI, stability/no-call behavior, annotation noninferiority, and PDAC/TME interpretability. If gene-level marker or pathway tests are added to the final manuscript, report the p-value adjustment method explicitly.</w:t>
+      </w:r>
+    </w:p>
+    <w:p>
+      <w:pPr>
+        <w:pStyle w:val="ListBullet"/>
+      </w:pPr>
+      <w:r>
+        <w:t>Evidence: results/manuscript/claim_evidence_matrix.tsv</w:t>
+      </w:r>
+    </w:p>
+    <w:p>
+      <w:pPr>
+        <w:pStyle w:val="ListBullet"/>
+      </w:pPr>
+      <w:r>
+        <w:t>Author action required: Add final marker/pathway multiple-testing details if those analyses enter the main text.</w:t>
+      </w:r>
+    </w:p>
+    <w:p>
+      <w:pPr>
+        <w:pStyle w:val="ListBullet"/>
+      </w:pPr>
+      <w:r>
+        <w:t>Notes: Current method gates are threshold-based; marker/pathway testing may need FDR control.</w:t>
+      </w:r>
+    </w:p>
+    <w:p>
+      <w:pPr>
+        <w:pStyle w:val="Heading3"/>
+      </w:pPr>
+      <w:r>
+        <w:t>Method validation - Noise-control and rare-state claims</w:t>
+      </w:r>
+    </w:p>
+    <w:p>
+      <w:pPr>
+        <w:pStyle w:val="ListBullet"/>
+      </w:pPr>
+      <w:r>
+        <w:t>Status: ready_for_author_check</w:t>
+      </w:r>
+    </w:p>
+    <w:p>
+      <w:pPr>
+        <w:pStyle w:val="ListBullet"/>
+      </w:pPr>
+      <w:r>
+        <w:t>Draft response: Across the current 50-repeat count-preserving null families, the maximum observed false-signal rate was 0.0%. Rare-state power was bounded by prevalence and effect size: all tested prevalence &gt;=0.04 settings reached power &gt;=84% (6 settings), whereas prevalence 0.02/effect 2.5 had power 0.12 and mean rare-state F1 0.151.</w:t>
+      </w:r>
+    </w:p>
+    <w:p>
+      <w:pPr>
+        <w:pStyle w:val="ListBullet"/>
+      </w:pPr>
+      <w:r>
+        <w:t>Evidence: results/calibration/realistic_null_summary.tsv; results/calibration/rare_state_power_summary.tsv</w:t>
+      </w:r>
+    </w:p>
+    <w:p>
+      <w:pPr>
+        <w:pStyle w:val="ListBullet"/>
+      </w:pPr>
+      <w:r>
+        <w:t>Author action required: Confirm exact benchmark numbers match final figures.</w:t>
+      </w:r>
+    </w:p>
+    <w:p>
+      <w:pPr>
+        <w:pStyle w:val="ListBullet"/>
+      </w:pPr>
+      <w:r>
+        <w:t>Notes: Avoid exact type-I calibration claims beyond the tested null families and preprocessing regime.</w:t>
+      </w:r>
+    </w:p>
+    <w:p>
+      <w:pPr>
+        <w:pStyle w:val="Heading3"/>
+      </w:pPr>
+      <w:r>
+        <w:t>Method validation - Callability and no-call boundary</w:t>
+      </w:r>
+    </w:p>
+    <w:p>
+      <w:pPr>
+        <w:pStyle w:val="ListBullet"/>
+      </w:pPr>
+      <w:r>
+        <w:t>Status: ready_for_author_check</w:t>
+      </w:r>
+    </w:p>
+    <w:p>
+      <w:pPr>
+        <w:pStyle w:val="ListBullet"/>
+      </w:pPr>
+      <w:r>
+        <w:t>Draft response: Callability-aware multi-dataset diagnostics: baron_pancreas: fail_below_best_baseline RMTGuard=0.859187 best=elbow_rule 0.980448; kang_ifnb_pbmc: fail_below_best_baseline RMTGuard=0.826068 best=elbow_rule 0.880112; pbmc3k_10x: fail_below_best_baseline RMTGuard=0.891308 best=elbow_rule 0.986578; pbmc68k_zheng2017: diagnostic_no_call RMTGuard=0.600000 best=fixed_pcs_30 0.805652. PBMC3k mean pairwise ARI: RMTGuard=0.8913076392119752, Scanpy-like=0.8210209608290601, fixed30=0.9083477856918997; PBMC68k is reported as a diagnostic no-call, not as a positive discovery.</w:t>
+      </w:r>
+    </w:p>
+    <w:p>
+      <w:pPr>
+        <w:pStyle w:val="ListBullet"/>
+      </w:pPr>
+      <w:r>
+        <w:t>Evidence: results/manuscript/claim_evidence_matrix.tsv</w:t>
+      </w:r>
+    </w:p>
+    <w:p>
+      <w:pPr>
+        <w:pStyle w:val="ListBullet"/>
+      </w:pPr>
+      <w:r>
+        <w:t>Author action required: Keep PBMC68k as diagnostic no-call and avoid broad stability-superiority wording.</w:t>
+      </w:r>
+    </w:p>
+    <w:p>
+      <w:pPr>
+        <w:pStyle w:val="ListBullet"/>
+      </w:pPr>
+      <w:r>
+        <w:t>Notes: The reporting summary can be completed, but the Nature Methods scientific claim remains gated by the stability_advantage result.</w:t>
+      </w:r>
+    </w:p>
+    <w:p>
+      <w:pPr>
+        <w:pStyle w:val="Heading3"/>
+      </w:pPr>
+      <w:r>
+        <w:t>Biological application - PDAC/TME public showcase</w:t>
+      </w:r>
+    </w:p>
+    <w:p>
+      <w:pPr>
+        <w:pStyle w:val="ListBullet"/>
+      </w:pPr>
+      <w:r>
+        <w:t>Status: ready_for_author_check</w:t>
+      </w:r>
+    </w:p>
+    <w:p>
+      <w:pPr>
+        <w:pStyle w:val="ListBullet"/>
+      </w:pPr>
+      <w:r>
+        <w:t>Draft response: GSE154778 signatures: ['ductal_malignant_context', 'immune_myeloid']; GSE263733 validation ARI=0.5680419676901498, NMI=0.6866858928242938.</w:t>
+      </w:r>
+    </w:p>
+    <w:p>
+      <w:pPr>
+        <w:pStyle w:val="ListBullet"/>
+      </w:pPr>
+      <w:r>
+        <w:t>Evidence: results/manuscript/claim_evidence_matrix.tsv</w:t>
+      </w:r>
+    </w:p>
+    <w:p>
+      <w:pPr>
+        <w:pStyle w:val="ListBullet"/>
+      </w:pPr>
+      <w:r>
+        <w:t>Author action required: Confirm final text does not claim standalone CAF/fibroblast discovery.</w:t>
+      </w:r>
+    </w:p>
+    <w:p>
+      <w:pPr>
+        <w:pStyle w:val="ListBullet"/>
+      </w:pPr>
+      <w:r>
+        <w:t>Notes: Use as public application evidence, not clinical decision support.</w:t>
+      </w:r>
+    </w:p>
+    <w:p>
+      <w:pPr>
+        <w:pStyle w:val="Heading3"/>
+      </w:pPr>
+      <w:r>
+        <w:t>Software - Code availability</w:t>
+      </w:r>
+    </w:p>
+    <w:p>
+      <w:pPr>
+        <w:pStyle w:val="ListBullet"/>
+      </w:pPr>
+      <w:r>
+        <w:t>Status: ready_for_author_check</w:t>
+      </w:r>
+    </w:p>
+    <w:p>
+      <w:pPr>
+        <w:pStyle w:val="ListBullet"/>
+      </w:pPr>
+      <w:r>
+        <w:t>Draft response: Public code is available at https://github.com/healthgreat/rmtguard. The repository includes local code, tests, CI, Dockerfile, release manifests, dataset metadata and regeneration scripts. Post-release working-branch changes should not be described as part of the immutable release unless a new release is issued.</w:t>
+      </w:r>
+    </w:p>
+    <w:p>
+      <w:pPr>
+        <w:pStyle w:val="ListBullet"/>
+      </w:pPr>
+      <w:r>
+        <w:t>Evidence: results/release/release_readiness.tsv</w:t>
+      </w:r>
+    </w:p>
+    <w:p>
+      <w:pPr>
+        <w:pStyle w:val="ListBullet"/>
+      </w:pPr>
+      <w:r>
+        <w:t>Author action required: Before submission, verify that the final submitted code corresponds to an archived release.</w:t>
+      </w:r>
+    </w:p>
+    <w:p>
+      <w:pPr>
+        <w:pStyle w:val="ListBullet"/>
+      </w:pPr>
+      <w:r>
+        <w:t>Notes: Code availability is no longer the hard P0 blocker; final release coverage remains author-controlled.</w:t>
+      </w:r>
+    </w:p>
+    <w:p>
+      <w:pPr>
+        <w:pStyle w:val="Heading3"/>
+      </w:pPr>
+      <w:r>
+        <w:t>Software - Code DOI</w:t>
+      </w:r>
+    </w:p>
+    <w:p>
+      <w:pPr>
+        <w:pStyle w:val="ListBullet"/>
+      </w:pPr>
+      <w:r>
+        <w:t>Status: needs_release_refresh</w:t>
+      </w:r>
+    </w:p>
+    <w:p>
+      <w:pPr>
+        <w:pStyle w:val="ListBullet"/>
+      </w:pPr>
+      <w:r>
+        <w:t>Draft response: The archived software DOI recorded in .zenodo.json and CITATION.cff is 10.5281/zenodo.20012350. The current working branch contains post-release changes; if these are cited in the submitted manuscript, create and archive a new release before submission.</w:t>
+      </w:r>
+    </w:p>
+    <w:p>
+      <w:pPr>
+        <w:pStyle w:val="ListBullet"/>
+      </w:pPr>
+      <w:r>
+        <w:t>Evidence: results/release/release_readiness.tsv</w:t>
+      </w:r>
+    </w:p>
+    <w:p>
+      <w:pPr>
+        <w:pStyle w:val="ListBullet"/>
+      </w:pPr>
+      <w:r>
+        <w:t>Author action required: Create a new GitHub Release/Zenodo archive if the final manuscript depends on post-v0.1.0 files.</w:t>
+      </w:r>
+    </w:p>
+    <w:p>
+      <w:pPr>
+        <w:pStyle w:val="ListBullet"/>
+      </w:pPr>
+      <w:r>
+        <w:t>Notes: The DOI exists; the remaining issue is exact version coverage, not absence of DOI.</w:t>
+      </w:r>
+    </w:p>
+    <w:p>
+      <w:pPr>
+        <w:pStyle w:val="Heading3"/>
+      </w:pPr>
+      <w:r>
+        <w:t>Reporting summary - Official form status</w:t>
+      </w:r>
+    </w:p>
+    <w:p>
+      <w:pPr>
+        <w:pStyle w:val="ListBullet"/>
+      </w:pPr>
+      <w:r>
+        <w:t>Status: pending_manual</w:t>
+      </w:r>
+    </w:p>
+    <w:p>
+      <w:pPr>
+        <w:pStyle w:val="ListBullet"/>
+      </w:pPr>
+      <w:r>
+        <w:t>Draft response: This draft pre-fills reporting-summary content, but the official Nature Portfolio reporting summary must be completed and verified by the corresponding author.</w:t>
+      </w:r>
+    </w:p>
+    <w:p>
+      <w:pPr>
+        <w:pStyle w:val="ListBullet"/>
+      </w:pPr>
+      <w:r>
+        <w:t>Evidence: results/submission/nature_methods_compliance_audit.tsv</w:t>
+      </w:r>
+    </w:p>
+    <w:p>
+      <w:pPr>
+        <w:pStyle w:val="ListBullet"/>
+      </w:pPr>
+      <w:r>
+        <w:t>Author action required: Transfer verified answers into the official submission system.</w:t>
+      </w:r>
+    </w:p>
+    <w:p>
+      <w:pPr>
+        <w:pStyle w:val="ListBullet"/>
+      </w:pPr>
+      <w:r>
+        <w:t>Notes: Codex can assist but cannot truthfully certify the official form without author review.</w:t>
+      </w:r>
+    </w:p>
+    <w:p>
+      <w:pPr>
+        <w:pStyle w:val="Heading1"/>
+      </w:pPr>
+      <w:r>
         <w:t>Freeze-aligned Results draft</w:t>
       </w:r>
     </w:p>

</xml_diff>

<commit_message>
Add figure caption source audit
</commit_message>
<xml_diff>
--- a/output/doc/RMTGuard_external_review_packet_2026-05-12.docx
+++ b/output/doc/RMTGuard_external_review_packet_2026-05-12.docx
@@ -27,7 +27,7 @@
     </w:p>
     <w:p>
       <w:r>
-        <w:t>Generated: 2026-05-12 13:01:50</w:t>
+        <w:t>Generated: 2026-05-12 13:12:30</w:t>
       </w:r>
     </w:p>
     <w:tbl>
@@ -1771,6 +1771,720 @@
         <w:pStyle w:val="Heading1"/>
       </w:pPr>
       <w:r>
+        <w:t>Figure-caption-source audit</w:t>
+      </w:r>
+    </w:p>
+    <w:p>
+      <w:pPr>
+        <w:pStyle w:val="Heading2"/>
+      </w:pPr>
+      <w:r>
+        <w:t>Figure-caption-source audit</w:t>
+      </w:r>
+    </w:p>
+    <w:p>
+      <w:r>
+        <w:t>Generated by python scripts/build_figure_caption_source_audit.py.</w:t>
+      </w:r>
+    </w:p>
+    <w:p>
+      <w:pPr>
+        <w:pStyle w:val="Heading2"/>
+      </w:pPr>
+      <w:r>
+        <w:t>Boundary</w:t>
+      </w:r>
+    </w:p>
+    <w:p>
+      <w:r>
+        <w:t>This audit checks consistency among rendered figure files, machine-readable source data, and freeze-aligned legends. It does not certify journal acceptance and does not change any scientific result.</w:t>
+      </w:r>
+    </w:p>
+    <w:p>
+      <w:pPr>
+        <w:pStyle w:val="Heading2"/>
+      </w:pPr>
+      <w:r>
+        <w:t>Status</w:t>
+      </w:r>
+    </w:p>
+    <w:p>
+      <w:pPr>
+        <w:pStyle w:val="ListBullet"/>
+      </w:pPr>
+      <w:r>
+        <w:t>Display items checked: 7.</w:t>
+      </w:r>
+    </w:p>
+    <w:p>
+      <w:pPr>
+        <w:pStyle w:val="ListBullet"/>
+      </w:pPr>
+      <w:r>
+        <w:t>Blocked missing-asset/legend rows: 0.</w:t>
+      </w:r>
+    </w:p>
+    <w:p>
+      <w:pPr>
+        <w:pStyle w:val="ListBullet"/>
+      </w:pPr>
+      <w:r>
+        <w:t>Status counts: ready_pending_author_ack=1, ready_with_boundary=6</w:t>
+      </w:r>
+    </w:p>
+    <w:p>
+      <w:pPr>
+        <w:pStyle w:val="Heading2"/>
+      </w:pPr>
+      <w:r>
+        <w:t>Remaining Actions</w:t>
+      </w:r>
+    </w:p>
+    <w:p>
+      <w:pPr>
+        <w:pStyle w:val="ListBullet"/>
+      </w:pPr>
+      <w:r>
+        <w:t>Figure 4 (ready_pending_author_ack): Obtain corresponding-author acknowledgement of bounded wording before external submission.</w:t>
+      </w:r>
+    </w:p>
+    <w:p>
+      <w:pPr>
+        <w:pStyle w:val="Heading2"/>
+      </w:pPr>
+      <w:r>
+        <w:t>Audit Table</w:t>
+      </w:r>
+    </w:p>
+    <w:tbl>
+      <w:tblPr>
+        <w:tblStyle w:val="TableGrid"/>
+        <w:tblW w:type="auto" w:w="0"/>
+        <w:tblLook w:firstColumn="1" w:firstRow="1" w:lastColumn="0" w:lastRow="0" w:noHBand="0" w:noVBand="1" w:val="04A0"/>
+      </w:tblPr>
+      <w:tblGrid>
+        <w:gridCol w:w="1440"/>
+        <w:gridCol w:w="1440"/>
+        <w:gridCol w:w="1440"/>
+        <w:gridCol w:w="1440"/>
+        <w:gridCol w:w="1440"/>
+        <w:gridCol w:w="1440"/>
+        <w:gridCol w:w="1440"/>
+      </w:tblGrid>
+      <w:tr>
+        <w:tc>
+          <w:tcPr>
+            <w:tcW w:type="dxa" w:w="1440"/>
+          </w:tcPr>
+          <w:p>
+            <w:r>
+              <w:t>Display item</w:t>
+            </w:r>
+          </w:p>
+        </w:tc>
+        <w:tc>
+          <w:tcPr>
+            <w:tcW w:type="dxa" w:w="1440"/>
+          </w:tcPr>
+          <w:p>
+            <w:r>
+              <w:t>Status</w:t>
+            </w:r>
+          </w:p>
+        </w:tc>
+        <w:tc>
+          <w:tcPr>
+            <w:tcW w:type="dxa" w:w="1440"/>
+          </w:tcPr>
+          <w:p>
+            <w:r>
+              <w:t>Assets</w:t>
+            </w:r>
+          </w:p>
+        </w:tc>
+        <w:tc>
+          <w:tcPr>
+            <w:tcW w:type="dxa" w:w="1440"/>
+          </w:tcPr>
+          <w:p>
+            <w:r>
+              <w:t>Source data</w:t>
+            </w:r>
+          </w:p>
+        </w:tc>
+        <w:tc>
+          <w:tcPr>
+            <w:tcW w:type="dxa" w:w="1440"/>
+          </w:tcPr>
+          <w:p>
+            <w:r>
+              <w:t>Legend</w:t>
+            </w:r>
+          </w:p>
+        </w:tc>
+        <w:tc>
+          <w:tcPr>
+            <w:tcW w:type="dxa" w:w="1440"/>
+          </w:tcPr>
+          <w:p>
+            <w:r>
+              <w:t>Claim boundary</w:t>
+            </w:r>
+          </w:p>
+        </w:tc>
+        <w:tc>
+          <w:tcPr>
+            <w:tcW w:type="dxa" w:w="1440"/>
+          </w:tcPr>
+          <w:p>
+            <w:r>
+              <w:t>Required action</w:t>
+            </w:r>
+          </w:p>
+        </w:tc>
+      </w:tr>
+      <w:tr>
+        <w:tc>
+          <w:tcPr>
+            <w:tcW w:type="dxa" w:w="1440"/>
+          </w:tcPr>
+          <w:p>
+            <w:r>
+              <w:t>Figure 1</w:t>
+            </w:r>
+          </w:p>
+        </w:tc>
+        <w:tc>
+          <w:tcPr>
+            <w:tcW w:type="dxa" w:w="1440"/>
+          </w:tcPr>
+          <w:p>
+            <w:r>
+              <w:t>ready_with_boundary</w:t>
+            </w:r>
+          </w:p>
+        </w:tc>
+        <w:tc>
+          <w:tcPr>
+            <w:tcW w:type="dxa" w:w="1440"/>
+          </w:tcPr>
+          <w:p>
+            <w:r>
+              <w:t>True</w:t>
+            </w:r>
+          </w:p>
+        </w:tc>
+        <w:tc>
+          <w:tcPr>
+            <w:tcW w:type="dxa" w:w="1440"/>
+          </w:tcPr>
+          <w:p>
+            <w:r>
+              <w:t>True</w:t>
+            </w:r>
+          </w:p>
+        </w:tc>
+        <w:tc>
+          <w:tcPr>
+            <w:tcW w:type="dxa" w:w="1440"/>
+          </w:tcPr>
+          <w:p>
+            <w:r>
+              <w:t>True</w:t>
+            </w:r>
+          </w:p>
+        </w:tc>
+        <w:tc>
+          <w:tcPr>
+            <w:tcW w:type="dxa" w:w="1440"/>
+          </w:tcPr>
+          <w:p>
+            <w:r>
+              <w:t>Workflow and diagnostic overview only; do not claim new random-matrix theory.</w:t>
+            </w:r>
+          </w:p>
+        </w:tc>
+        <w:tc>
+          <w:tcPr>
+            <w:tcW w:type="dxa" w:w="1440"/>
+          </w:tcPr>
+          <w:p>
+            <w:r>
+              <w:t>Verify final panel labels match both source-data tables before submission.</w:t>
+            </w:r>
+          </w:p>
+        </w:tc>
+      </w:tr>
+      <w:tr>
+        <w:tc>
+          <w:tcPr>
+            <w:tcW w:type="dxa" w:w="1440"/>
+          </w:tcPr>
+          <w:p>
+            <w:r>
+              <w:t>Figure 2</w:t>
+            </w:r>
+          </w:p>
+        </w:tc>
+        <w:tc>
+          <w:tcPr>
+            <w:tcW w:type="dxa" w:w="1440"/>
+          </w:tcPr>
+          <w:p>
+            <w:r>
+              <w:t>ready_with_boundary</w:t>
+            </w:r>
+          </w:p>
+        </w:tc>
+        <w:tc>
+          <w:tcPr>
+            <w:tcW w:type="dxa" w:w="1440"/>
+          </w:tcPr>
+          <w:p>
+            <w:r>
+              <w:t>True</w:t>
+            </w:r>
+          </w:p>
+        </w:tc>
+        <w:tc>
+          <w:tcPr>
+            <w:tcW w:type="dxa" w:w="1440"/>
+          </w:tcPr>
+          <w:p>
+            <w:r>
+              <w:t>True</w:t>
+            </w:r>
+          </w:p>
+        </w:tc>
+        <w:tc>
+          <w:tcPr>
+            <w:tcW w:type="dxa" w:w="1440"/>
+          </w:tcPr>
+          <w:p>
+            <w:r>
+              <w:t>True</w:t>
+            </w:r>
+          </w:p>
+        </w:tc>
+        <w:tc>
+          <w:tcPr>
+            <w:tcW w:type="dxa" w:w="1440"/>
+          </w:tcPr>
+          <w:p>
+            <w:r>
+              <w:t>Supports tested null and rare-state regimes only; lowest-prevalence weak-effect limitation must remain visible.</w:t>
+            </w:r>
+          </w:p>
+        </w:tc>
+        <w:tc>
+          <w:tcPr>
+            <w:tcW w:type="dxa" w:w="1440"/>
+          </w:tcPr>
+          <w:p>
+            <w:r>
+              <w:t>Final caption must keep the prevalence 0.02/effect 2.5 limitation.</w:t>
+            </w:r>
+          </w:p>
+        </w:tc>
+      </w:tr>
+      <w:tr>
+        <w:tc>
+          <w:tcPr>
+            <w:tcW w:type="dxa" w:w="1440"/>
+          </w:tcPr>
+          <w:p>
+            <w:r>
+              <w:t>Figure 3</w:t>
+            </w:r>
+          </w:p>
+        </w:tc>
+        <w:tc>
+          <w:tcPr>
+            <w:tcW w:type="dxa" w:w="1440"/>
+          </w:tcPr>
+          <w:p>
+            <w:r>
+              <w:t>ready_with_boundary</w:t>
+            </w:r>
+          </w:p>
+        </w:tc>
+        <w:tc>
+          <w:tcPr>
+            <w:tcW w:type="dxa" w:w="1440"/>
+          </w:tcPr>
+          <w:p>
+            <w:r>
+              <w:t>True</w:t>
+            </w:r>
+          </w:p>
+        </w:tc>
+        <w:tc>
+          <w:tcPr>
+            <w:tcW w:type="dxa" w:w="1440"/>
+          </w:tcPr>
+          <w:p>
+            <w:r>
+              <w:t>True</w:t>
+            </w:r>
+          </w:p>
+        </w:tc>
+        <w:tc>
+          <w:tcPr>
+            <w:tcW w:type="dxa" w:w="1440"/>
+          </w:tcPr>
+          <w:p>
+            <w:r>
+              <w:t>True</w:t>
+            </w:r>
+          </w:p>
+        </w:tc>
+        <w:tc>
+          <w:tcPr>
+            <w:tcW w:type="dxa" w:w="1440"/>
+          </w:tcPr>
+          <w:p>
+            <w:r>
+              <w:t>Does not support broad superiority over every fixed-PC or elbow baseline.</w:t>
+            </w:r>
+          </w:p>
+        </w:tc>
+        <w:tc>
+          <w:tcPr>
+            <w:tcW w:type="dxa" w:w="1440"/>
+          </w:tcPr>
+          <w:p>
+            <w:r>
+              <w:t>Decide whether no-call and Seurat paired panels are integrated into main Figure 3 or moved to Extended Data.</w:t>
+            </w:r>
+          </w:p>
+        </w:tc>
+      </w:tr>
+      <w:tr>
+        <w:tc>
+          <w:tcPr>
+            <w:tcW w:type="dxa" w:w="1440"/>
+          </w:tcPr>
+          <w:p>
+            <w:r>
+              <w:t>Figure 4</w:t>
+            </w:r>
+          </w:p>
+        </w:tc>
+        <w:tc>
+          <w:tcPr>
+            <w:tcW w:type="dxa" w:w="1440"/>
+          </w:tcPr>
+          <w:p>
+            <w:r>
+              <w:t>ready_pending_author_ack</w:t>
+            </w:r>
+          </w:p>
+        </w:tc>
+        <w:tc>
+          <w:tcPr>
+            <w:tcW w:type="dxa" w:w="1440"/>
+          </w:tcPr>
+          <w:p>
+            <w:r>
+              <w:t>True</w:t>
+            </w:r>
+          </w:p>
+        </w:tc>
+        <w:tc>
+          <w:tcPr>
+            <w:tcW w:type="dxa" w:w="1440"/>
+          </w:tcPr>
+          <w:p>
+            <w:r>
+              <w:t>True</w:t>
+            </w:r>
+          </w:p>
+        </w:tc>
+        <w:tc>
+          <w:tcPr>
+            <w:tcW w:type="dxa" w:w="1440"/>
+          </w:tcPr>
+          <w:p>
+            <w:r>
+              <w:t>True</w:t>
+            </w:r>
+          </w:p>
+        </w:tc>
+        <w:tc>
+          <w:tcPr>
+            <w:tcW w:type="dxa" w:w="1440"/>
+          </w:tcPr>
+          <w:p>
+            <w:r>
+              <w:t>Methods-paper public-data use case only; no new mechanism, prognosis, therapy-response, spatial or protein-validation claim.</w:t>
+            </w:r>
+          </w:p>
+        </w:tc>
+        <w:tc>
+          <w:tcPr>
+            <w:tcW w:type="dxa" w:w="1440"/>
+          </w:tcPr>
+          <w:p>
+            <w:r>
+              <w:t>Obtain corresponding-author acknowledgement of bounded wording before external submission.</w:t>
+            </w:r>
+          </w:p>
+        </w:tc>
+      </w:tr>
+      <w:tr>
+        <w:tc>
+          <w:tcPr>
+            <w:tcW w:type="dxa" w:w="1440"/>
+          </w:tcPr>
+          <w:p>
+            <w:r>
+              <w:t>Figure 5</w:t>
+            </w:r>
+          </w:p>
+        </w:tc>
+        <w:tc>
+          <w:tcPr>
+            <w:tcW w:type="dxa" w:w="1440"/>
+          </w:tcPr>
+          <w:p>
+            <w:r>
+              <w:t>ready_with_boundary</w:t>
+            </w:r>
+          </w:p>
+        </w:tc>
+        <w:tc>
+          <w:tcPr>
+            <w:tcW w:type="dxa" w:w="1440"/>
+          </w:tcPr>
+          <w:p>
+            <w:r>
+              <w:t>True</w:t>
+            </w:r>
+          </w:p>
+        </w:tc>
+        <w:tc>
+          <w:tcPr>
+            <w:tcW w:type="dxa" w:w="1440"/>
+          </w:tcPr>
+          <w:p>
+            <w:r>
+              <w:t>True</w:t>
+            </w:r>
+          </w:p>
+        </w:tc>
+        <w:tc>
+          <w:tcPr>
+            <w:tcW w:type="dxa" w:w="1440"/>
+          </w:tcPr>
+          <w:p>
+            <w:r>
+              <w:t>True</w:t>
+            </w:r>
+          </w:p>
+        </w:tc>
+        <w:tc>
+          <w:tcPr>
+            <w:tcW w:type="dxa" w:w="1440"/>
+          </w:tcPr>
+          <w:p>
+            <w:r>
+              <w:t>Component contribution only under tested datasets/repeats; post-release working branch requires a new DOI archive if cited.</w:t>
+            </w:r>
+          </w:p>
+        </w:tc>
+        <w:tc>
+          <w:tcPr>
+            <w:tcW w:type="dxa" w:w="1440"/>
+          </w:tcPr>
+          <w:p>
+            <w:r>
+              <w:t>Use this as the main Figure 5; keep the larger real-data ablation forest as Extended Data.</w:t>
+            </w:r>
+          </w:p>
+        </w:tc>
+      </w:tr>
+      <w:tr>
+        <w:tc>
+          <w:tcPr>
+            <w:tcW w:type="dxa" w:w="1440"/>
+          </w:tcPr>
+          <w:p>
+            <w:r>
+              <w:t>Extended Data - real-data ablation</w:t>
+            </w:r>
+          </w:p>
+        </w:tc>
+        <w:tc>
+          <w:tcPr>
+            <w:tcW w:type="dxa" w:w="1440"/>
+          </w:tcPr>
+          <w:p>
+            <w:r>
+              <w:t>ready_with_boundary</w:t>
+            </w:r>
+          </w:p>
+        </w:tc>
+        <w:tc>
+          <w:tcPr>
+            <w:tcW w:type="dxa" w:w="1440"/>
+          </w:tcPr>
+          <w:p>
+            <w:r>
+              <w:t>True</w:t>
+            </w:r>
+          </w:p>
+        </w:tc>
+        <w:tc>
+          <w:tcPr>
+            <w:tcW w:type="dxa" w:w="1440"/>
+          </w:tcPr>
+          <w:p>
+            <w:r>
+              <w:t>True</w:t>
+            </w:r>
+          </w:p>
+        </w:tc>
+        <w:tc>
+          <w:tcPr>
+            <w:tcW w:type="dxa" w:w="1440"/>
+          </w:tcPr>
+          <w:p>
+            <w:r>
+              <w:t>True</w:t>
+            </w:r>
+          </w:p>
+        </w:tc>
+        <w:tc>
+          <w:tcPr>
+            <w:tcW w:type="dxa" w:w="1440"/>
+          </w:tcPr>
+          <w:p>
+            <w:r>
+              <w:t>Supports component-sensitivity discussion under tested labeled datasets and repeats only.</w:t>
+            </w:r>
+          </w:p>
+        </w:tc>
+        <w:tc>
+          <w:tcPr>
+            <w:tcW w:type="dxa" w:w="1440"/>
+          </w:tcPr>
+          <w:p>
+            <w:r>
+              <w:t>Label as Extended Data or Supplementary Figure; do not use as universal component-necessity proof.</w:t>
+            </w:r>
+          </w:p>
+        </w:tc>
+      </w:tr>
+      <w:tr>
+        <w:tc>
+          <w:tcPr>
+            <w:tcW w:type="dxa" w:w="1440"/>
+          </w:tcPr>
+          <w:p>
+            <w:r>
+              <w:t>Extended Data - topology</w:t>
+            </w:r>
+          </w:p>
+        </w:tc>
+        <w:tc>
+          <w:tcPr>
+            <w:tcW w:type="dxa" w:w="1440"/>
+          </w:tcPr>
+          <w:p>
+            <w:r>
+              <w:t>ready_with_boundary</w:t>
+            </w:r>
+          </w:p>
+        </w:tc>
+        <w:tc>
+          <w:tcPr>
+            <w:tcW w:type="dxa" w:w="1440"/>
+          </w:tcPr>
+          <w:p>
+            <w:r>
+              <w:t>True</w:t>
+            </w:r>
+          </w:p>
+        </w:tc>
+        <w:tc>
+          <w:tcPr>
+            <w:tcW w:type="dxa" w:w="1440"/>
+          </w:tcPr>
+          <w:p>
+            <w:r>
+              <w:t>True</w:t>
+            </w:r>
+          </w:p>
+        </w:tc>
+        <w:tc>
+          <w:tcPr>
+            <w:tcW w:type="dxa" w:w="1440"/>
+          </w:tcPr>
+          <w:p>
+            <w:r>
+              <w:t>True</w:t>
+            </w:r>
+          </w:p>
+        </w:tc>
+        <w:tc>
+          <w:tcPr>
+            <w:tcW w:type="dxa" w:w="1440"/>
+          </w:tcPr>
+          <w:p>
+            <w:r>
+              <w:t>Topology monitoring with trade-offs only; not trajectory-method superiority.</w:t>
+            </w:r>
+          </w:p>
+        </w:tc>
+        <w:tc>
+          <w:tcPr>
+            <w:tcW w:type="dxa" w:w="1440"/>
+          </w:tcPr>
+          <w:p>
+            <w:r>
+              <w:t>Keep annotation-derived Paul15 limitation in the final legend.</w:t>
+            </w:r>
+          </w:p>
+        </w:tc>
+      </w:tr>
+    </w:tbl>
+    <w:p>
+      <w:pPr>
+        <w:pStyle w:val="Heading2"/>
+      </w:pPr>
+      <w:r>
+        <w:t>Interpretation</w:t>
+      </w:r>
+    </w:p>
+    <w:p>
+      <w:pPr>
+        <w:pStyle w:val="ListBullet"/>
+      </w:pPr>
+      <w:r>
+        <w:t>ready_with_boundary means the assets, source data and frozen legend exist, but the claim boundary must still be preserved during final journal formatting.</w:t>
+      </w:r>
+    </w:p>
+    <w:p>
+      <w:pPr>
+        <w:pStyle w:val="ListBullet"/>
+      </w:pPr>
+      <w:r>
+        <w:t>ready_pending_author_ack means Codex can package the figure, but corresponding-author acknowledgement is still needed before external submission.</w:t>
+      </w:r>
+    </w:p>
+    <w:p>
+      <w:pPr>
+        <w:pStyle w:val="ListBullet"/>
+      </w:pPr>
+      <w:r>
+        <w:t>needs_layout_decision means all key evidence exists, but the final main/supplement figure layout has not been frozen.</w:t>
+      </w:r>
+    </w:p>
+    <w:p>
+      <w:pPr>
+        <w:pStyle w:val="Heading1"/>
+      </w:pPr>
+      <w:r>
         <w:t>Nature reporting-summary worksheet</w:t>
       </w:r>
     </w:p>
@@ -2500,7 +3214,7 @@
     </w:p>
     <w:p>
       <w:r>
-        <w:t>RMTGuard was evaluated as a callability-aware random-matrix workflow rather than as a universal replacement for fixed-parameter single-cell analysis. The current evidence freeze contains 23 manuscript-facing items with 0 missing files, linking algorithm figures, source-data tables, release evidence, public benchmarks, topology monitors and manual author blockers. This freeze defines the Results boundary used below: supported structures may be reported, but diagnostic no-call and caveated-call outcomes are not relabelled as biological discoveries. [Evidence: docs/current_evidence_freeze_2026-05-12.md]</w:t>
+        <w:t>RMTGuard was evaluated as a callability-aware random-matrix workflow rather than as a universal replacement for fixed-parameter single-cell analysis. The current evidence freeze contains 28 manuscript-facing items with 0 missing files, linking algorithm figures, source-data tables, release evidence, public benchmarks, topology monitors and manual author blockers. This freeze defines the Results boundary used below: supported structures may be reported, but diagnostic no-call and caveated-call outcomes are not relabelled as biological discoveries. [Evidence: docs/current_evidence_freeze_2026-05-12.md]</w:t>
       </w:r>
     </w:p>
     <w:p>
@@ -2668,7 +3382,20 @@
     </w:p>
     <w:p>
       <w:r>
-        <w:t>Ablation and reproducibility panels summarize the tested contributions of RMTGuard components, runtime/memory reporting and release artifacts. The public repository, GitHub Release and Zenodo DOI support code availability for the archived release, while post-release working-branch changes should not be described as part of the immutable DOI snapshot unless a new release is issued. Source data: results/figures/source_data/figure5_realdata_ablation_delta_summary.tsv and release manifests.</w:t>
+        <w:t>Main Figure 5 summarizes runtime, memory, submission-gate status and the PBMC3k stability-ablation panel used for software/reproducibility reporting. The public repository, GitHub Release and Zenodo DOI support code availability for the archived release, while post-release working-branch changes should not be described as part of the immutable DOI snapshot unless a new release is issued. Source data: results/figures/source_data/figure5_runtime_memory_summary.tsv, results/figures/source_data/figure5_gate_evidence.tsv, results/figures/source_data/figure5_ablation_stability_summary.tsv and release manifests.</w:t>
+      </w:r>
+    </w:p>
+    <w:p>
+      <w:pPr>
+        <w:pStyle w:val="Heading2"/>
+      </w:pPr>
+      <w:r>
+        <w:t>Extended Data Figure. Real-data ablation annotation monitor.</w:t>
+      </w:r>
+    </w:p>
+    <w:p>
+      <w:r>
+        <w:t>The real-data ablation forest plot summarizes annotation-ARI and batch-ARI deltas for tested RMTGuard component variants across labeled public datasets. This panel supports component-sensitivity discussion under the tested datasets and repeats, but it should not be described as proving universal component necessity. Source data: results/figures/source_data/figure5_realdata_ablation_delta_summary.tsv.</w:t>
       </w:r>
     </w:p>
     <w:p>

</xml_diff>

<commit_message>
Add post-release version coverage audit
</commit_message>
<xml_diff>
--- a/output/doc/RMTGuard_external_review_packet_2026-05-12.docx
+++ b/output/doc/RMTGuard_external_review_packet_2026-05-12.docx
@@ -27,7 +27,7 @@
     </w:p>
     <w:p>
       <w:r>
-        <w:t>Generated: 2026-05-12 13:12:30</w:t>
+        <w:t>Generated: 2026-05-12 13:20:03</w:t>
       </w:r>
     </w:p>
     <w:tbl>
@@ -221,7 +221,7 @@
       <w:r>
         <w:drawing>
           <wp:inline xmlns:a="http://schemas.openxmlformats.org/drawingml/2006/main" xmlns:pic="http://schemas.openxmlformats.org/drawingml/2006/picture">
-            <wp:extent cx="5120640" cy="7993418"/>
+            <wp:extent cx="5120640" cy="8150032"/>
             <wp:docPr id="1" name="Picture 1"/>
             <wp:cNvGraphicFramePr>
               <a:graphicFrameLocks noChangeAspect="1"/>
@@ -242,7 +242,7 @@
                   <pic:spPr>
                     <a:xfrm>
                       <a:off x="0" y="0"/>
-                      <a:ext cx="5120640" cy="7993418"/>
+                      <a:ext cx="5120640" cy="8150032"/>
                     </a:xfrm>
                     <a:prstGeom prst="rect"/>
                   </pic:spPr>
@@ -330,7 +330,7 @@
         <w:pStyle w:val="ListBullet"/>
       </w:pPr>
       <w:r>
-        <w:t>Items checked: 28</w:t>
+        <w:t>Items checked: 29</w:t>
       </w:r>
     </w:p>
     <w:p>
@@ -370,7 +370,7 @@
         <w:pStyle w:val="ListBullet"/>
       </w:pPr>
       <w:r>
-        <w:t>figure: 9</w:t>
+        <w:t>figure: 10</w:t>
       </w:r>
     </w:p>
     <w:p>
@@ -2478,6 +2478,2478 @@
       </w:pPr>
       <w:r>
         <w:t>needs_layout_decision means all key evidence exists, but the final main/supplement figure layout has not been frozen.</w:t>
+      </w:r>
+    </w:p>
+    <w:p>
+      <w:pPr>
+        <w:pStyle w:val="Heading1"/>
+      </w:pPr>
+      <w:r>
+        <w:t>Post-release version coverage audit</w:t>
+      </w:r>
+    </w:p>
+    <w:p>
+      <w:pPr>
+        <w:pStyle w:val="Heading2"/>
+      </w:pPr>
+      <w:r>
+        <w:t>Post-release version coverage audit</w:t>
+      </w:r>
+    </w:p>
+    <w:p>
+      <w:r>
+        <w:t>Generated: 2026-05-12</w:t>
+      </w:r>
+    </w:p>
+    <w:p>
+      <w:pPr>
+        <w:pStyle w:val="Heading2"/>
+      </w:pPr>
+      <w:r>
+        <w:t>Boundary</w:t>
+      </w:r>
+    </w:p>
+    <w:p>
+      <w:r>
+        <w:t>This audit compares the archived v0.1.0 release with the current branch. It does not create a tag, push a release, or mint a new DOI.</w:t>
+      </w:r>
+    </w:p>
+    <w:p>
+      <w:pPr>
+        <w:pStyle w:val="Heading2"/>
+      </w:pPr>
+      <w:r>
+        <w:t>Bottom Line</w:t>
+      </w:r>
+    </w:p>
+    <w:p>
+      <w:pPr>
+        <w:pStyle w:val="ListBullet"/>
+      </w:pPr>
+      <w:r>
+        <w:t>Commits after v0.1.0: 43.</w:t>
+      </w:r>
+    </w:p>
+    <w:p>
+      <w:pPr>
+        <w:pStyle w:val="ListBullet"/>
+      </w:pPr>
+      <w:r>
+        <w:t>Changed files after v0.1.0: 253.</w:t>
+      </w:r>
+    </w:p>
+    <w:p>
+      <w:pPr>
+        <w:pStyle w:val="ListBullet"/>
+      </w:pPr>
+      <w:r>
+        <w:t>Manuscript-facing changed files: 243.</w:t>
+      </w:r>
+    </w:p>
+    <w:p>
+      <w:pPr>
+        <w:pStyle w:val="ListBullet"/>
+      </w:pPr>
+      <w:r>
+        <w:t>Recommendation: prepare_v0.1.1_after_author_ack.</w:t>
+      </w:r>
+    </w:p>
+    <w:p>
+      <w:pPr>
+        <w:pStyle w:val="ListBullet"/>
+      </w:pPr>
+      <w:r>
+        <w:t>Candidate next release: v0.1.1.</w:t>
+      </w:r>
+    </w:p>
+    <w:p>
+      <w:pPr>
+        <w:pStyle w:val="Heading2"/>
+      </w:pPr>
+      <w:r>
+        <w:t>Audit Rows</w:t>
+      </w:r>
+    </w:p>
+    <w:tbl>
+      <w:tblPr>
+        <w:tblStyle w:val="TableGrid"/>
+        <w:tblW w:type="auto" w:w="0"/>
+        <w:tblLook w:firstColumn="1" w:firstRow="1" w:lastColumn="0" w:lastRow="0" w:noHBand="0" w:noVBand="1" w:val="04A0"/>
+      </w:tblPr>
+      <w:tblGrid>
+        <w:gridCol w:w="2016"/>
+        <w:gridCol w:w="2016"/>
+        <w:gridCol w:w="2016"/>
+        <w:gridCol w:w="2016"/>
+        <w:gridCol w:w="2016"/>
+      </w:tblGrid>
+      <w:tr>
+        <w:tc>
+          <w:tcPr>
+            <w:tcW w:type="dxa" w:w="2016"/>
+          </w:tcPr>
+          <w:p>
+            <w:r>
+              <w:t>Audit ID</w:t>
+            </w:r>
+          </w:p>
+        </w:tc>
+        <w:tc>
+          <w:tcPr>
+            <w:tcW w:type="dxa" w:w="2016"/>
+          </w:tcPr>
+          <w:p>
+            <w:r>
+              <w:t>Status</w:t>
+            </w:r>
+          </w:p>
+        </w:tc>
+        <w:tc>
+          <w:tcPr>
+            <w:tcW w:type="dxa" w:w="2016"/>
+          </w:tcPr>
+          <w:p>
+            <w:r>
+              <w:t>Evidence</w:t>
+            </w:r>
+          </w:p>
+        </w:tc>
+        <w:tc>
+          <w:tcPr>
+            <w:tcW w:type="dxa" w:w="2016"/>
+          </w:tcPr>
+          <w:p>
+            <w:r>
+              <w:t>Required action</w:t>
+            </w:r>
+          </w:p>
+        </w:tc>
+        <w:tc>
+          <w:tcPr>
+            <w:tcW w:type="dxa" w:w="2016"/>
+          </w:tcPr>
+          <w:p>
+            <w:r>
+              <w:t>Notes</w:t>
+            </w:r>
+          </w:p>
+        </w:tc>
+      </w:tr>
+      <w:tr>
+        <w:tc>
+          <w:tcPr>
+            <w:tcW w:type="dxa" w:w="2016"/>
+          </w:tcPr>
+          <w:p>
+            <w:r>
+              <w:t>release_tag</w:t>
+            </w:r>
+          </w:p>
+        </w:tc>
+        <w:tc>
+          <w:tcPr>
+            <w:tcW w:type="dxa" w:w="2016"/>
+          </w:tcPr>
+          <w:p>
+            <w:r>
+              <w:t>present</w:t>
+            </w:r>
+          </w:p>
+        </w:tc>
+        <w:tc>
+          <w:tcPr>
+            <w:tcW w:type="dxa" w:w="2016"/>
+          </w:tcPr>
+          <w:p>
+            <w:r>
+              <w:t>v0.1.0</w:t>
+            </w:r>
+          </w:p>
+        </w:tc>
+        <w:tc>
+          <w:tcPr>
+            <w:tcW w:type="dxa" w:w="2016"/>
+          </w:tcPr>
+          <w:p>
+            <w:r>
+              <w:t>Keep v0.1.0 immutable.</w:t>
+            </w:r>
+          </w:p>
+        </w:tc>
+        <w:tc>
+          <w:tcPr>
+            <w:tcW w:type="dxa" w:w="2016"/>
+          </w:tcPr>
+          <w:p>
+            <w:r>
+              <w:t>v0.1.0 commit 053b84ad3bf04ebc1193b5fff420b770946a3845.</w:t>
+            </w:r>
+          </w:p>
+        </w:tc>
+      </w:tr>
+      <w:tr>
+        <w:tc>
+          <w:tcPr>
+            <w:tcW w:type="dxa" w:w="2016"/>
+          </w:tcPr>
+          <w:p>
+            <w:r>
+              <w:t>current_head</w:t>
+            </w:r>
+          </w:p>
+        </w:tc>
+        <w:tc>
+          <w:tcPr>
+            <w:tcW w:type="dxa" w:w="2016"/>
+          </w:tcPr>
+          <w:p>
+            <w:r>
+              <w:t>tracked</w:t>
+            </w:r>
+          </w:p>
+        </w:tc>
+        <w:tc>
+          <w:tcPr>
+            <w:tcW w:type="dxa" w:w="2016"/>
+          </w:tcPr>
+          <w:p>
+            <w:r>
+              <w:t>6151941887739ff6be46a24e7493fd2f09a22ba3</w:t>
+            </w:r>
+          </w:p>
+        </w:tc>
+        <w:tc>
+          <w:tcPr>
+            <w:tcW w:type="dxa" w:w="2016"/>
+          </w:tcPr>
+          <w:p>
+            <w:r>
+              <w:t>Use this commit or a later clean commit as the basis for any v0.1.1 release.</w:t>
+            </w:r>
+          </w:p>
+        </w:tc>
+        <w:tc>
+          <w:tcPr>
+            <w:tcW w:type="dxa" w:w="2016"/>
+          </w:tcPr>
+          <w:p>
+            <w:r>
+              <w:t>43 commits after v0.1.0.</w:t>
+            </w:r>
+          </w:p>
+        </w:tc>
+      </w:tr>
+      <w:tr>
+        <w:tc>
+          <w:tcPr>
+            <w:tcW w:type="dxa" w:w="2016"/>
+          </w:tcPr>
+          <w:p>
+            <w:r>
+              <w:t>worktree_cleanliness</w:t>
+            </w:r>
+          </w:p>
+        </w:tc>
+        <w:tc>
+          <w:tcPr>
+            <w:tcW w:type="dxa" w:w="2016"/>
+          </w:tcPr>
+          <w:p>
+            <w:r>
+              <w:t>dirty</w:t>
+            </w:r>
+          </w:p>
+        </w:tc>
+        <w:tc>
+          <w:tcPr>
+            <w:tcW w:type="dxa" w:w="2016"/>
+          </w:tcPr>
+          <w:p>
+            <w:r>
+              <w:t>M Makefile&lt;br&gt; M README.md&lt;br&gt; M scripts/build_current_evidence_freeze.py&lt;br&gt; M scripts/build_external_review_docx.py&lt;br&gt; M scripts/build_project_gantt.py&lt;br&gt; M scripts/export_shared_project_info.py&lt;br&gt;?? docs/post_release_version_coverage_audit.md&lt;br&gt;?? scripts/build_post_release_version_coverage_audit.py</w:t>
+            </w:r>
+          </w:p>
+        </w:tc>
+        <w:tc>
+          <w:tcPr>
+            <w:tcW w:type="dxa" w:w="2016"/>
+          </w:tcPr>
+          <w:p>
+            <w:r>
+              <w:t>Commit or intentionally ignore all changes before release.</w:t>
+            </w:r>
+          </w:p>
+        </w:tc>
+        <w:tc>
+          <w:tcPr>
+            <w:tcW w:type="dxa" w:w="2016"/>
+          </w:tcPr>
+          <w:p>
+            <w:r>
+              <w:t>A clean worktree is required before tagging a new release.</w:t>
+            </w:r>
+          </w:p>
+        </w:tc>
+      </w:tr>
+      <w:tr>
+        <w:tc>
+          <w:tcPr>
+            <w:tcW w:type="dxa" w:w="2016"/>
+          </w:tcPr>
+          <w:p>
+            <w:r>
+              <w:t>manuscript_facing_delta</w:t>
+            </w:r>
+          </w:p>
+        </w:tc>
+        <w:tc>
+          <w:tcPr>
+            <w:tcW w:type="dxa" w:w="2016"/>
+          </w:tcPr>
+          <w:p>
+            <w:r>
+              <w:t>needs_new_release_if_submitted</w:t>
+            </w:r>
+          </w:p>
+        </w:tc>
+        <w:tc>
+          <w:tcPr>
+            <w:tcW w:type="dxa" w:w="2016"/>
+          </w:tcPr>
+          <w:p>
+            <w:r>
+              <w:t>243</w:t>
+            </w:r>
+          </w:p>
+        </w:tc>
+        <w:tc>
+          <w:tcPr>
+            <w:tcW w:type="dxa" w:w="2016"/>
+          </w:tcPr>
+          <w:p>
+            <w:r>
+              <w:t>Create v0.1.1 only after Figure 4 acknowledgement and final figure/source-data freeze if these post-release files are cited.</w:t>
+            </w:r>
+          </w:p>
+        </w:tc>
+        <w:tc>
+          <w:tcPr>
+            <w:tcW w:type="dxa" w:w="2016"/>
+          </w:tcPr>
+          <w:p>
+            <w:r>
+              <w:t>Manuscript-facing files changed after the archived v0.1.0 DOI.</w:t>
+            </w:r>
+          </w:p>
+        </w:tc>
+      </w:tr>
+      <w:tr>
+        <w:tc>
+          <w:tcPr>
+            <w:tcW w:type="dxa" w:w="2016"/>
+          </w:tcPr>
+          <w:p>
+            <w:r>
+              <w:t>figure_source_delta</w:t>
+            </w:r>
+          </w:p>
+        </w:tc>
+        <w:tc>
+          <w:tcPr>
+            <w:tcW w:type="dxa" w:w="2016"/>
+          </w:tcPr>
+          <w:p>
+            <w:r>
+              <w:t>changed</w:t>
+            </w:r>
+          </w:p>
+        </w:tc>
+        <w:tc>
+          <w:tcPr>
+            <w:tcW w:type="dxa" w:w="2016"/>
+          </w:tcPr>
+          <w:p>
+            <w:r>
+              <w:t>27</w:t>
+            </w:r>
+          </w:p>
+        </w:tc>
+        <w:tc>
+          <w:tcPr>
+            <w:tcW w:type="dxa" w:w="2016"/>
+          </w:tcPr>
+          <w:p>
+            <w:r>
+              <w:t>Ensure final figures and source data are included in the next release if used in submission.</w:t>
+            </w:r>
+          </w:p>
+        </w:tc>
+        <w:tc>
+          <w:tcPr>
+            <w:tcW w:type="dxa" w:w="2016"/>
+          </w:tcPr>
+          <w:p>
+            <w:r>
+              <w:t>Figure/source-data changes after v0.1.0 affect reproducibility coverage.</w:t>
+            </w:r>
+          </w:p>
+        </w:tc>
+      </w:tr>
+      <w:tr>
+        <w:tc>
+          <w:tcPr>
+            <w:tcW w:type="dxa" w:w="2016"/>
+          </w:tcPr>
+          <w:p>
+            <w:r>
+              <w:t>pipeline_code_delta</w:t>
+            </w:r>
+          </w:p>
+        </w:tc>
+        <w:tc>
+          <w:tcPr>
+            <w:tcW w:type="dxa" w:w="2016"/>
+          </w:tcPr>
+          <w:p>
+            <w:r>
+              <w:t>changed</w:t>
+            </w:r>
+          </w:p>
+        </w:tc>
+        <w:tc>
+          <w:tcPr>
+            <w:tcW w:type="dxa" w:w="2016"/>
+          </w:tcPr>
+          <w:p>
+            <w:r>
+              <w:t>48</w:t>
+            </w:r>
+          </w:p>
+        </w:tc>
+        <w:tc>
+          <w:tcPr>
+            <w:tcW w:type="dxa" w:w="2016"/>
+          </w:tcPr>
+          <w:p>
+            <w:r>
+              <w:t>Archive updated scripts/benchmarks in the same release as the submitted source data.</w:t>
+            </w:r>
+          </w:p>
+        </w:tc>
+        <w:tc>
+          <w:tcPr>
+            <w:tcW w:type="dxa" w:w="2016"/>
+          </w:tcPr>
+          <w:p>
+            <w:r>
+              <w:t>Code changes after v0.1.0 affect rerun parity.</w:t>
+            </w:r>
+          </w:p>
+        </w:tc>
+      </w:tr>
+      <w:tr>
+        <w:tc>
+          <w:tcPr>
+            <w:tcW w:type="dxa" w:w="2016"/>
+          </w:tcPr>
+          <w:p>
+            <w:r>
+              <w:t>release_recommendation</w:t>
+            </w:r>
+          </w:p>
+        </w:tc>
+        <w:tc>
+          <w:tcPr>
+            <w:tcW w:type="dxa" w:w="2016"/>
+          </w:tcPr>
+          <w:p>
+            <w:r>
+              <w:t>prepare_v0.1.1_after_author_ack</w:t>
+            </w:r>
+          </w:p>
+        </w:tc>
+        <w:tc>
+          <w:tcPr>
+            <w:tcW w:type="dxa" w:w="2016"/>
+          </w:tcPr>
+          <w:p>
+            <w:r>
+              <w:t>v0.1.1</w:t>
+            </w:r>
+          </w:p>
+        </w:tc>
+        <w:tc>
+          <w:tcPr>
+            <w:tcW w:type="dxa" w:w="2016"/>
+          </w:tcPr>
+          <w:p>
+            <w:r>
+              <w:t>Do not tag the new release until manual Figure 4 and author-declaration blockers are resolved.</w:t>
+            </w:r>
+          </w:p>
+        </w:tc>
+        <w:tc>
+          <w:tcPr>
+            <w:tcW w:type="dxa" w:w="2016"/>
+          </w:tcPr>
+          <w:p>
+            <w:r>
+              <w:t>The release refresh is a submission-readiness action, not a current scientific pass.</w:t>
+            </w:r>
+          </w:p>
+        </w:tc>
+      </w:tr>
+    </w:tbl>
+    <w:p>
+      <w:pPr>
+        <w:pStyle w:val="Heading2"/>
+      </w:pPr>
+      <w:r>
+        <w:t>Changed File Classes</w:t>
+      </w:r>
+    </w:p>
+    <w:tbl>
+      <w:tblPr>
+        <w:tblStyle w:val="TableGrid"/>
+        <w:tblW w:type="auto" w:w="0"/>
+        <w:tblLook w:firstColumn="1" w:firstRow="1" w:lastColumn="0" w:lastRow="0" w:noHBand="0" w:noVBand="1" w:val="04A0"/>
+      </w:tblPr>
+      <w:tblGrid>
+        <w:gridCol w:w="5040"/>
+        <w:gridCol w:w="5040"/>
+      </w:tblGrid>
+      <w:tr>
+        <w:tc>
+          <w:tcPr>
+            <w:tcW w:type="dxa" w:w="5040"/>
+          </w:tcPr>
+          <w:p>
+            <w:r>
+              <w:t>Class</w:t>
+            </w:r>
+          </w:p>
+        </w:tc>
+        <w:tc>
+          <w:tcPr>
+            <w:tcW w:type="dxa" w:w="5040"/>
+          </w:tcPr>
+          <w:p>
+            <w:r>
+              <w:t>Count</w:t>
+            </w:r>
+          </w:p>
+        </w:tc>
+      </w:tr>
+      <w:tr>
+        <w:tc>
+          <w:tcPr>
+            <w:tcW w:type="dxa" w:w="5040"/>
+          </w:tcPr>
+          <w:p>
+            <w:r>
+              <w:t>ablation_result</w:t>
+            </w:r>
+          </w:p>
+        </w:tc>
+        <w:tc>
+          <w:tcPr>
+            <w:tcW w:type="dxa" w:w="5040"/>
+          </w:tcPr>
+          <w:p>
+            <w:r>
+              <w:t>5</w:t>
+            </w:r>
+          </w:p>
+        </w:tc>
+      </w:tr>
+      <w:tr>
+        <w:tc>
+          <w:tcPr>
+            <w:tcW w:type="dxa" w:w="5040"/>
+          </w:tcPr>
+          <w:p>
+            <w:r>
+              <w:t>benchmark_code</w:t>
+            </w:r>
+          </w:p>
+        </w:tc>
+        <w:tc>
+          <w:tcPr>
+            <w:tcW w:type="dxa" w:w="5040"/>
+          </w:tcPr>
+          <w:p>
+            <w:r>
+              <w:t>4</w:t>
+            </w:r>
+          </w:p>
+        </w:tc>
+      </w:tr>
+      <w:tr>
+        <w:tc>
+          <w:tcPr>
+            <w:tcW w:type="dxa" w:w="5040"/>
+          </w:tcPr>
+          <w:p>
+            <w:r>
+              <w:t>calibration_figure</w:t>
+            </w:r>
+          </w:p>
+        </w:tc>
+        <w:tc>
+          <w:tcPr>
+            <w:tcW w:type="dxa" w:w="5040"/>
+          </w:tcPr>
+          <w:p>
+            <w:r>
+              <w:t>3</w:t>
+            </w:r>
+          </w:p>
+        </w:tc>
+      </w:tr>
+      <w:tr>
+        <w:tc>
+          <w:tcPr>
+            <w:tcW w:type="dxa" w:w="5040"/>
+          </w:tcPr>
+          <w:p>
+            <w:r>
+              <w:t>calibration_result</w:t>
+            </w:r>
+          </w:p>
+        </w:tc>
+        <w:tc>
+          <w:tcPr>
+            <w:tcW w:type="dxa" w:w="5040"/>
+          </w:tcPr>
+          <w:p>
+            <w:r>
+              <w:t>5</w:t>
+            </w:r>
+          </w:p>
+        </w:tc>
+      </w:tr>
+      <w:tr>
+        <w:tc>
+          <w:tcPr>
+            <w:tcW w:type="dxa" w:w="5040"/>
+          </w:tcPr>
+          <w:p>
+            <w:r>
+              <w:t>competitor_result</w:t>
+            </w:r>
+          </w:p>
+        </w:tc>
+        <w:tc>
+          <w:tcPr>
+            <w:tcW w:type="dxa" w:w="5040"/>
+          </w:tcPr>
+          <w:p>
+            <w:r>
+              <w:t>26</w:t>
+            </w:r>
+          </w:p>
+        </w:tc>
+      </w:tr>
+      <w:tr>
+        <w:tc>
+          <w:tcPr>
+            <w:tcW w:type="dxa" w:w="5040"/>
+          </w:tcPr>
+          <w:p>
+            <w:r>
+              <w:t>figure_source_data</w:t>
+            </w:r>
+          </w:p>
+        </w:tc>
+        <w:tc>
+          <w:tcPr>
+            <w:tcW w:type="dxa" w:w="5040"/>
+          </w:tcPr>
+          <w:p>
+            <w:r>
+              <w:t>6</w:t>
+            </w:r>
+          </w:p>
+        </w:tc>
+      </w:tr>
+      <w:tr>
+        <w:tc>
+          <w:tcPr>
+            <w:tcW w:type="dxa" w:w="5040"/>
+          </w:tcPr>
+          <w:p>
+            <w:r>
+              <w:t>handoff_document</w:t>
+            </w:r>
+          </w:p>
+        </w:tc>
+        <w:tc>
+          <w:tcPr>
+            <w:tcW w:type="dxa" w:w="5040"/>
+          </w:tcPr>
+          <w:p>
+            <w:r>
+              <w:t>3</w:t>
+            </w:r>
+          </w:p>
+        </w:tc>
+      </w:tr>
+      <w:tr>
+        <w:tc>
+          <w:tcPr>
+            <w:tcW w:type="dxa" w:w="5040"/>
+          </w:tcPr>
+          <w:p>
+            <w:r>
+              <w:t>handoff_email</w:t>
+            </w:r>
+          </w:p>
+        </w:tc>
+        <w:tc>
+          <w:tcPr>
+            <w:tcW w:type="dxa" w:w="5040"/>
+          </w:tcPr>
+          <w:p>
+            <w:r>
+              <w:t>3</w:t>
+            </w:r>
+          </w:p>
+        </w:tc>
+      </w:tr>
+      <w:tr>
+        <w:tc>
+          <w:tcPr>
+            <w:tcW w:type="dxa" w:w="5040"/>
+          </w:tcPr>
+          <w:p>
+            <w:r>
+              <w:t>journal_figure</w:t>
+            </w:r>
+          </w:p>
+        </w:tc>
+        <w:tc>
+          <w:tcPr>
+            <w:tcW w:type="dxa" w:w="5040"/>
+          </w:tcPr>
+          <w:p>
+            <w:r>
+              <w:t>18</w:t>
+            </w:r>
+          </w:p>
+        </w:tc>
+      </w:tr>
+      <w:tr>
+        <w:tc>
+          <w:tcPr>
+            <w:tcW w:type="dxa" w:w="5040"/>
+          </w:tcPr>
+          <w:p>
+            <w:r>
+              <w:t>manuscript_text</w:t>
+            </w:r>
+          </w:p>
+        </w:tc>
+        <w:tc>
+          <w:tcPr>
+            <w:tcW w:type="dxa" w:w="5040"/>
+          </w:tcPr>
+          <w:p>
+            <w:r>
+              <w:t>16</w:t>
+            </w:r>
+          </w:p>
+        </w:tc>
+      </w:tr>
+      <w:tr>
+        <w:tc>
+          <w:tcPr>
+            <w:tcW w:type="dxa" w:w="5040"/>
+          </w:tcPr>
+          <w:p>
+            <w:r>
+              <w:t>metadata</w:t>
+            </w:r>
+          </w:p>
+        </w:tc>
+        <w:tc>
+          <w:tcPr>
+            <w:tcW w:type="dxa" w:w="5040"/>
+          </w:tcPr>
+          <w:p>
+            <w:r>
+              <w:t>4</w:t>
+            </w:r>
+          </w:p>
+        </w:tc>
+      </w:tr>
+      <w:tr>
+        <w:tc>
+          <w:tcPr>
+            <w:tcW w:type="dxa" w:w="5040"/>
+          </w:tcPr>
+          <w:p>
+            <w:r>
+              <w:t>other</w:t>
+            </w:r>
+          </w:p>
+        </w:tc>
+        <w:tc>
+          <w:tcPr>
+            <w:tcW w:type="dxa" w:w="5040"/>
+          </w:tcPr>
+          <w:p>
+            <w:r>
+              <w:t>9</w:t>
+            </w:r>
+          </w:p>
+        </w:tc>
+      </w:tr>
+      <w:tr>
+        <w:tc>
+          <w:tcPr>
+            <w:tcW w:type="dxa" w:w="5040"/>
+          </w:tcPr>
+          <w:p>
+            <w:r>
+              <w:t>pdac_result</w:t>
+            </w:r>
+          </w:p>
+        </w:tc>
+        <w:tc>
+          <w:tcPr>
+            <w:tcW w:type="dxa" w:w="5040"/>
+          </w:tcPr>
+          <w:p>
+            <w:r>
+              <w:t>10</w:t>
+            </w:r>
+          </w:p>
+        </w:tc>
+      </w:tr>
+      <w:tr>
+        <w:tc>
+          <w:tcPr>
+            <w:tcW w:type="dxa" w:w="5040"/>
+          </w:tcPr>
+          <w:p>
+            <w:r>
+              <w:t>pipeline_code</w:t>
+            </w:r>
+          </w:p>
+        </w:tc>
+        <w:tc>
+          <w:tcPr>
+            <w:tcW w:type="dxa" w:w="5040"/>
+          </w:tcPr>
+          <w:p>
+            <w:r>
+              <w:t>44</w:t>
+            </w:r>
+          </w:p>
+        </w:tc>
+      </w:tr>
+      <w:tr>
+        <w:tc>
+          <w:tcPr>
+            <w:tcW w:type="dxa" w:w="5040"/>
+          </w:tcPr>
+          <w:p>
+            <w:r>
+              <w:t>release_metadata</w:t>
+            </w:r>
+          </w:p>
+        </w:tc>
+        <w:tc>
+          <w:tcPr>
+            <w:tcW w:type="dxa" w:w="5040"/>
+          </w:tcPr>
+          <w:p>
+            <w:r>
+              <w:t>2</w:t>
+            </w:r>
+          </w:p>
+        </w:tc>
+      </w:tr>
+      <w:tr>
+        <w:tc>
+          <w:tcPr>
+            <w:tcW w:type="dxa" w:w="5040"/>
+          </w:tcPr>
+          <w:p>
+            <w:r>
+              <w:t>repository_doc</w:t>
+            </w:r>
+          </w:p>
+        </w:tc>
+        <w:tc>
+          <w:tcPr>
+            <w:tcW w:type="dxa" w:w="5040"/>
+          </w:tcPr>
+          <w:p>
+            <w:r>
+              <w:t>1</w:t>
+            </w:r>
+          </w:p>
+        </w:tc>
+      </w:tr>
+      <w:tr>
+        <w:tc>
+          <w:tcPr>
+            <w:tcW w:type="dxa" w:w="5040"/>
+          </w:tcPr>
+          <w:p>
+            <w:r>
+              <w:t>reproducibility_entrypoint</w:t>
+            </w:r>
+          </w:p>
+        </w:tc>
+        <w:tc>
+          <w:tcPr>
+            <w:tcW w:type="dxa" w:w="5040"/>
+          </w:tcPr>
+          <w:p>
+            <w:r>
+              <w:t>1</w:t>
+            </w:r>
+          </w:p>
+        </w:tc>
+      </w:tr>
+      <w:tr>
+        <w:tc>
+          <w:tcPr>
+            <w:tcW w:type="dxa" w:w="5040"/>
+          </w:tcPr>
+          <w:p>
+            <w:r>
+              <w:t>shared_export</w:t>
+            </w:r>
+          </w:p>
+        </w:tc>
+        <w:tc>
+          <w:tcPr>
+            <w:tcW w:type="dxa" w:w="5040"/>
+          </w:tcPr>
+          <w:p>
+            <w:r>
+              <w:t>1</w:t>
+            </w:r>
+          </w:p>
+        </w:tc>
+      </w:tr>
+      <w:tr>
+        <w:tc>
+          <w:tcPr>
+            <w:tcW w:type="dxa" w:w="5040"/>
+          </w:tcPr>
+          <w:p>
+            <w:r>
+              <w:t>submission_doc</w:t>
+            </w:r>
+          </w:p>
+        </w:tc>
+        <w:tc>
+          <w:tcPr>
+            <w:tcW w:type="dxa" w:w="5040"/>
+          </w:tcPr>
+          <w:p>
+            <w:r>
+              <w:t>51</w:t>
+            </w:r>
+          </w:p>
+        </w:tc>
+      </w:tr>
+      <w:tr>
+        <w:tc>
+          <w:tcPr>
+            <w:tcW w:type="dxa" w:w="5040"/>
+          </w:tcPr>
+          <w:p>
+            <w:r>
+              <w:t>submission_table</w:t>
+            </w:r>
+          </w:p>
+        </w:tc>
+        <w:tc>
+          <w:tcPr>
+            <w:tcW w:type="dxa" w:w="5040"/>
+          </w:tcPr>
+          <w:p>
+            <w:r>
+              <w:t>35</w:t>
+            </w:r>
+          </w:p>
+        </w:tc>
+      </w:tr>
+      <w:tr>
+        <w:tc>
+          <w:tcPr>
+            <w:tcW w:type="dxa" w:w="5040"/>
+          </w:tcPr>
+          <w:p>
+            <w:r>
+              <w:t>topology_result</w:t>
+            </w:r>
+          </w:p>
+        </w:tc>
+        <w:tc>
+          <w:tcPr>
+            <w:tcW w:type="dxa" w:w="5040"/>
+          </w:tcPr>
+          <w:p>
+            <w:r>
+              <w:t>6</w:t>
+            </w:r>
+          </w:p>
+        </w:tc>
+      </w:tr>
+    </w:tbl>
+    <w:p>
+      <w:pPr>
+        <w:pStyle w:val="Heading2"/>
+      </w:pPr>
+      <w:r>
+        <w:t>Change Status Counts</w:t>
+      </w:r>
+    </w:p>
+    <w:tbl>
+      <w:tblPr>
+        <w:tblStyle w:val="TableGrid"/>
+        <w:tblW w:type="auto" w:w="0"/>
+        <w:tblLook w:firstColumn="1" w:firstRow="1" w:lastColumn="0" w:lastRow="0" w:noHBand="0" w:noVBand="1" w:val="04A0"/>
+      </w:tblPr>
+      <w:tblGrid>
+        <w:gridCol w:w="5040"/>
+        <w:gridCol w:w="5040"/>
+      </w:tblGrid>
+      <w:tr>
+        <w:tc>
+          <w:tcPr>
+            <w:tcW w:type="dxa" w:w="5040"/>
+          </w:tcPr>
+          <w:p>
+            <w:r>
+              <w:t>Git status</w:t>
+            </w:r>
+          </w:p>
+        </w:tc>
+        <w:tc>
+          <w:tcPr>
+            <w:tcW w:type="dxa" w:w="5040"/>
+          </w:tcPr>
+          <w:p>
+            <w:r>
+              <w:t>Count</w:t>
+            </w:r>
+          </w:p>
+        </w:tc>
+      </w:tr>
+      <w:tr>
+        <w:tc>
+          <w:tcPr>
+            <w:tcW w:type="dxa" w:w="5040"/>
+          </w:tcPr>
+          <w:p>
+            <w:r>
+              <w:t>A</w:t>
+            </w:r>
+          </w:p>
+        </w:tc>
+        <w:tc>
+          <w:tcPr>
+            <w:tcW w:type="dxa" w:w="5040"/>
+          </w:tcPr>
+          <w:p>
+            <w:r>
+              <w:t>211</w:t>
+            </w:r>
+          </w:p>
+        </w:tc>
+      </w:tr>
+      <w:tr>
+        <w:tc>
+          <w:tcPr>
+            <w:tcW w:type="dxa" w:w="5040"/>
+          </w:tcPr>
+          <w:p>
+            <w:r>
+              <w:t>M</w:t>
+            </w:r>
+          </w:p>
+        </w:tc>
+        <w:tc>
+          <w:tcPr>
+            <w:tcW w:type="dxa" w:w="5040"/>
+          </w:tcPr>
+          <w:p>
+            <w:r>
+              <w:t>42</w:t>
+            </w:r>
+          </w:p>
+        </w:tc>
+      </w:tr>
+    </w:tbl>
+    <w:p>
+      <w:pPr>
+        <w:pStyle w:val="Heading2"/>
+      </w:pPr>
+      <w:r>
+        <w:t>Example Manuscript-facing Changed Files</w:t>
+      </w:r>
+    </w:p>
+    <w:tbl>
+      <w:tblPr>
+        <w:tblStyle w:val="TableGrid"/>
+        <w:tblW w:type="auto" w:w="0"/>
+        <w:tblLook w:firstColumn="1" w:firstRow="1" w:lastColumn="0" w:lastRow="0" w:noHBand="0" w:noVBand="1" w:val="04A0"/>
+      </w:tblPr>
+      <w:tblGrid>
+        <w:gridCol w:w="3360"/>
+        <w:gridCol w:w="3360"/>
+        <w:gridCol w:w="3360"/>
+      </w:tblGrid>
+      <w:tr>
+        <w:tc>
+          <w:tcPr>
+            <w:tcW w:type="dxa" w:w="3360"/>
+          </w:tcPr>
+          <w:p>
+            <w:r>
+              <w:t>Status</w:t>
+            </w:r>
+          </w:p>
+        </w:tc>
+        <w:tc>
+          <w:tcPr>
+            <w:tcW w:type="dxa" w:w="3360"/>
+          </w:tcPr>
+          <w:p>
+            <w:r>
+              <w:t>Class</w:t>
+            </w:r>
+          </w:p>
+        </w:tc>
+        <w:tc>
+          <w:tcPr>
+            <w:tcW w:type="dxa" w:w="3360"/>
+          </w:tcPr>
+          <w:p>
+            <w:r>
+              <w:t>Path</w:t>
+            </w:r>
+          </w:p>
+        </w:tc>
+      </w:tr>
+      <w:tr>
+        <w:tc>
+          <w:tcPr>
+            <w:tcW w:type="dxa" w:w="3360"/>
+          </w:tcPr>
+          <w:p>
+            <w:r>
+              <w:t>M</w:t>
+            </w:r>
+          </w:p>
+        </w:tc>
+        <w:tc>
+          <w:tcPr>
+            <w:tcW w:type="dxa" w:w="3360"/>
+          </w:tcPr>
+          <w:p>
+            <w:r>
+              <w:t>release_metadata</w:t>
+            </w:r>
+          </w:p>
+        </w:tc>
+        <w:tc>
+          <w:tcPr>
+            <w:tcW w:type="dxa" w:w="3360"/>
+          </w:tcPr>
+          <w:p>
+            <w:r>
+              <w:t>.zenodo.json</w:t>
+            </w:r>
+          </w:p>
+        </w:tc>
+      </w:tr>
+      <w:tr>
+        <w:tc>
+          <w:tcPr>
+            <w:tcW w:type="dxa" w:w="3360"/>
+          </w:tcPr>
+          <w:p>
+            <w:r>
+              <w:t>M</w:t>
+            </w:r>
+          </w:p>
+        </w:tc>
+        <w:tc>
+          <w:tcPr>
+            <w:tcW w:type="dxa" w:w="3360"/>
+          </w:tcPr>
+          <w:p>
+            <w:r>
+              <w:t>release_metadata</w:t>
+            </w:r>
+          </w:p>
+        </w:tc>
+        <w:tc>
+          <w:tcPr>
+            <w:tcW w:type="dxa" w:w="3360"/>
+          </w:tcPr>
+          <w:p>
+            <w:r>
+              <w:t>CITATION.cff</w:t>
+            </w:r>
+          </w:p>
+        </w:tc>
+      </w:tr>
+      <w:tr>
+        <w:tc>
+          <w:tcPr>
+            <w:tcW w:type="dxa" w:w="3360"/>
+          </w:tcPr>
+          <w:p>
+            <w:r>
+              <w:t>M</w:t>
+            </w:r>
+          </w:p>
+        </w:tc>
+        <w:tc>
+          <w:tcPr>
+            <w:tcW w:type="dxa" w:w="3360"/>
+          </w:tcPr>
+          <w:p>
+            <w:r>
+              <w:t>reproducibility_entrypoint</w:t>
+            </w:r>
+          </w:p>
+        </w:tc>
+        <w:tc>
+          <w:tcPr>
+            <w:tcW w:type="dxa" w:w="3360"/>
+          </w:tcPr>
+          <w:p>
+            <w:r>
+              <w:t>Makefile</w:t>
+            </w:r>
+          </w:p>
+        </w:tc>
+      </w:tr>
+      <w:tr>
+        <w:tc>
+          <w:tcPr>
+            <w:tcW w:type="dxa" w:w="3360"/>
+          </w:tcPr>
+          <w:p>
+            <w:r>
+              <w:t>M</w:t>
+            </w:r>
+          </w:p>
+        </w:tc>
+        <w:tc>
+          <w:tcPr>
+            <w:tcW w:type="dxa" w:w="3360"/>
+          </w:tcPr>
+          <w:p>
+            <w:r>
+              <w:t>repository_doc</w:t>
+            </w:r>
+          </w:p>
+        </w:tc>
+        <w:tc>
+          <w:tcPr>
+            <w:tcW w:type="dxa" w:w="3360"/>
+          </w:tcPr>
+          <w:p>
+            <w:r>
+              <w:t>README.md</w:t>
+            </w:r>
+          </w:p>
+        </w:tc>
+      </w:tr>
+      <w:tr>
+        <w:tc>
+          <w:tcPr>
+            <w:tcW w:type="dxa" w:w="3360"/>
+          </w:tcPr>
+          <w:p>
+            <w:r>
+              <w:t>A</w:t>
+            </w:r>
+          </w:p>
+        </w:tc>
+        <w:tc>
+          <w:tcPr>
+            <w:tcW w:type="dxa" w:w="3360"/>
+          </w:tcPr>
+          <w:p>
+            <w:r>
+              <w:t>benchmark_code</w:t>
+            </w:r>
+          </w:p>
+        </w:tc>
+        <w:tc>
+          <w:tcPr>
+            <w:tcW w:type="dxa" w:w="3360"/>
+          </w:tcPr>
+          <w:p>
+            <w:r>
+              <w:t>benchmarks/run_realdata_topology_benchmark.py</w:t>
+            </w:r>
+          </w:p>
+        </w:tc>
+      </w:tr>
+      <w:tr>
+        <w:tc>
+          <w:tcPr>
+            <w:tcW w:type="dxa" w:w="3360"/>
+          </w:tcPr>
+          <w:p>
+            <w:r>
+              <w:t>A</w:t>
+            </w:r>
+          </w:p>
+        </w:tc>
+        <w:tc>
+          <w:tcPr>
+            <w:tcW w:type="dxa" w:w="3360"/>
+          </w:tcPr>
+          <w:p>
+            <w:r>
+              <w:t>benchmark_code</w:t>
+            </w:r>
+          </w:p>
+        </w:tc>
+        <w:tc>
+          <w:tcPr>
+            <w:tcW w:type="dxa" w:w="3360"/>
+          </w:tcPr>
+          <w:p>
+            <w:r>
+              <w:t>benchmarks/run_sclens_h5ad_smoke.py</w:t>
+            </w:r>
+          </w:p>
+        </w:tc>
+      </w:tr>
+      <w:tr>
+        <w:tc>
+          <w:tcPr>
+            <w:tcW w:type="dxa" w:w="3360"/>
+          </w:tcPr>
+          <w:p>
+            <w:r>
+              <w:t>A</w:t>
+            </w:r>
+          </w:p>
+        </w:tc>
+        <w:tc>
+          <w:tcPr>
+            <w:tcW w:type="dxa" w:w="3360"/>
+          </w:tcPr>
+          <w:p>
+            <w:r>
+              <w:t>benchmark_code</w:t>
+            </w:r>
+          </w:p>
+        </w:tc>
+        <w:tc>
+          <w:tcPr>
+            <w:tcW w:type="dxa" w:w="3360"/>
+          </w:tcPr>
+          <w:p>
+            <w:r>
+              <w:t>benchmarks/run_sclens_stability_benchmark.py</w:t>
+            </w:r>
+          </w:p>
+        </w:tc>
+      </w:tr>
+      <w:tr>
+        <w:tc>
+          <w:tcPr>
+            <w:tcW w:type="dxa" w:w="3360"/>
+          </w:tcPr>
+          <w:p>
+            <w:r>
+              <w:t>A</w:t>
+            </w:r>
+          </w:p>
+        </w:tc>
+        <w:tc>
+          <w:tcPr>
+            <w:tcW w:type="dxa" w:w="3360"/>
+          </w:tcPr>
+          <w:p>
+            <w:r>
+              <w:t>benchmark_code</w:t>
+            </w:r>
+          </w:p>
+        </w:tc>
+        <w:tc>
+          <w:tcPr>
+            <w:tcW w:type="dxa" w:w="3360"/>
+          </w:tcPr>
+          <w:p>
+            <w:r>
+              <w:t>benchmarks/run_topology_stress_benchmark.py</w:t>
+            </w:r>
+          </w:p>
+        </w:tc>
+      </w:tr>
+      <w:tr>
+        <w:tc>
+          <w:tcPr>
+            <w:tcW w:type="dxa" w:w="3360"/>
+          </w:tcPr>
+          <w:p>
+            <w:r>
+              <w:t>A</w:t>
+            </w:r>
+          </w:p>
+        </w:tc>
+        <w:tc>
+          <w:tcPr>
+            <w:tcW w:type="dxa" w:w="3360"/>
+          </w:tcPr>
+          <w:p>
+            <w:r>
+              <w:t>submission_doc</w:t>
+            </w:r>
+          </w:p>
+        </w:tc>
+        <w:tc>
+          <w:tcPr>
+            <w:tcW w:type="dxa" w:w="3360"/>
+          </w:tcPr>
+          <w:p>
+            <w:r>
+              <w:t>docs/added_dataset_annotation_boundary.md</w:t>
+            </w:r>
+          </w:p>
+        </w:tc>
+      </w:tr>
+      <w:tr>
+        <w:tc>
+          <w:tcPr>
+            <w:tcW w:type="dxa" w:w="3360"/>
+          </w:tcPr>
+          <w:p>
+            <w:r>
+              <w:t>M</w:t>
+            </w:r>
+          </w:p>
+        </w:tc>
+        <w:tc>
+          <w:tcPr>
+            <w:tcW w:type="dxa" w:w="3360"/>
+          </w:tcPr>
+          <w:p>
+            <w:r>
+              <w:t>submission_doc</w:t>
+            </w:r>
+          </w:p>
+        </w:tc>
+        <w:tc>
+          <w:tcPr>
+            <w:tcW w:type="dxa" w:w="3360"/>
+          </w:tcPr>
+          <w:p>
+            <w:r>
+              <w:t>docs/author_declarations_and_credit_roles.md</w:t>
+            </w:r>
+          </w:p>
+        </w:tc>
+      </w:tr>
+      <w:tr>
+        <w:tc>
+          <w:tcPr>
+            <w:tcW w:type="dxa" w:w="3360"/>
+          </w:tcPr>
+          <w:p>
+            <w:r>
+              <w:t>M</w:t>
+            </w:r>
+          </w:p>
+        </w:tc>
+        <w:tc>
+          <w:tcPr>
+            <w:tcW w:type="dxa" w:w="3360"/>
+          </w:tcPr>
+          <w:p>
+            <w:r>
+              <w:t>submission_doc</w:t>
+            </w:r>
+          </w:p>
+        </w:tc>
+        <w:tc>
+          <w:tcPr>
+            <w:tcW w:type="dxa" w:w="3360"/>
+          </w:tcPr>
+          <w:p>
+            <w:r>
+              <w:t>docs/author_metadata_status.md</w:t>
+            </w:r>
+          </w:p>
+        </w:tc>
+      </w:tr>
+      <w:tr>
+        <w:tc>
+          <w:tcPr>
+            <w:tcW w:type="dxa" w:w="3360"/>
+          </w:tcPr>
+          <w:p>
+            <w:r>
+              <w:t>M</w:t>
+            </w:r>
+          </w:p>
+        </w:tc>
+        <w:tc>
+          <w:tcPr>
+            <w:tcW w:type="dxa" w:w="3360"/>
+          </w:tcPr>
+          <w:p>
+            <w:r>
+              <w:t>submission_doc</w:t>
+            </w:r>
+          </w:p>
+        </w:tc>
+        <w:tc>
+          <w:tcPr>
+            <w:tcW w:type="dxa" w:w="3360"/>
+          </w:tcPr>
+          <w:p>
+            <w:r>
+              <w:t>docs/author_release_execution_packet.md</w:t>
+            </w:r>
+          </w:p>
+        </w:tc>
+      </w:tr>
+      <w:tr>
+        <w:tc>
+          <w:tcPr>
+            <w:tcW w:type="dxa" w:w="3360"/>
+          </w:tcPr>
+          <w:p>
+            <w:r>
+              <w:t>A</w:t>
+            </w:r>
+          </w:p>
+        </w:tc>
+        <w:tc>
+          <w:tcPr>
+            <w:tcW w:type="dxa" w:w="3360"/>
+          </w:tcPr>
+          <w:p>
+            <w:r>
+              <w:t>submission_doc</w:t>
+            </w:r>
+          </w:p>
+        </w:tc>
+        <w:tc>
+          <w:tcPr>
+            <w:tcW w:type="dxa" w:w="3360"/>
+          </w:tcPr>
+          <w:p>
+            <w:r>
+              <w:t>docs/benchmark_upgrade_from_concord_sclens_2026-05-12.md</w:t>
+            </w:r>
+          </w:p>
+        </w:tc>
+      </w:tr>
+      <w:tr>
+        <w:tc>
+          <w:tcPr>
+            <w:tcW w:type="dxa" w:w="3360"/>
+          </w:tcPr>
+          <w:p>
+            <w:r>
+              <w:t>M</w:t>
+            </w:r>
+          </w:p>
+        </w:tc>
+        <w:tc>
+          <w:tcPr>
+            <w:tcW w:type="dxa" w:w="3360"/>
+          </w:tcPr>
+          <w:p>
+            <w:r>
+              <w:t>submission_doc</w:t>
+            </w:r>
+          </w:p>
+        </w:tc>
+        <w:tc>
+          <w:tcPr>
+            <w:tcW w:type="dxa" w:w="3360"/>
+          </w:tcPr>
+          <w:p>
+            <w:r>
+              <w:t>docs/claim_boundary_lint.md</w:t>
+            </w:r>
+          </w:p>
+        </w:tc>
+      </w:tr>
+      <w:tr>
+        <w:tc>
+          <w:tcPr>
+            <w:tcW w:type="dxa" w:w="3360"/>
+          </w:tcPr>
+          <w:p>
+            <w:r>
+              <w:t>M</w:t>
+            </w:r>
+          </w:p>
+        </w:tc>
+        <w:tc>
+          <w:tcPr>
+            <w:tcW w:type="dxa" w:w="3360"/>
+          </w:tcPr>
+          <w:p>
+            <w:r>
+              <w:t>submission_doc</w:t>
+            </w:r>
+          </w:p>
+        </w:tc>
+        <w:tc>
+          <w:tcPr>
+            <w:tcW w:type="dxa" w:w="3360"/>
+          </w:tcPr>
+          <w:p>
+            <w:r>
+              <w:t>docs/claim_traceability.md</w:t>
+            </w:r>
+          </w:p>
+        </w:tc>
+      </w:tr>
+      <w:tr>
+        <w:tc>
+          <w:tcPr>
+            <w:tcW w:type="dxa" w:w="3360"/>
+          </w:tcPr>
+          <w:p>
+            <w:r>
+              <w:t>A</w:t>
+            </w:r>
+          </w:p>
+        </w:tc>
+        <w:tc>
+          <w:tcPr>
+            <w:tcW w:type="dxa" w:w="3360"/>
+          </w:tcPr>
+          <w:p>
+            <w:r>
+              <w:t>submission_doc</w:t>
+            </w:r>
+          </w:p>
+        </w:tc>
+        <w:tc>
+          <w:tcPr>
+            <w:tcW w:type="dxa" w:w="3360"/>
+          </w:tcPr>
+          <w:p>
+            <w:r>
+              <w:t>docs/competitor_positioning_concord_sclens_2026-05-12.md</w:t>
+            </w:r>
+          </w:p>
+        </w:tc>
+      </w:tr>
+      <w:tr>
+        <w:tc>
+          <w:tcPr>
+            <w:tcW w:type="dxa" w:w="3360"/>
+          </w:tcPr>
+          <w:p>
+            <w:r>
+              <w:t>M</w:t>
+            </w:r>
+          </w:p>
+        </w:tc>
+        <w:tc>
+          <w:tcPr>
+            <w:tcW w:type="dxa" w:w="3360"/>
+          </w:tcPr>
+          <w:p>
+            <w:r>
+              <w:t>submission_doc</w:t>
+            </w:r>
+          </w:p>
+        </w:tc>
+        <w:tc>
+          <w:tcPr>
+            <w:tcW w:type="dxa" w:w="3360"/>
+          </w:tcPr>
+          <w:p>
+            <w:r>
+              <w:t>docs/component_ablation_benchmark.md</w:t>
+            </w:r>
+          </w:p>
+        </w:tc>
+      </w:tr>
+      <w:tr>
+        <w:tc>
+          <w:tcPr>
+            <w:tcW w:type="dxa" w:w="3360"/>
+          </w:tcPr>
+          <w:p>
+            <w:r>
+              <w:t>A</w:t>
+            </w:r>
+          </w:p>
+        </w:tc>
+        <w:tc>
+          <w:tcPr>
+            <w:tcW w:type="dxa" w:w="3360"/>
+          </w:tcPr>
+          <w:p>
+            <w:r>
+              <w:t>submission_doc</w:t>
+            </w:r>
+          </w:p>
+        </w:tc>
+        <w:tc>
+          <w:tcPr>
+            <w:tcW w:type="dxa" w:w="3360"/>
+          </w:tcPr>
+          <w:p>
+            <w:r>
+              <w:t>docs/corresponding_author_proxy_assumption.md</w:t>
+            </w:r>
+          </w:p>
+        </w:tc>
+      </w:tr>
+      <w:tr>
+        <w:tc>
+          <w:tcPr>
+            <w:tcW w:type="dxa" w:w="3360"/>
+          </w:tcPr>
+          <w:p>
+            <w:r>
+              <w:t>A</w:t>
+            </w:r>
+          </w:p>
+        </w:tc>
+        <w:tc>
+          <w:tcPr>
+            <w:tcW w:type="dxa" w:w="3360"/>
+          </w:tcPr>
+          <w:p>
+            <w:r>
+              <w:t>submission_doc</w:t>
+            </w:r>
+          </w:p>
+        </w:tc>
+        <w:tc>
+          <w:tcPr>
+            <w:tcW w:type="dxa" w:w="3360"/>
+          </w:tcPr>
+          <w:p>
+            <w:r>
+              <w:t>docs/corresponding_author_reply_intake_runbook.md</w:t>
+            </w:r>
+          </w:p>
+        </w:tc>
+      </w:tr>
+      <w:tr>
+        <w:tc>
+          <w:tcPr>
+            <w:tcW w:type="dxa" w:w="3360"/>
+          </w:tcPr>
+          <w:p>
+            <w:r>
+              <w:t>A</w:t>
+            </w:r>
+          </w:p>
+        </w:tc>
+        <w:tc>
+          <w:tcPr>
+            <w:tcW w:type="dxa" w:w="3360"/>
+          </w:tcPr>
+          <w:p>
+            <w:r>
+              <w:t>submission_doc</w:t>
+            </w:r>
+          </w:p>
+        </w:tc>
+        <w:tc>
+          <w:tcPr>
+            <w:tcW w:type="dxa" w:w="3360"/>
+          </w:tcPr>
+          <w:p>
+            <w:r>
+              <w:t>docs/corresponding_author_signoff_tracker.md</w:t>
+            </w:r>
+          </w:p>
+        </w:tc>
+      </w:tr>
+      <w:tr>
+        <w:tc>
+          <w:tcPr>
+            <w:tcW w:type="dxa" w:w="3360"/>
+          </w:tcPr>
+          <w:p>
+            <w:r>
+              <w:t>A</w:t>
+            </w:r>
+          </w:p>
+        </w:tc>
+        <w:tc>
+          <w:tcPr>
+            <w:tcW w:type="dxa" w:w="3360"/>
+          </w:tcPr>
+          <w:p>
+            <w:r>
+              <w:t>submission_doc</w:t>
+            </w:r>
+          </w:p>
+        </w:tc>
+        <w:tc>
+          <w:tcPr>
+            <w:tcW w:type="dxa" w:w="3360"/>
+          </w:tcPr>
+          <w:p>
+            <w:r>
+              <w:t>docs/current_evidence_freeze_2026-05-12.md</w:t>
+            </w:r>
+          </w:p>
+        </w:tc>
+      </w:tr>
+      <w:tr>
+        <w:tc>
+          <w:tcPr>
+            <w:tcW w:type="dxa" w:w="3360"/>
+          </w:tcPr>
+          <w:p>
+            <w:r>
+              <w:t>M</w:t>
+            </w:r>
+          </w:p>
+        </w:tc>
+        <w:tc>
+          <w:tcPr>
+            <w:tcW w:type="dxa" w:w="3360"/>
+          </w:tcPr>
+          <w:p>
+            <w:r>
+              <w:t>submission_doc</w:t>
+            </w:r>
+          </w:p>
+        </w:tc>
+        <w:tc>
+          <w:tcPr>
+            <w:tcW w:type="dxa" w:w="3360"/>
+          </w:tcPr>
+          <w:p>
+            <w:r>
+              <w:t>docs/editorial_presubmission_packet.md</w:t>
+            </w:r>
+          </w:p>
+        </w:tc>
+      </w:tr>
+      <w:tr>
+        <w:tc>
+          <w:tcPr>
+            <w:tcW w:type="dxa" w:w="3360"/>
+          </w:tcPr>
+          <w:p>
+            <w:r>
+              <w:t>A</w:t>
+            </w:r>
+          </w:p>
+        </w:tc>
+        <w:tc>
+          <w:tcPr>
+            <w:tcW w:type="dxa" w:w="3360"/>
+          </w:tcPr>
+          <w:p>
+            <w:r>
+              <w:t>submission_doc</w:t>
+            </w:r>
+          </w:p>
+        </w:tc>
+        <w:tc>
+          <w:tcPr>
+            <w:tcW w:type="dxa" w:w="3360"/>
+          </w:tcPr>
+          <w:p>
+            <w:r>
+              <w:t>docs/figure4_pdac_tme_wording_freeze.md</w:t>
+            </w:r>
+          </w:p>
+        </w:tc>
+      </w:tr>
+      <w:tr>
+        <w:tc>
+          <w:tcPr>
+            <w:tcW w:type="dxa" w:w="3360"/>
+          </w:tcPr>
+          <w:p>
+            <w:r>
+              <w:t>A</w:t>
+            </w:r>
+          </w:p>
+        </w:tc>
+        <w:tc>
+          <w:tcPr>
+            <w:tcW w:type="dxa" w:w="3360"/>
+          </w:tcPr>
+          <w:p>
+            <w:r>
+              <w:t>submission_doc</w:t>
+            </w:r>
+          </w:p>
+        </w:tc>
+        <w:tc>
+          <w:tcPr>
+            <w:tcW w:type="dxa" w:w="3360"/>
+          </w:tcPr>
+          <w:p>
+            <w:r>
+              <w:t>docs/figure4_strengthened_text_audit.md</w:t>
+            </w:r>
+          </w:p>
+        </w:tc>
+      </w:tr>
+      <w:tr>
+        <w:tc>
+          <w:tcPr>
+            <w:tcW w:type="dxa" w:w="3360"/>
+          </w:tcPr>
+          <w:p>
+            <w:r>
+              <w:t>A</w:t>
+            </w:r>
+          </w:p>
+        </w:tc>
+        <w:tc>
+          <w:tcPr>
+            <w:tcW w:type="dxa" w:w="3360"/>
+          </w:tcPr>
+          <w:p>
+            <w:r>
+              <w:t>submission_doc</w:t>
+            </w:r>
+          </w:p>
+        </w:tc>
+        <w:tc>
+          <w:tcPr>
+            <w:tcW w:type="dxa" w:w="3360"/>
+          </w:tcPr>
+          <w:p>
+            <w:r>
+              <w:t>docs/figure_caption_source_audit.md</w:t>
+            </w:r>
+          </w:p>
+        </w:tc>
+      </w:tr>
+      <w:tr>
+        <w:tc>
+          <w:tcPr>
+            <w:tcW w:type="dxa" w:w="3360"/>
+          </w:tcPr>
+          <w:p>
+            <w:r>
+              <w:t>A</w:t>
+            </w:r>
+          </w:p>
+        </w:tc>
+        <w:tc>
+          <w:tcPr>
+            <w:tcW w:type="dxa" w:w="3360"/>
+          </w:tcPr>
+          <w:p>
+            <w:r>
+              <w:t>submission_doc</w:t>
+            </w:r>
+          </w:p>
+        </w:tc>
+        <w:tc>
+          <w:tcPr>
+            <w:tcW w:type="dxa" w:w="3360"/>
+          </w:tcPr>
+          <w:p>
+            <w:r>
+              <w:t>docs/genome_biology_fallback_v2_packet.md</w:t>
+            </w:r>
+          </w:p>
+        </w:tc>
+      </w:tr>
+      <w:tr>
+        <w:tc>
+          <w:tcPr>
+            <w:tcW w:type="dxa" w:w="3360"/>
+          </w:tcPr>
+          <w:p>
+            <w:r>
+              <w:t>M</w:t>
+            </w:r>
+          </w:p>
+        </w:tc>
+        <w:tc>
+          <w:tcPr>
+            <w:tcW w:type="dxa" w:w="3360"/>
+          </w:tcPr>
+          <w:p>
+            <w:r>
+              <w:t>submission_doc</w:t>
+            </w:r>
+          </w:p>
+        </w:tc>
+        <w:tc>
+          <w:tcPr>
+            <w:tcW w:type="dxa" w:w="3360"/>
+          </w:tcPr>
+          <w:p>
+            <w:r>
+              <w:t>docs/jif20_50_gap_assessment.md</w:t>
+            </w:r>
+          </w:p>
+        </w:tc>
+      </w:tr>
+      <w:tr>
+        <w:tc>
+          <w:tcPr>
+            <w:tcW w:type="dxa" w:w="3360"/>
+          </w:tcPr>
+          <w:p>
+            <w:r>
+              <w:t>M</w:t>
+            </w:r>
+          </w:p>
+        </w:tc>
+        <w:tc>
+          <w:tcPr>
+            <w:tcW w:type="dxa" w:w="3360"/>
+          </w:tcPr>
+          <w:p>
+            <w:r>
+              <w:t>submission_doc</w:t>
+            </w:r>
+          </w:p>
+        </w:tc>
+        <w:tc>
+          <w:tcPr>
+            <w:tcW w:type="dxa" w:w="3360"/>
+          </w:tcPr>
+          <w:p>
+            <w:r>
+              <w:t>docs/manual_author_execution_steps.md</w:t>
+            </w:r>
+          </w:p>
+        </w:tc>
+      </w:tr>
+      <w:tr>
+        <w:tc>
+          <w:tcPr>
+            <w:tcW w:type="dxa" w:w="3360"/>
+          </w:tcPr>
+          <w:p>
+            <w:r>
+              <w:t>A</w:t>
+            </w:r>
+          </w:p>
+        </w:tc>
+        <w:tc>
+          <w:tcPr>
+            <w:tcW w:type="dxa" w:w="3360"/>
+          </w:tcPr>
+          <w:p>
+            <w:r>
+              <w:t>submission_doc</w:t>
+            </w:r>
+          </w:p>
+        </w:tc>
+        <w:tc>
+          <w:tcPr>
+            <w:tcW w:type="dxa" w:w="3360"/>
+          </w:tcPr>
+          <w:p>
+            <w:r>
+              <w:t>docs/manual_next_actions_20_50.md</w:t>
+            </w:r>
+          </w:p>
+        </w:tc>
+      </w:tr>
+      <w:tr>
+        <w:tc>
+          <w:tcPr>
+            <w:tcW w:type="dxa" w:w="3360"/>
+          </w:tcPr>
+          <w:p>
+            <w:r>
+              <w:t>A</w:t>
+            </w:r>
+          </w:p>
+        </w:tc>
+        <w:tc>
+          <w:tcPr>
+            <w:tcW w:type="dxa" w:w="3360"/>
+          </w:tcPr>
+          <w:p>
+            <w:r>
+              <w:t>submission_doc</w:t>
+            </w:r>
+          </w:p>
+        </w:tc>
+        <w:tc>
+          <w:tcPr>
+            <w:tcW w:type="dxa" w:w="3360"/>
+          </w:tcPr>
+          <w:p>
+            <w:r>
+              <w:t>docs/manuscript_grade_null_power_grid_design.md</w:t>
+            </w:r>
+          </w:p>
+        </w:tc>
+      </w:tr>
+      <w:tr>
+        <w:tc>
+          <w:tcPr>
+            <w:tcW w:type="dxa" w:w="3360"/>
+          </w:tcPr>
+          <w:p>
+            <w:r>
+              <w:t>A</w:t>
+            </w:r>
+          </w:p>
+        </w:tc>
+        <w:tc>
+          <w:tcPr>
+            <w:tcW w:type="dxa" w:w="3360"/>
+          </w:tcPr>
+          <w:p>
+            <w:r>
+              <w:t>submission_doc</w:t>
+            </w:r>
+          </w:p>
+        </w:tc>
+        <w:tc>
+          <w:tcPr>
+            <w:tcW w:type="dxa" w:w="3360"/>
+          </w:tcPr>
+          <w:p>
+            <w:r>
+              <w:t>docs/mentor_journal_decision_2026-05-10.md</w:t>
+            </w:r>
+          </w:p>
+        </w:tc>
+      </w:tr>
+      <w:tr>
+        <w:tc>
+          <w:tcPr>
+            <w:tcW w:type="dxa" w:w="3360"/>
+          </w:tcPr>
+          <w:p>
+            <w:r>
+              <w:t>A</w:t>
+            </w:r>
+          </w:p>
+        </w:tc>
+        <w:tc>
+          <w:tcPr>
+            <w:tcW w:type="dxa" w:w="3360"/>
+          </w:tcPr>
+          <w:p>
+            <w:r>
+              <w:t>submission_doc</w:t>
+            </w:r>
+          </w:p>
+        </w:tc>
+        <w:tc>
+          <w:tcPr>
+            <w:tcW w:type="dxa" w:w="3360"/>
+          </w:tcPr>
+          <w:p>
+            <w:r>
+              <w:t>docs/nature_methods_48h_execution_packet.md</w:t>
+            </w:r>
+          </w:p>
+        </w:tc>
+      </w:tr>
+      <w:tr>
+        <w:tc>
+          <w:tcPr>
+            <w:tcW w:type="dxa" w:w="3360"/>
+          </w:tcPr>
+          <w:p>
+            <w:r>
+              <w:t>A</w:t>
+            </w:r>
+          </w:p>
+        </w:tc>
+        <w:tc>
+          <w:tcPr>
+            <w:tcW w:type="dxa" w:w="3360"/>
+          </w:tcPr>
+          <w:p>
+            <w:r>
+              <w:t>submission_doc</w:t>
+            </w:r>
+          </w:p>
+        </w:tc>
+        <w:tc>
+          <w:tcPr>
+            <w:tcW w:type="dxa" w:w="3360"/>
+          </w:tcPr>
+          <w:p>
+            <w:r>
+              <w:t>docs/nature_methods_go_no_go_final.md</w:t>
+            </w:r>
+          </w:p>
+        </w:tc>
+      </w:tr>
+      <w:tr>
+        <w:tc>
+          <w:tcPr>
+            <w:tcW w:type="dxa" w:w="3360"/>
+          </w:tcPr>
+          <w:p>
+            <w:r>
+              <w:t>A</w:t>
+            </w:r>
+          </w:p>
+        </w:tc>
+        <w:tc>
+          <w:tcPr>
+            <w:tcW w:type="dxa" w:w="3360"/>
+          </w:tcPr>
+          <w:p>
+            <w:r>
+              <w:t>submission_doc</w:t>
+            </w:r>
+          </w:p>
+        </w:tc>
+        <w:tc>
+          <w:tcPr>
+            <w:tcW w:type="dxa" w:w="3360"/>
+          </w:tcPr>
+          <w:p>
+            <w:r>
+              <w:t>docs/nature_methods_next_round_gate_board.md</w:t>
+            </w:r>
+          </w:p>
+        </w:tc>
+      </w:tr>
+      <w:tr>
+        <w:tc>
+          <w:tcPr>
+            <w:tcW w:type="dxa" w:w="3360"/>
+          </w:tcPr>
+          <w:p>
+            <w:r>
+              <w:t>A</w:t>
+            </w:r>
+          </w:p>
+        </w:tc>
+        <w:tc>
+          <w:tcPr>
+            <w:tcW w:type="dxa" w:w="3360"/>
+          </w:tcPr>
+          <w:p>
+            <w:r>
+              <w:t>submission_doc</w:t>
+            </w:r>
+          </w:p>
+        </w:tc>
+        <w:tc>
+          <w:tcPr>
+            <w:tcW w:type="dxa" w:w="3360"/>
+          </w:tcPr>
+          <w:p>
+            <w:r>
+              <w:t>docs/nature_methods_official_route_verification.md</w:t>
+            </w:r>
+          </w:p>
+        </w:tc>
+      </w:tr>
+      <w:tr>
+        <w:tc>
+          <w:tcPr>
+            <w:tcW w:type="dxa" w:w="3360"/>
+          </w:tcPr>
+          <w:p>
+            <w:r>
+              <w:t>A</w:t>
+            </w:r>
+          </w:p>
+        </w:tc>
+        <w:tc>
+          <w:tcPr>
+            <w:tcW w:type="dxa" w:w="3360"/>
+          </w:tcPr>
+          <w:p>
+            <w:r>
+              <w:t>submission_doc</w:t>
+            </w:r>
+          </w:p>
+        </w:tc>
+        <w:tc>
+          <w:tcPr>
+            <w:tcW w:type="dxa" w:w="3360"/>
+          </w:tcPr>
+          <w:p>
+            <w:r>
+              <w:t>docs/nature_methods_presubmission_send_runbook.md</w:t>
+            </w:r>
+          </w:p>
+        </w:tc>
+      </w:tr>
+      <w:tr>
+        <w:tc>
+          <w:tcPr>
+            <w:tcW w:type="dxa" w:w="3360"/>
+          </w:tcPr>
+          <w:p>
+            <w:r>
+              <w:t>M</w:t>
+            </w:r>
+          </w:p>
+        </w:tc>
+        <w:tc>
+          <w:tcPr>
+            <w:tcW w:type="dxa" w:w="3360"/>
+          </w:tcPr>
+          <w:p>
+            <w:r>
+              <w:t>submission_doc</w:t>
+            </w:r>
+          </w:p>
+        </w:tc>
+        <w:tc>
+          <w:tcPr>
+            <w:tcW w:type="dxa" w:w="3360"/>
+          </w:tcPr>
+          <w:p>
+            <w:r>
+              <w:t>docs/nature_reporting_summary_draft.md</w:t>
+            </w:r>
+          </w:p>
+        </w:tc>
+      </w:tr>
+      <w:tr>
+        <w:tc>
+          <w:tcPr>
+            <w:tcW w:type="dxa" w:w="3360"/>
+          </w:tcPr>
+          <w:p>
+            <w:r>
+              <w:t>M</w:t>
+            </w:r>
+          </w:p>
+        </w:tc>
+        <w:tc>
+          <w:tcPr>
+            <w:tcW w:type="dxa" w:w="3360"/>
+          </w:tcPr>
+          <w:p>
+            <w:r>
+              <w:t>submission_doc</w:t>
+            </w:r>
+          </w:p>
+        </w:tc>
+        <w:tc>
+          <w:tcPr>
+            <w:tcW w:type="dxa" w:w="3360"/>
+          </w:tcPr>
+          <w:p>
+            <w:r>
+              <w:t>docs/no_call_decision_map.md</w:t>
+            </w:r>
+          </w:p>
+        </w:tc>
+      </w:tr>
+      <w:tr>
+        <w:tc>
+          <w:tcPr>
+            <w:tcW w:type="dxa" w:w="3360"/>
+          </w:tcPr>
+          <w:p>
+            <w:r>
+              <w:t>A</w:t>
+            </w:r>
+          </w:p>
+        </w:tc>
+        <w:tc>
+          <w:tcPr>
+            <w:tcW w:type="dxa" w:w="3360"/>
+          </w:tcPr>
+          <w:p>
+            <w:r>
+              <w:t>submission_doc</w:t>
+            </w:r>
+          </w:p>
+        </w:tc>
+        <w:tc>
+          <w:tcPr>
+            <w:tcW w:type="dxa" w:w="3360"/>
+          </w:tcPr>
+          <w:p>
+            <w:r>
+              <w:t>docs/p0_benchmark_upgrade_status_2026-05-12.md</w:t>
+            </w:r>
+          </w:p>
+        </w:tc>
+      </w:tr>
+      <w:tr>
+        <w:tc>
+          <w:tcPr>
+            <w:tcW w:type="dxa" w:w="3360"/>
+          </w:tcPr>
+          <w:p>
+            <w:r>
+              <w:t>A</w:t>
+            </w:r>
+          </w:p>
+        </w:tc>
+        <w:tc>
+          <w:tcPr>
+            <w:tcW w:type="dxa" w:w="3360"/>
+          </w:tcPr>
+          <w:p>
+            <w:r>
+              <w:t>submission_doc</w:t>
+            </w:r>
+          </w:p>
+        </w:tc>
+        <w:tc>
+          <w:tcPr>
+            <w:tcW w:type="dxa" w:w="3360"/>
+          </w:tcPr>
+          <w:p>
+            <w:r>
+              <w:t>docs/p0_component_ablation_run_sheet.md</w:t>
+            </w:r>
+          </w:p>
+        </w:tc>
+      </w:tr>
+    </w:tbl>
+    <w:p>
+      <w:pPr>
+        <w:pStyle w:val="Heading2"/>
+      </w:pPr>
+      <w:r>
+        <w:t>Interpretation</w:t>
+      </w:r>
+    </w:p>
+    <w:p>
+      <w:pPr>
+        <w:pStyle w:val="ListBullet"/>
+      </w:pPr>
+      <w:r>
+        <w:t>The existing DOI covers v0.1.0. It should not be described as covering later manuscript-facing changes unless a new release is made.</w:t>
+      </w:r>
+    </w:p>
+    <w:p>
+      <w:pPr>
+        <w:pStyle w:val="ListBullet"/>
+      </w:pPr>
+      <w:r>
+        <w:t>If the submitted manuscript cites current figures, source data, reporting-summary worksheets or post-release scripts, prepare v0.1.1 after all author-controlled blockers are resolved.</w:t>
+      </w:r>
+    </w:p>
+    <w:p>
+      <w:pPr>
+        <w:pStyle w:val="ListBullet"/>
+      </w:pPr>
+      <w:r>
+        <w:t>Do not create the new release before Figure 4 bounded wording and author declarations are confirmed, because a release should archive the exact submission state.</w:t>
       </w:r>
     </w:p>
     <w:p>

</xml_diff>

<commit_message>
Refresh post-release coverage after audit commit
</commit_message>
<xml_diff>
--- a/output/doc/RMTGuard_external_review_packet_2026-05-12.docx
+++ b/output/doc/RMTGuard_external_review_packet_2026-05-12.docx
@@ -27,7 +27,7 @@
     </w:p>
     <w:p>
       <w:r>
-        <w:t>Generated: 2026-05-12 13:20:03</w:t>
+        <w:t>Generated: 2026-05-12 13:22:21</w:t>
       </w:r>
     </w:p>
     <w:tbl>
@@ -221,7 +221,7 @@
       <w:r>
         <w:drawing>
           <wp:inline xmlns:a="http://schemas.openxmlformats.org/drawingml/2006/main" xmlns:pic="http://schemas.openxmlformats.org/drawingml/2006/picture">
-            <wp:extent cx="5120640" cy="8150032"/>
+            <wp:extent cx="5120640" cy="8306645"/>
             <wp:docPr id="1" name="Picture 1"/>
             <wp:cNvGraphicFramePr>
               <a:graphicFrameLocks noChangeAspect="1"/>
@@ -242,7 +242,7 @@
                   <pic:spPr>
                     <a:xfrm>
                       <a:off x="0" y="0"/>
-                      <a:ext cx="5120640" cy="8150032"/>
+                      <a:ext cx="5120640" cy="8306645"/>
                     </a:xfrm>
                     <a:prstGeom prst="rect"/>
                   </pic:spPr>
@@ -330,7 +330,7 @@
         <w:pStyle w:val="ListBullet"/>
       </w:pPr>
       <w:r>
-        <w:t>Items checked: 29</w:t>
+        <w:t>Items checked: 30</w:t>
       </w:r>
     </w:p>
     <w:p>
@@ -410,7 +410,7 @@
         <w:pStyle w:val="ListBullet"/>
       </w:pPr>
       <w:r>
-        <w:t>release: 1</w:t>
+        <w:t>release: 2</w:t>
       </w:r>
     </w:p>
     <w:p>
@@ -2527,7 +2527,7 @@
         <w:pStyle w:val="ListBullet"/>
       </w:pPr>
       <w:r>
-        <w:t>Commits after v0.1.0: 43.</w:t>
+        <w:t>Commits after v0.1.0: 44.</w:t>
       </w:r>
     </w:p>
     <w:p>
@@ -2535,7 +2535,7 @@
         <w:pStyle w:val="ListBullet"/>
       </w:pPr>
       <w:r>
-        <w:t>Changed files after v0.1.0: 253.</w:t>
+        <w:t>Changed files after v0.1.0: 257.</w:t>
       </w:r>
     </w:p>
     <w:p>
@@ -2543,7 +2543,7 @@
         <w:pStyle w:val="ListBullet"/>
       </w:pPr>
       <w:r>
-        <w:t>Manuscript-facing changed files: 243.</w:t>
+        <w:t>Manuscript-facing changed files: 247.</w:t>
       </w:r>
     </w:p>
     <w:p>
@@ -2714,7 +2714,7 @@
           </w:tcPr>
           <w:p>
             <w:r>
-              <w:t>6151941887739ff6be46a24e7493fd2f09a22ba3</w:t>
+              <w:t>d29c9636eb5ab678f69698851b02edc867bcb5ff</w:t>
             </w:r>
           </w:p>
         </w:tc>
@@ -2734,7 +2734,7 @@
           </w:tcPr>
           <w:p>
             <w:r>
-              <w:t>43 commits after v0.1.0.</w:t>
+              <w:t>44 commits after v0.1.0.</w:t>
             </w:r>
           </w:p>
         </w:tc>
@@ -2756,7 +2756,7 @@
           </w:tcPr>
           <w:p>
             <w:r>
-              <w:t>dirty</w:t>
+              <w:t>clean</w:t>
             </w:r>
           </w:p>
         </w:tc>
@@ -2766,7 +2766,7 @@
           </w:tcPr>
           <w:p>
             <w:r>
-              <w:t>M Makefile&lt;br&gt; M README.md&lt;br&gt; M scripts/build_current_evidence_freeze.py&lt;br&gt; M scripts/build_external_review_docx.py&lt;br&gt; M scripts/build_project_gantt.py&lt;br&gt; M scripts/export_shared_project_info.py&lt;br&gt;?? docs/post_release_version_coverage_audit.md&lt;br&gt;?? scripts/build_post_release_version_coverage_audit.py</w:t>
+              <w:t>none</w:t>
             </w:r>
           </w:p>
         </w:tc>
@@ -2818,7 +2818,7 @@
           </w:tcPr>
           <w:p>
             <w:r>
-              <w:t>243</w:t>
+              <w:t>247</w:t>
             </w:r>
           </w:p>
         </w:tc>
@@ -2922,7 +2922,7 @@
           </w:tcPr>
           <w:p>
             <w:r>
-              <w:t>48</w:t>
+              <w:t>49</w:t>
             </w:r>
           </w:p>
         </w:tc>
@@ -3343,7 +3343,7 @@
           </w:tcPr>
           <w:p>
             <w:r>
-              <w:t>44</w:t>
+              <w:t>45</w:t>
             </w:r>
           </w:p>
         </w:tc>
@@ -3453,7 +3453,7 @@
           </w:tcPr>
           <w:p>
             <w:r>
-              <w:t>51</w:t>
+              <w:t>52</w:t>
             </w:r>
           </w:p>
         </w:tc>
@@ -3475,7 +3475,7 @@
           </w:tcPr>
           <w:p>
             <w:r>
-              <w:t>35</w:t>
+              <w:t>37</w:t>
             </w:r>
           </w:p>
         </w:tc>
@@ -3560,7 +3560,7 @@
           </w:tcPr>
           <w:p>
             <w:r>
-              <w:t>211</w:t>
+              <w:t>215</w:t>
             </w:r>
           </w:p>
         </w:tc>

</xml_diff>

<commit_message>
Add v0.1.1 release preflight gate
</commit_message>
<xml_diff>
--- a/output/doc/RMTGuard_external_review_packet_2026-05-12.docx
+++ b/output/doc/RMTGuard_external_review_packet_2026-05-12.docx
@@ -27,7 +27,7 @@
     </w:p>
     <w:p>
       <w:r>
-        <w:t>Generated: 2026-05-12 13:22:21</w:t>
+        <w:t>Generated: 2026-05-12 13:30:49</w:t>
       </w:r>
     </w:p>
     <w:tbl>
@@ -221,7 +221,7 @@
       <w:r>
         <w:drawing>
           <wp:inline xmlns:a="http://schemas.openxmlformats.org/drawingml/2006/main" xmlns:pic="http://schemas.openxmlformats.org/drawingml/2006/picture">
-            <wp:extent cx="5120640" cy="8306645"/>
+            <wp:extent cx="5120640" cy="8463259"/>
             <wp:docPr id="1" name="Picture 1"/>
             <wp:cNvGraphicFramePr>
               <a:graphicFrameLocks noChangeAspect="1"/>
@@ -242,7 +242,7 @@
                   <pic:spPr>
                     <a:xfrm>
                       <a:off x="0" y="0"/>
-                      <a:ext cx="5120640" cy="8306645"/>
+                      <a:ext cx="5120640" cy="8463259"/>
                     </a:xfrm>
                     <a:prstGeom prst="rect"/>
                   </pic:spPr>
@@ -330,7 +330,7 @@
         <w:pStyle w:val="ListBullet"/>
       </w:pPr>
       <w:r>
-        <w:t>Items checked: 30</w:t>
+        <w:t>Items checked: 31</w:t>
       </w:r>
     </w:p>
     <w:p>
@@ -410,7 +410,7 @@
         <w:pStyle w:val="ListBullet"/>
       </w:pPr>
       <w:r>
-        <w:t>release: 2</w:t>
+        <w:t>release: 3</w:t>
       </w:r>
     </w:p>
     <w:p>
@@ -2527,7 +2527,7 @@
         <w:pStyle w:val="ListBullet"/>
       </w:pPr>
       <w:r>
-        <w:t>Commits after v0.1.0: 44.</w:t>
+        <w:t>Commits after v0.1.0: 45.</w:t>
       </w:r>
     </w:p>
     <w:p>
@@ -2714,7 +2714,7 @@
           </w:tcPr>
           <w:p>
             <w:r>
-              <w:t>d29c9636eb5ab678f69698851b02edc867bcb5ff</w:t>
+              <w:t>c48036a7c13ae4d5f0768758354b4b4d12c7af03</w:t>
             </w:r>
           </w:p>
         </w:tc>
@@ -2734,7 +2734,7 @@
           </w:tcPr>
           <w:p>
             <w:r>
-              <w:t>44 commits after v0.1.0.</w:t>
+              <w:t>45 commits after v0.1.0.</w:t>
             </w:r>
           </w:p>
         </w:tc>
@@ -2756,7 +2756,7 @@
           </w:tcPr>
           <w:p>
             <w:r>
-              <w:t>clean</w:t>
+              <w:t>dirty</w:t>
             </w:r>
           </w:p>
         </w:tc>
@@ -2766,7 +2766,7 @@
           </w:tcPr>
           <w:p>
             <w:r>
-              <w:t>none</w:t>
+              <w:t>M Makefile&lt;br&gt; M README.md&lt;br&gt; M scripts/build_current_evidence_freeze.py&lt;br&gt; M scripts/build_external_review_docx.py&lt;br&gt; M scripts/build_project_gantt.py&lt;br&gt; M scripts/export_shared_project_info.py&lt;br&gt;?? docs/v0_1_1_release_preflight.md&lt;br&gt;?? scripts/build_v0_1_1_release_preflight.py</w:t>
             </w:r>
           </w:p>
         </w:tc>
@@ -4950,6 +4950,634 @@
       </w:pPr>
       <w:r>
         <w:t>Do not create the new release before Figure 4 bounded wording and author declarations are confirmed, because a release should archive the exact submission state.</w:t>
+      </w:r>
+    </w:p>
+    <w:p>
+      <w:pPr>
+        <w:pStyle w:val="Heading1"/>
+      </w:pPr>
+      <w:r>
+        <w:t>v0.1.1 release preflight</w:t>
+      </w:r>
+    </w:p>
+    <w:p>
+      <w:pPr>
+        <w:pStyle w:val="Heading2"/>
+      </w:pPr>
+      <w:r>
+        <w:t>RMTGuard v0.1.1 release preflight</w:t>
+      </w:r>
+    </w:p>
+    <w:p>
+      <w:r>
+        <w:t>Generated by python scripts/build_v0_1_1_release_preflight.py.</w:t>
+      </w:r>
+    </w:p>
+    <w:p>
+      <w:pPr>
+        <w:pStyle w:val="Heading2"/>
+      </w:pPr>
+      <w:r>
+        <w:t>Boundary</w:t>
+      </w:r>
+    </w:p>
+    <w:p>
+      <w:r>
+        <w:t>This is a no-action preflight. It does not create a Git tag, GitHub Release, or Zenodo DOI. Its purpose is to prevent a premature release before the manuscript-facing files and author-controlled statements are frozen.</w:t>
+      </w:r>
+    </w:p>
+    <w:p>
+      <w:pPr>
+        <w:pStyle w:val="Heading2"/>
+      </w:pPr>
+      <w:r>
+        <w:t>Decision</w:t>
+      </w:r>
+    </w:p>
+    <w:p>
+      <w:pPr>
+        <w:pStyle w:val="ListBullet"/>
+      </w:pPr>
+      <w:r>
+        <w:t>Release decision: do_not_release.</w:t>
+      </w:r>
+    </w:p>
+    <w:p>
+      <w:pPr>
+        <w:pStyle w:val="ListBullet"/>
+      </w:pPr>
+      <w:r>
+        <w:t>Blocking or holding gates: author_declarations;corresponding_author_figure4_ack;figure_caption_source_audit;git_worktree_clean.</w:t>
+      </w:r>
+    </w:p>
+    <w:p>
+      <w:pPr>
+        <w:pStyle w:val="ListBullet"/>
+      </w:pPr>
+      <w:r>
+        <w:t>Candidate release: v0.1.1.</w:t>
+      </w:r>
+    </w:p>
+    <w:p>
+      <w:pPr>
+        <w:pStyle w:val="Heading2"/>
+      </w:pPr>
+      <w:r>
+        <w:t>Status Counts</w:t>
+      </w:r>
+    </w:p>
+    <w:p>
+      <w:pPr>
+        <w:pStyle w:val="ListBullet"/>
+      </w:pPr>
+      <w:r>
+        <w:t>blocked: 4</w:t>
+      </w:r>
+    </w:p>
+    <w:p>
+      <w:pPr>
+        <w:pStyle w:val="ListBullet"/>
+      </w:pPr>
+      <w:r>
+        <w:t>pass: 2</w:t>
+      </w:r>
+    </w:p>
+    <w:p>
+      <w:pPr>
+        <w:pStyle w:val="ListBullet"/>
+      </w:pPr>
+      <w:r>
+        <w:t>pending_author_verification: 1</w:t>
+      </w:r>
+    </w:p>
+    <w:p>
+      <w:pPr>
+        <w:pStyle w:val="ListBullet"/>
+      </w:pPr>
+      <w:r>
+        <w:t>ready_after_manual_blockers: 1</w:t>
+      </w:r>
+    </w:p>
+    <w:p>
+      <w:pPr>
+        <w:pStyle w:val="Heading2"/>
+      </w:pPr>
+      <w:r>
+        <w:t>Gate Table</w:t>
+      </w:r>
+    </w:p>
+    <w:tbl>
+      <w:tblPr>
+        <w:tblStyle w:val="TableGrid"/>
+        <w:tblW w:type="auto" w:w="0"/>
+        <w:tblLook w:firstColumn="1" w:firstRow="1" w:lastColumn="0" w:lastRow="0" w:noHBand="0" w:noVBand="1" w:val="04A0"/>
+      </w:tblPr>
+      <w:tblGrid>
+        <w:gridCol w:w="2016"/>
+        <w:gridCol w:w="2016"/>
+        <w:gridCol w:w="2016"/>
+        <w:gridCol w:w="2016"/>
+        <w:gridCol w:w="2016"/>
+      </w:tblGrid>
+      <w:tr>
+        <w:tc>
+          <w:tcPr>
+            <w:tcW w:type="dxa" w:w="2016"/>
+          </w:tcPr>
+          <w:p>
+            <w:r>
+              <w:t>Gate</w:t>
+            </w:r>
+          </w:p>
+        </w:tc>
+        <w:tc>
+          <w:tcPr>
+            <w:tcW w:type="dxa" w:w="2016"/>
+          </w:tcPr>
+          <w:p>
+            <w:r>
+              <w:t>Status</w:t>
+            </w:r>
+          </w:p>
+        </w:tc>
+        <w:tc>
+          <w:tcPr>
+            <w:tcW w:type="dxa" w:w="2016"/>
+          </w:tcPr>
+          <w:p>
+            <w:r>
+              <w:t>Severity</w:t>
+            </w:r>
+          </w:p>
+        </w:tc>
+        <w:tc>
+          <w:tcPr>
+            <w:tcW w:type="dxa" w:w="2016"/>
+          </w:tcPr>
+          <w:p>
+            <w:r>
+              <w:t>Required action</w:t>
+            </w:r>
+          </w:p>
+        </w:tc>
+        <w:tc>
+          <w:tcPr>
+            <w:tcW w:type="dxa" w:w="2016"/>
+          </w:tcPr>
+          <w:p>
+            <w:r>
+              <w:t>Notes</w:t>
+            </w:r>
+          </w:p>
+        </w:tc>
+      </w:tr>
+      <w:tr>
+        <w:tc>
+          <w:tcPr>
+            <w:tcW w:type="dxa" w:w="2016"/>
+          </w:tcPr>
+          <w:p>
+            <w:r>
+              <w:t>author_declarations</w:t>
+            </w:r>
+          </w:p>
+        </w:tc>
+        <w:tc>
+          <w:tcPr>
+            <w:tcW w:type="dxa" w:w="2016"/>
+          </w:tcPr>
+          <w:p>
+            <w:r>
+              <w:t>blocked</w:t>
+            </w:r>
+          </w:p>
+        </w:tc>
+        <w:tc>
+          <w:tcPr>
+            <w:tcW w:type="dxa" w:w="2016"/>
+          </w:tcPr>
+          <w:p>
+            <w:r>
+              <w:t>manual_blocker</w:t>
+            </w:r>
+          </w:p>
+        </w:tc>
+        <w:tc>
+          <w:tcPr>
+            <w:tcW w:type="dxa" w:w="2016"/>
+          </w:tcPr>
+          <w:p>
+            <w:r>
+              <w:t>Confirm funding, competing interests, public-data ethics, postal code, and CRediT roles before release.</w:t>
+            </w:r>
+          </w:p>
+        </w:tc>
+        <w:tc>
+          <w:tcPr>
+            <w:tcW w:type="dxa" w:w="2016"/>
+          </w:tcPr>
+          <w:p>
+            <w:r>
+              <w:t>postal_code_author_provided:author_provided_conflicts_public_sources;postal_code_public_source_candidate:external_source_candidate;credit_roles_draft:drafted_needs_author_confirmation;funding_statement:pending_author_content;competing_interests_statement:drafted_needs_author_confirmation</w:t>
+            </w:r>
+          </w:p>
+        </w:tc>
+      </w:tr>
+      <w:tr>
+        <w:tc>
+          <w:tcPr>
+            <w:tcW w:type="dxa" w:w="2016"/>
+          </w:tcPr>
+          <w:p>
+            <w:r>
+              <w:t>corresponding_author_figure4_ack</w:t>
+            </w:r>
+          </w:p>
+        </w:tc>
+        <w:tc>
+          <w:tcPr>
+            <w:tcW w:type="dxa" w:w="2016"/>
+          </w:tcPr>
+          <w:p>
+            <w:r>
+              <w:t>blocked</w:t>
+            </w:r>
+          </w:p>
+        </w:tc>
+        <w:tc>
+          <w:tcPr>
+            <w:tcW w:type="dxa" w:w="2016"/>
+          </w:tcPr>
+          <w:p>
+            <w:r>
+              <w:t>manual_blocker</w:t>
+            </w:r>
+          </w:p>
+        </w:tc>
+        <w:tc>
+          <w:tcPr>
+            <w:tcW w:type="dxa" w:w="2016"/>
+          </w:tcPr>
+          <w:p>
+            <w:r>
+              <w:t>Save written replies under metadata/author_reply_evidence/ and record them with scripts/record_corresponding_author_signoff.py.</w:t>
+            </w:r>
+          </w:p>
+        </w:tc>
+        <w:tc>
+          <w:tcPr>
+            <w:tcW w:type="dxa" w:w="2016"/>
+          </w:tcPr>
+          <w:p>
+            <w:r>
+              <w:t>Yi Miao:proxy_authorized_working_assumption;Han Yan:proxy_authorized_working_assumption</w:t>
+            </w:r>
+          </w:p>
+        </w:tc>
+      </w:tr>
+      <w:tr>
+        <w:tc>
+          <w:tcPr>
+            <w:tcW w:type="dxa" w:w="2016"/>
+          </w:tcPr>
+          <w:p>
+            <w:r>
+              <w:t>figure_caption_source_audit</w:t>
+            </w:r>
+          </w:p>
+        </w:tc>
+        <w:tc>
+          <w:tcPr>
+            <w:tcW w:type="dxa" w:w="2016"/>
+          </w:tcPr>
+          <w:p>
+            <w:r>
+              <w:t>blocked</w:t>
+            </w:r>
+          </w:p>
+        </w:tc>
+        <w:tc>
+          <w:tcPr>
+            <w:tcW w:type="dxa" w:w="2016"/>
+          </w:tcPr>
+          <w:p>
+            <w:r>
+              <w:t>manual_blocker</w:t>
+            </w:r>
+          </w:p>
+        </w:tc>
+        <w:tc>
+          <w:tcPr>
+            <w:tcW w:type="dxa" w:w="2016"/>
+          </w:tcPr>
+          <w:p>
+            <w:r>
+              <w:t>Resolve Figure 4 corresponding-author acknowledgement before release.</w:t>
+            </w:r>
+          </w:p>
+        </w:tc>
+        <w:tc>
+          <w:tcPr>
+            <w:tcW w:type="dxa" w:w="2016"/>
+          </w:tcPr>
+          <w:p>
+            <w:r>
+              <w:t>Figure 4</w:t>
+            </w:r>
+          </w:p>
+        </w:tc>
+      </w:tr>
+      <w:tr>
+        <w:tc>
+          <w:tcPr>
+            <w:tcW w:type="dxa" w:w="2016"/>
+          </w:tcPr>
+          <w:p>
+            <w:r>
+              <w:t>reporting_summary</w:t>
+            </w:r>
+          </w:p>
+        </w:tc>
+        <w:tc>
+          <w:tcPr>
+            <w:tcW w:type="dxa" w:w="2016"/>
+          </w:tcPr>
+          <w:p>
+            <w:r>
+              <w:t>pending_author_verification</w:t>
+            </w:r>
+          </w:p>
+        </w:tc>
+        <w:tc>
+          <w:tcPr>
+            <w:tcW w:type="dxa" w:w="2016"/>
+          </w:tcPr>
+          <w:p>
+            <w:r>
+              <w:t>manual_blocker</w:t>
+            </w:r>
+          </w:p>
+        </w:tc>
+        <w:tc>
+          <w:tcPr>
+            <w:tcW w:type="dxa" w:w="2016"/>
+          </w:tcPr>
+          <w:p>
+            <w:r>
+              <w:t>Have the corresponding author verify the reporting-summary worksheet before official submission.</w:t>
+            </w:r>
+          </w:p>
+        </w:tc>
+        <w:tc>
+          <w:tcPr>
+            <w:tcW w:type="dxa" w:w="2016"/>
+          </w:tcPr>
+          <w:p>
+            <w:r>
+              <w:t>Statistics/Multiple testing and uncertainty;Reporting summary/Official form status</w:t>
+            </w:r>
+          </w:p>
+        </w:tc>
+      </w:tr>
+      <w:tr>
+        <w:tc>
+          <w:tcPr>
+            <w:tcW w:type="dxa" w:w="2016"/>
+          </w:tcPr>
+          <w:p>
+            <w:r>
+              <w:t>claim_integrity</w:t>
+            </w:r>
+          </w:p>
+        </w:tc>
+        <w:tc>
+          <w:tcPr>
+            <w:tcW w:type="dxa" w:w="2016"/>
+          </w:tcPr>
+          <w:p>
+            <w:r>
+              <w:t>pass</w:t>
+            </w:r>
+          </w:p>
+        </w:tc>
+        <w:tc>
+          <w:tcPr>
+            <w:tcW w:type="dxa" w:w="2016"/>
+          </w:tcPr>
+          <w:p>
+            <w:r>
+              <w:t>controlled</w:t>
+            </w:r>
+          </w:p>
+        </w:tc>
+        <w:tc>
+          <w:tcPr>
+            <w:tcW w:type="dxa" w:w="2016"/>
+          </w:tcPr>
+          <w:p>
+            <w:r>
+              <w:t>No action.</w:t>
+            </w:r>
+          </w:p>
+        </w:tc>
+        <w:tc>
+          <w:tcPr>
+            <w:tcW w:type="dxa" w:w="2016"/>
+          </w:tcPr>
+          <w:p>
+            <w:r>
+              <w:t>lint_violations=0;trace_violations=0;lint_rows=215;trace_rows=21</w:t>
+            </w:r>
+          </w:p>
+        </w:tc>
+      </w:tr>
+      <w:tr>
+        <w:tc>
+          <w:tcPr>
+            <w:tcW w:type="dxa" w:w="2016"/>
+          </w:tcPr>
+          <w:p>
+            <w:r>
+              <w:t>version_coverage</w:t>
+            </w:r>
+          </w:p>
+        </w:tc>
+        <w:tc>
+          <w:tcPr>
+            <w:tcW w:type="dxa" w:w="2016"/>
+          </w:tcPr>
+          <w:p>
+            <w:r>
+              <w:t>ready_after_manual_blockers</w:t>
+            </w:r>
+          </w:p>
+        </w:tc>
+        <w:tc>
+          <w:tcPr>
+            <w:tcW w:type="dxa" w:w="2016"/>
+          </w:tcPr>
+          <w:p>
+            <w:r>
+              <w:t>release_blocker</w:t>
+            </w:r>
+          </w:p>
+        </w:tc>
+        <w:tc>
+          <w:tcPr>
+            <w:tcW w:type="dxa" w:w="2016"/>
+          </w:tcPr>
+          <w:p>
+            <w:r>
+              <w:t>After author blockers are resolved, tag and archive v0.1.1 so DOI covers the submitted files.</w:t>
+            </w:r>
+          </w:p>
+        </w:tc>
+        <w:tc>
+          <w:tcPr>
+            <w:tcW w:type="dxa" w:w="2016"/>
+          </w:tcPr>
+          <w:p>
+            <w:r>
+              <w:t>recommendation=prepare_v0.1.1_after_author_ack;worktree=clean</w:t>
+            </w:r>
+          </w:p>
+        </w:tc>
+      </w:tr>
+      <w:tr>
+        <w:tc>
+          <w:tcPr>
+            <w:tcW w:type="dxa" w:w="2016"/>
+          </w:tcPr>
+          <w:p>
+            <w:r>
+              <w:t>evidence_freeze_manifest</w:t>
+            </w:r>
+          </w:p>
+        </w:tc>
+        <w:tc>
+          <w:tcPr>
+            <w:tcW w:type="dxa" w:w="2016"/>
+          </w:tcPr>
+          <w:p>
+            <w:r>
+              <w:t>pass</w:t>
+            </w:r>
+          </w:p>
+        </w:tc>
+        <w:tc>
+          <w:tcPr>
+            <w:tcW w:type="dxa" w:w="2016"/>
+          </w:tcPr>
+          <w:p>
+            <w:r>
+              <w:t>controlled</w:t>
+            </w:r>
+          </w:p>
+        </w:tc>
+        <w:tc>
+          <w:tcPr>
+            <w:tcW w:type="dxa" w:w="2016"/>
+          </w:tcPr>
+          <w:p>
+            <w:r>
+              <w:t>No action.</w:t>
+            </w:r>
+          </w:p>
+        </w:tc>
+        <w:tc>
+          <w:tcPr>
+            <w:tcW w:type="dxa" w:w="2016"/>
+          </w:tcPr>
+          <w:p>
+            <w:r>
+              <w:t>30 frozen evidence items exist.</w:t>
+            </w:r>
+          </w:p>
+        </w:tc>
+      </w:tr>
+      <w:tr>
+        <w:tc>
+          <w:tcPr>
+            <w:tcW w:type="dxa" w:w="2016"/>
+          </w:tcPr>
+          <w:p>
+            <w:r>
+              <w:t>git_worktree_clean</w:t>
+            </w:r>
+          </w:p>
+        </w:tc>
+        <w:tc>
+          <w:tcPr>
+            <w:tcW w:type="dxa" w:w="2016"/>
+          </w:tcPr>
+          <w:p>
+            <w:r>
+              <w:t>blocked</w:t>
+            </w:r>
+          </w:p>
+        </w:tc>
+        <w:tc>
+          <w:tcPr>
+            <w:tcW w:type="dxa" w:w="2016"/>
+          </w:tcPr>
+          <w:p>
+            <w:r>
+              <w:t>release_blocker</w:t>
+            </w:r>
+          </w:p>
+        </w:tc>
+        <w:tc>
+          <w:tcPr>
+            <w:tcW w:type="dxa" w:w="2016"/>
+          </w:tcPr>
+          <w:p>
+            <w:r>
+              <w:t>Commit all release-facing changes before creating a tag.</w:t>
+            </w:r>
+          </w:p>
+        </w:tc>
+        <w:tc>
+          <w:tcPr>
+            <w:tcW w:type="dxa" w:w="2016"/>
+          </w:tcPr>
+          <w:p>
+            <w:r>
+              <w:t>M Makefile; M README.md; M scripts/build_current_evidence_freeze.py; M scripts/build_external_review_docx.py; M scripts/build_project_gantt.py; M scripts/export_shared_project_info.py;?? scripts/build_v0_1_1_release_preflight.py</w:t>
+            </w:r>
+          </w:p>
+        </w:tc>
+      </w:tr>
+    </w:tbl>
+    <w:p>
+      <w:pPr>
+        <w:pStyle w:val="Heading2"/>
+      </w:pPr>
+      <w:r>
+        <w:t>Interpretation</w:t>
+      </w:r>
+    </w:p>
+    <w:p>
+      <w:pPr>
+        <w:pStyle w:val="ListBullet"/>
+      </w:pPr>
+      <w:r>
+        <w:t>do_not_release means at least one hard blocker remains; do not create a release.</w:t>
+      </w:r>
+    </w:p>
+    <w:p>
+      <w:pPr>
+        <w:pStyle w:val="ListBullet"/>
+      </w:pPr>
+      <w:r>
+        <w:t>hold_for_manual_confirmation means the technical package is close, but author-controlled confirmations or final version coverage still hold the release.</w:t>
+      </w:r>
+    </w:p>
+    <w:p>
+      <w:pPr>
+        <w:pStyle w:val="ListBullet"/>
+      </w:pPr>
+      <w:r>
+        <w:t>ready_to_tag_v0.1.1 should occur only after all author confirmations, final figure/source-data freeze, clean worktree, and claim-integrity checks pass.</w:t>
       </w:r>
     </w:p>
     <w:p>

</xml_diff>

<commit_message>
Refresh v0.1.1 preflight after gate commit
</commit_message>
<xml_diff>
--- a/output/doc/RMTGuard_external_review_packet_2026-05-12.docx
+++ b/output/doc/RMTGuard_external_review_packet_2026-05-12.docx
@@ -27,7 +27,7 @@
     </w:p>
     <w:p>
       <w:r>
-        <w:t>Generated: 2026-05-12 13:30:49</w:t>
+        <w:t>Generated: 2026-05-12 13:33:24</w:t>
       </w:r>
     </w:p>
     <w:tbl>
@@ -2527,7 +2527,7 @@
         <w:pStyle w:val="ListBullet"/>
       </w:pPr>
       <w:r>
-        <w:t>Commits after v0.1.0: 45.</w:t>
+        <w:t>Commits after v0.1.0: 46.</w:t>
       </w:r>
     </w:p>
     <w:p>
@@ -2535,7 +2535,7 @@
         <w:pStyle w:val="ListBullet"/>
       </w:pPr>
       <w:r>
-        <w:t>Changed files after v0.1.0: 257.</w:t>
+        <w:t>Changed files after v0.1.0: 260.</w:t>
       </w:r>
     </w:p>
     <w:p>
@@ -2543,7 +2543,7 @@
         <w:pStyle w:val="ListBullet"/>
       </w:pPr>
       <w:r>
-        <w:t>Manuscript-facing changed files: 247.</w:t>
+        <w:t>Manuscript-facing changed files: 250.</w:t>
       </w:r>
     </w:p>
     <w:p>
@@ -2714,7 +2714,7 @@
           </w:tcPr>
           <w:p>
             <w:r>
-              <w:t>c48036a7c13ae4d5f0768758354b4b4d12c7af03</w:t>
+              <w:t>171c0cf665ef8599a449bbb7f2952f0371f6c7d9</w:t>
             </w:r>
           </w:p>
         </w:tc>
@@ -2734,7 +2734,7 @@
           </w:tcPr>
           <w:p>
             <w:r>
-              <w:t>45 commits after v0.1.0.</w:t>
+              <w:t>46 commits after v0.1.0.</w:t>
             </w:r>
           </w:p>
         </w:tc>
@@ -2756,7 +2756,7 @@
           </w:tcPr>
           <w:p>
             <w:r>
-              <w:t>dirty</w:t>
+              <w:t>clean</w:t>
             </w:r>
           </w:p>
         </w:tc>
@@ -2766,7 +2766,7 @@
           </w:tcPr>
           <w:p>
             <w:r>
-              <w:t>M Makefile&lt;br&gt; M README.md&lt;br&gt; M scripts/build_current_evidence_freeze.py&lt;br&gt; M scripts/build_external_review_docx.py&lt;br&gt; M scripts/build_project_gantt.py&lt;br&gt; M scripts/export_shared_project_info.py&lt;br&gt;?? docs/v0_1_1_release_preflight.md&lt;br&gt;?? scripts/build_v0_1_1_release_preflight.py</w:t>
+              <w:t>none</w:t>
             </w:r>
           </w:p>
         </w:tc>
@@ -2818,7 +2818,7 @@
           </w:tcPr>
           <w:p>
             <w:r>
-              <w:t>247</w:t>
+              <w:t>250</w:t>
             </w:r>
           </w:p>
         </w:tc>
@@ -2922,7 +2922,7 @@
           </w:tcPr>
           <w:p>
             <w:r>
-              <w:t>49</w:t>
+              <w:t>50</w:t>
             </w:r>
           </w:p>
         </w:tc>
@@ -3343,7 +3343,7 @@
           </w:tcPr>
           <w:p>
             <w:r>
-              <w:t>45</w:t>
+              <w:t>46</w:t>
             </w:r>
           </w:p>
         </w:tc>
@@ -3453,7 +3453,7 @@
           </w:tcPr>
           <w:p>
             <w:r>
-              <w:t>52</w:t>
+              <w:t>53</w:t>
             </w:r>
           </w:p>
         </w:tc>
@@ -3475,7 +3475,7 @@
           </w:tcPr>
           <w:p>
             <w:r>
-              <w:t>37</w:t>
+              <w:t>38</w:t>
             </w:r>
           </w:p>
         </w:tc>
@@ -3560,7 +3560,7 @@
           </w:tcPr>
           <w:p>
             <w:r>
-              <w:t>215</w:t>
+              <w:t>218</w:t>
             </w:r>
           </w:p>
         </w:tc>
@@ -5007,7 +5007,7 @@
         <w:pStyle w:val="ListBullet"/>
       </w:pPr>
       <w:r>
-        <w:t>Blocking or holding gates: author_declarations;corresponding_author_figure4_ack;figure_caption_source_audit;git_worktree_clean.</w:t>
+        <w:t>Blocking or holding gates: author_declarations;corresponding_author_figure4_ack;figure_caption_source_audit.</w:t>
       </w:r>
     </w:p>
     <w:p>
@@ -5031,7 +5031,7 @@
         <w:pStyle w:val="ListBullet"/>
       </w:pPr>
       <w:r>
-        <w:t>blocked: 4</w:t>
+        <w:t>blocked: 3</w:t>
       </w:r>
     </w:p>
     <w:p>
@@ -5039,7 +5039,7 @@
         <w:pStyle w:val="ListBullet"/>
       </w:pPr>
       <w:r>
-        <w:t>pass: 2</w:t>
+        <w:t>pass: 3</w:t>
       </w:r>
     </w:p>
     <w:p>
@@ -5490,7 +5490,7 @@
           </w:tcPr>
           <w:p>
             <w:r>
-              <w:t>30 frozen evidence items exist.</w:t>
+              <w:t>31 frozen evidence items exist.</w:t>
             </w:r>
           </w:p>
         </w:tc>
@@ -5512,7 +5512,7 @@
           </w:tcPr>
           <w:p>
             <w:r>
-              <w:t>blocked</w:t>
+              <w:t>pass</w:t>
             </w:r>
           </w:p>
         </w:tc>
@@ -5522,7 +5522,7 @@
           </w:tcPr>
           <w:p>
             <w:r>
-              <w:t>release_blocker</w:t>
+              <w:t>controlled</w:t>
             </w:r>
           </w:p>
         </w:tc>
@@ -5532,7 +5532,7 @@
           </w:tcPr>
           <w:p>
             <w:r>
-              <w:t>Commit all release-facing changes before creating a tag.</w:t>
+              <w:t>No action.</w:t>
             </w:r>
           </w:p>
         </w:tc>
@@ -5542,7 +5542,7 @@
           </w:tcPr>
           <w:p>
             <w:r>
-              <w:t>M Makefile; M README.md; M scripts/build_current_evidence_freeze.py; M scripts/build_external_review_docx.py; M scripts/build_project_gantt.py; M scripts/export_shared_project_info.py;?? scripts/build_v0_1_1_release_preflight.py</w:t>
+              <w:t>Worktree is clean except self-generated preflight outputs.</w:t>
             </w:r>
           </w:p>
         </w:tc>

</xml_diff>

<commit_message>
Add author declaration confirmation packet
</commit_message>
<xml_diff>
--- a/output/doc/RMTGuard_external_review_packet_2026-05-12.docx
+++ b/output/doc/RMTGuard_external_review_packet_2026-05-12.docx
@@ -27,7 +27,7 @@
     </w:p>
     <w:p>
       <w:r>
-        <w:t>Generated: 2026-05-12 13:33:24</w:t>
+        <w:t>Generated: 2026-05-12 13:40:17</w:t>
       </w:r>
     </w:p>
     <w:tbl>
@@ -221,7 +221,7 @@
       <w:r>
         <w:drawing>
           <wp:inline xmlns:a="http://schemas.openxmlformats.org/drawingml/2006/main" xmlns:pic="http://schemas.openxmlformats.org/drawingml/2006/picture">
-            <wp:extent cx="5120640" cy="8463259"/>
+            <wp:extent cx="5120640" cy="8619872"/>
             <wp:docPr id="1" name="Picture 1"/>
             <wp:cNvGraphicFramePr>
               <a:graphicFrameLocks noChangeAspect="1"/>
@@ -242,7 +242,7 @@
                   <pic:spPr>
                     <a:xfrm>
                       <a:off x="0" y="0"/>
-                      <a:ext cx="5120640" cy="8463259"/>
+                      <a:ext cx="5120640" cy="8619872"/>
                     </a:xfrm>
                     <a:prstGeom prst="rect"/>
                   </pic:spPr>
@@ -330,7 +330,7 @@
         <w:pStyle w:val="ListBullet"/>
       </w:pPr>
       <w:r>
-        <w:t>Items checked: 31</w:t>
+        <w:t>Items checked: 32</w:t>
       </w:r>
     </w:p>
     <w:p>
@@ -386,7 +386,7 @@
         <w:pStyle w:val="ListBullet"/>
       </w:pPr>
       <w:r>
-        <w:t>manual_blocker: 1</w:t>
+        <w:t>manual_blocker: 2</w:t>
       </w:r>
     </w:p>
     <w:p>
@@ -5007,7 +5007,7 @@
         <w:pStyle w:val="ListBullet"/>
       </w:pPr>
       <w:r>
-        <w:t>Blocking or holding gates: author_declarations;corresponding_author_figure4_ack;figure_caption_source_audit.</w:t>
+        <w:t>Blocking or holding gates: author_declarations;corresponding_author_figure4_ack;figure_caption_source_audit;git_worktree_clean.</w:t>
       </w:r>
     </w:p>
     <w:p>
@@ -5031,7 +5031,7 @@
         <w:pStyle w:val="ListBullet"/>
       </w:pPr>
       <w:r>
-        <w:t>blocked: 3</w:t>
+        <w:t>blocked: 4</w:t>
       </w:r>
     </w:p>
     <w:p>
@@ -5039,7 +5039,7 @@
         <w:pStyle w:val="ListBullet"/>
       </w:pPr>
       <w:r>
-        <w:t>pass: 3</w:t>
+        <w:t>pass: 2</w:t>
       </w:r>
     </w:p>
     <w:p>
@@ -5168,7 +5168,7 @@
           </w:tcPr>
           <w:p>
             <w:r>
-              <w:t>Confirm funding, competing interests, public-data ethics, postal code, and CRediT roles before release.</w:t>
+              <w:t>Use the author declaration confirmation packet to confirm funding, competing interests, public-data ethics, postal code, CRediT roles, and title-page metadata before release.</w:t>
             </w:r>
           </w:p>
         </w:tc>
@@ -5178,7 +5178,7 @@
           </w:tcPr>
           <w:p>
             <w:r>
-              <w:t>postal_code_author_provided:author_provided_conflicts_public_sources;postal_code_public_source_candidate:external_source_candidate;credit_roles_draft:drafted_needs_author_confirmation;funding_statement:pending_author_content;competing_interests_statement:drafted_needs_author_confirmation</w:t>
+              <w:t>pending=postal_code_author_provided:author_provided_conflicts_public_sources;postal_code_public_source_candidate:external_source_candidate;credit_roles_draft:drafted_needs_author_confirmation;funding_statement:pending_author_content;competing_interests_statement:drafted_needs_author_confirmation;packet_exists=True</w:t>
             </w:r>
           </w:p>
         </w:tc>
@@ -5490,7 +5490,7 @@
           </w:tcPr>
           <w:p>
             <w:r>
-              <w:t>31 frozen evidence items exist.</w:t>
+              <w:t>32 frozen evidence items exist.</w:t>
             </w:r>
           </w:p>
         </w:tc>
@@ -5512,7 +5512,7 @@
           </w:tcPr>
           <w:p>
             <w:r>
-              <w:t>pass</w:t>
+              <w:t>blocked</w:t>
             </w:r>
           </w:p>
         </w:tc>
@@ -5522,7 +5522,7 @@
           </w:tcPr>
           <w:p>
             <w:r>
-              <w:t>controlled</w:t>
+              <w:t>release_blocker</w:t>
             </w:r>
           </w:p>
         </w:tc>
@@ -5532,7 +5532,7 @@
           </w:tcPr>
           <w:p>
             <w:r>
-              <w:t>No action.</w:t>
+              <w:t>Commit all release-facing changes before creating a tag.</w:t>
             </w:r>
           </w:p>
         </w:tc>
@@ -5542,7 +5542,7 @@
           </w:tcPr>
           <w:p>
             <w:r>
-              <w:t>Worktree is clean except self-generated preflight outputs.</w:t>
+              <w:t>M Makefile; M README.md; M docs/current_evidence_freeze_2026-05-12.md; M docs/shared_info_export_manifest.md; M figures/project_management/rmtguard_project_gantt.pdf; M figures/project_management/rmtguard_project_gantt.png; M output/doc/RMTGuard_external_review_packet_2026-05-12.docx; M results/project_management/rmtguard_project_gantt.md; M results/project_management/rmtguard_project_gantt.tsv; M results/shared_info/rmtguard_shared_export_manifest.tsv; M results/submission/current_evidence_freeze_manifest.tsv; M scripts/build_current_evidence_freeze.py; M scripts/build_external_review_docx.py; M scripts/build_project_gantt.py; M scripts/build_v0_1_1_release_preflight.py; M scripts/export_shared_project_info.py;?? docs/author_declaration_confirmation_packet.md;?? output/doc/RMTGuard_author_declaration_confirmation_packet.docx;?? scripts/build_author_declaration_confirmation_packet.py</w:t>
             </w:r>
           </w:p>
         </w:tc>
@@ -5578,6 +5578,914 @@
       </w:pPr>
       <w:r>
         <w:t>ready_to_tag_v0.1.1 should occur only after all author confirmations, final figure/source-data freeze, clean worktree, and claim-integrity checks pass.</w:t>
+      </w:r>
+    </w:p>
+    <w:p>
+      <w:pPr>
+        <w:pStyle w:val="Heading1"/>
+      </w:pPr>
+      <w:r>
+        <w:t>Author declaration confirmation packet</w:t>
+      </w:r>
+    </w:p>
+    <w:p>
+      <w:pPr>
+        <w:pStyle w:val="Heading2"/>
+      </w:pPr>
+      <w:r>
+        <w:t>RMTGuard author declaration confirmation packet</w:t>
+      </w:r>
+    </w:p>
+    <w:p>
+      <w:r>
+        <w:t>Generated: 2026-05-12</w:t>
+      </w:r>
+    </w:p>
+    <w:p>
+      <w:r>
+        <w:t>Generated by python scripts/build_author_declaration_confirmation_packet.py.</w:t>
+      </w:r>
+    </w:p>
+    <w:p>
+      <w:pPr>
+        <w:pStyle w:val="Heading2"/>
+      </w:pPr>
+      <w:r>
+        <w:t>Purpose</w:t>
+      </w:r>
+    </w:p>
+    <w:p>
+      <w:r>
+        <w:t>This packet converts the remaining author-controlled manuscript blockers into exact confirmation questions. It is not a substitute for author approval and should not be treated as a journal-ready declaration until written confirmations are saved.</w:t>
+      </w:r>
+    </w:p>
+    <w:p>
+      <w:pPr>
+        <w:pStyle w:val="Heading2"/>
+      </w:pPr>
+      <w:r>
+        <w:t>Current Decision</w:t>
+      </w:r>
+    </w:p>
+    <w:p>
+      <w:pPr>
+        <w:pStyle w:val="ListBullet"/>
+      </w:pPr>
+      <w:r>
+        <w:t>Status: manual_confirmation_required.</w:t>
+      </w:r>
+    </w:p>
+    <w:p>
+      <w:pPr>
+        <w:pStyle w:val="ListBullet"/>
+      </w:pPr>
+      <w:r>
+        <w:t>Checklist: results/submission/author_declaration_confirmation_checklist.tsv</w:t>
+      </w:r>
+    </w:p>
+    <w:p>
+      <w:pPr>
+        <w:pStyle w:val="ListBullet"/>
+      </w:pPr>
+      <w:r>
+        <w:t>Word packet: output/doc/RMTGuard_author_declaration_confirmation_packet.docx</w:t>
+      </w:r>
+    </w:p>
+    <w:p>
+      <w:pPr>
+        <w:pStyle w:val="ListBullet"/>
+      </w:pPr>
+      <w:r>
+        <w:t>Confirmation items: 8</w:t>
+      </w:r>
+    </w:p>
+    <w:p>
+      <w:pPr>
+        <w:pStyle w:val="ListBullet"/>
+      </w:pPr>
+      <w:r>
+        <w:t>Stop-rule items: 8</w:t>
+      </w:r>
+    </w:p>
+    <w:p>
+      <w:pPr>
+        <w:pStyle w:val="Heading2"/>
+      </w:pPr>
+      <w:r>
+        <w:t>Confirmation Checklist</w:t>
+      </w:r>
+    </w:p>
+    <w:tbl>
+      <w:tblPr>
+        <w:tblStyle w:val="TableGrid"/>
+        <w:tblW w:type="auto" w:w="0"/>
+        <w:tblLook w:firstColumn="1" w:firstRow="1" w:lastColumn="0" w:lastRow="0" w:noHBand="0" w:noVBand="1" w:val="04A0"/>
+      </w:tblPr>
+      <w:tblGrid>
+        <w:gridCol w:w="2016"/>
+        <w:gridCol w:w="2016"/>
+        <w:gridCol w:w="2016"/>
+        <w:gridCol w:w="2016"/>
+        <w:gridCol w:w="2016"/>
+      </w:tblGrid>
+      <w:tr>
+        <w:tc>
+          <w:tcPr>
+            <w:tcW w:type="dxa" w:w="2016"/>
+          </w:tcPr>
+          <w:p>
+            <w:r>
+              <w:t>Item</w:t>
+            </w:r>
+          </w:p>
+        </w:tc>
+        <w:tc>
+          <w:tcPr>
+            <w:tcW w:type="dxa" w:w="2016"/>
+          </w:tcPr>
+          <w:p>
+            <w:r>
+              <w:t>Owner</w:t>
+            </w:r>
+          </w:p>
+        </w:tc>
+        <w:tc>
+          <w:tcPr>
+            <w:tcW w:type="dxa" w:w="2016"/>
+          </w:tcPr>
+          <w:p>
+            <w:r>
+              <w:t>Current status</w:t>
+            </w:r>
+          </w:p>
+        </w:tc>
+        <w:tc>
+          <w:tcPr>
+            <w:tcW w:type="dxa" w:w="2016"/>
+          </w:tcPr>
+          <w:p>
+            <w:r>
+              <w:t>Required action</w:t>
+            </w:r>
+          </w:p>
+        </w:tc>
+        <w:tc>
+          <w:tcPr>
+            <w:tcW w:type="dxa" w:w="2016"/>
+          </w:tcPr>
+          <w:p>
+            <w:r>
+              <w:t>Gate unblocked</w:t>
+            </w:r>
+          </w:p>
+        </w:tc>
+      </w:tr>
+      <w:tr>
+        <w:tc>
+          <w:tcPr>
+            <w:tcW w:type="dxa" w:w="2016"/>
+          </w:tcPr>
+          <w:p>
+            <w:r>
+              <w:t>postal_code_final</w:t>
+            </w:r>
+          </w:p>
+        </w:tc>
+        <w:tc>
+          <w:tcPr>
+            <w:tcW w:type="dxa" w:w="2016"/>
+          </w:tcPr>
+          <w:p>
+            <w:r>
+              <w:t>Chongfa Chen and corresponding authors</w:t>
+            </w:r>
+          </w:p>
+        </w:tc>
+        <w:tc>
+          <w:tcPr>
+            <w:tcW w:type="dxa" w:w="2016"/>
+          </w:tcPr>
+          <w:p>
+            <w:r>
+              <w:t>author_provided_conflicts_public_sources</w:t>
+            </w:r>
+          </w:p>
+        </w:tc>
+        <w:tc>
+          <w:tcPr>
+            <w:tcW w:type="dxa" w:w="2016"/>
+          </w:tcPr>
+          <w:p>
+            <w:r>
+              <w:t>Confirm the final postal code in writing; if 350000 is correct, explicitly state that it should override the public-source candidate.</w:t>
+            </w:r>
+          </w:p>
+        </w:tc>
+        <w:tc>
+          <w:tcPr>
+            <w:tcW w:type="dxa" w:w="2016"/>
+          </w:tcPr>
+          <w:p>
+            <w:r>
+              <w:t>author_declarations</w:t>
+            </w:r>
+          </w:p>
+        </w:tc>
+      </w:tr>
+      <w:tr>
+        <w:tc>
+          <w:tcPr>
+            <w:tcW w:type="dxa" w:w="2016"/>
+          </w:tcPr>
+          <w:p>
+            <w:r>
+              <w:t>credit_roles_all_authors</w:t>
+            </w:r>
+          </w:p>
+        </w:tc>
+        <w:tc>
+          <w:tcPr>
+            <w:tcW w:type="dxa" w:w="2016"/>
+          </w:tcPr>
+          <w:p>
+            <w:r>
+              <w:t>All authors</w:t>
+            </w:r>
+          </w:p>
+        </w:tc>
+        <w:tc>
+          <w:tcPr>
+            <w:tcW w:type="dxa" w:w="2016"/>
+          </w:tcPr>
+          <w:p>
+            <w:r>
+              <w:t>21 rows pending author confirmation</w:t>
+            </w:r>
+          </w:p>
+        </w:tc>
+        <w:tc>
+          <w:tcPr>
+            <w:tcW w:type="dxa" w:w="2016"/>
+          </w:tcPr>
+          <w:p>
+            <w:r>
+              <w:t>Each author should approve or edit their own role list before submission.</w:t>
+            </w:r>
+          </w:p>
+        </w:tc>
+        <w:tc>
+          <w:tcPr>
+            <w:tcW w:type="dxa" w:w="2016"/>
+          </w:tcPr>
+          <w:p>
+            <w:r>
+              <w:t>author_declarations</w:t>
+            </w:r>
+          </w:p>
+        </w:tc>
+      </w:tr>
+      <w:tr>
+        <w:tc>
+          <w:tcPr>
+            <w:tcW w:type="dxa" w:w="2016"/>
+          </w:tcPr>
+          <w:p>
+            <w:r>
+              <w:t>funding_statement_final</w:t>
+            </w:r>
+          </w:p>
+        </w:tc>
+        <w:tc>
+          <w:tcPr>
+            <w:tcW w:type="dxa" w:w="2016"/>
+          </w:tcPr>
+          <w:p>
+            <w:r>
+              <w:t>Corresponding authors</w:t>
+            </w:r>
+          </w:p>
+        </w:tc>
+        <w:tc>
+          <w:tcPr>
+            <w:tcW w:type="dxa" w:w="2016"/>
+          </w:tcPr>
+          <w:p>
+            <w:r>
+              <w:t>pending_author_content</w:t>
+            </w:r>
+          </w:p>
+        </w:tc>
+        <w:tc>
+          <w:tcPr>
+            <w:tcW w:type="dxa" w:w="2016"/>
+          </w:tcPr>
+          <w:p>
+            <w:r>
+              <w:t>Provide exact funder names and grant numbers, or confirm the no-specific-funding wording.</w:t>
+            </w:r>
+          </w:p>
+        </w:tc>
+        <w:tc>
+          <w:tcPr>
+            <w:tcW w:type="dxa" w:w="2016"/>
+          </w:tcPr>
+          <w:p>
+            <w:r>
+              <w:t>author_declarations</w:t>
+            </w:r>
+          </w:p>
+        </w:tc>
+      </w:tr>
+      <w:tr>
+        <w:tc>
+          <w:tcPr>
+            <w:tcW w:type="dxa" w:w="2016"/>
+          </w:tcPr>
+          <w:p>
+            <w:r>
+              <w:t>competing_interests_final</w:t>
+            </w:r>
+          </w:p>
+        </w:tc>
+        <w:tc>
+          <w:tcPr>
+            <w:tcW w:type="dxa" w:w="2016"/>
+          </w:tcPr>
+          <w:p>
+            <w:r>
+              <w:t>All authors</w:t>
+            </w:r>
+          </w:p>
+        </w:tc>
+        <w:tc>
+          <w:tcPr>
+            <w:tcW w:type="dxa" w:w="2016"/>
+          </w:tcPr>
+          <w:p>
+            <w:r>
+              <w:t>drafted_needs_author_confirmation</w:t>
+            </w:r>
+          </w:p>
+        </w:tc>
+        <w:tc>
+          <w:tcPr>
+            <w:tcW w:type="dxa" w:w="2016"/>
+          </w:tcPr>
+          <w:p>
+            <w:r>
+              <w:t>All authors should confirm or disclose conflicts before the statement is used.</w:t>
+            </w:r>
+          </w:p>
+        </w:tc>
+        <w:tc>
+          <w:tcPr>
+            <w:tcW w:type="dxa" w:w="2016"/>
+          </w:tcPr>
+          <w:p>
+            <w:r>
+              <w:t>author_declarations</w:t>
+            </w:r>
+          </w:p>
+        </w:tc>
+      </w:tr>
+      <w:tr>
+        <w:tc>
+          <w:tcPr>
+            <w:tcW w:type="dxa" w:w="2016"/>
+          </w:tcPr>
+          <w:p>
+            <w:r>
+              <w:t>ethics_public_data_final</w:t>
+            </w:r>
+          </w:p>
+        </w:tc>
+        <w:tc>
+          <w:tcPr>
+            <w:tcW w:type="dxa" w:w="2016"/>
+          </w:tcPr>
+          <w:p>
+            <w:r>
+              <w:t>Corresponding authors</w:t>
+            </w:r>
+          </w:p>
+        </w:tc>
+        <w:tc>
+          <w:tcPr>
+            <w:tcW w:type="dxa" w:w="2016"/>
+          </w:tcPr>
+          <w:p>
+            <w:r>
+              <w:t>drafted_from_project_scope</w:t>
+            </w:r>
+          </w:p>
+        </w:tc>
+        <w:tc>
+          <w:tcPr>
+            <w:tcW w:type="dxa" w:w="2016"/>
+          </w:tcPr>
+          <w:p>
+            <w:r>
+              <w:t>Confirm the final dataset list is public-data-only and that original studies reported consent/ethics where applicable.</w:t>
+            </w:r>
+          </w:p>
+        </w:tc>
+        <w:tc>
+          <w:tcPr>
+            <w:tcW w:type="dxa" w:w="2016"/>
+          </w:tcPr>
+          <w:p>
+            <w:r>
+              <w:t>author_declarations; reporting_summary</w:t>
+            </w:r>
+          </w:p>
+        </w:tc>
+      </w:tr>
+      <w:tr>
+        <w:tc>
+          <w:tcPr>
+            <w:tcW w:type="dxa" w:w="2016"/>
+          </w:tcPr>
+          <w:p>
+            <w:r>
+              <w:t>figure4_bounded_wording_ack</w:t>
+            </w:r>
+          </w:p>
+        </w:tc>
+        <w:tc>
+          <w:tcPr>
+            <w:tcW w:type="dxa" w:w="2016"/>
+          </w:tcPr>
+          <w:p>
+            <w:r>
+              <w:t>Yi Miao and Han Yan</w:t>
+            </w:r>
+          </w:p>
+        </w:tc>
+        <w:tc>
+          <w:tcPr>
+            <w:tcW w:type="dxa" w:w="2016"/>
+          </w:tcPr>
+          <w:p>
+            <w:r>
+              <w:t>proxy_authorized_working_assumption</w:t>
+            </w:r>
+          </w:p>
+        </w:tc>
+        <w:tc>
+          <w:tcPr>
+            <w:tcW w:type="dxa" w:w="2016"/>
+          </w:tcPr>
+          <w:p>
+            <w:r>
+              <w:t>Save written approval and record it with scripts/record_corresponding_author_signoff.py.</w:t>
+            </w:r>
+          </w:p>
+        </w:tc>
+        <w:tc>
+          <w:tcPr>
+            <w:tcW w:type="dxa" w:w="2016"/>
+          </w:tcPr>
+          <w:p>
+            <w:r>
+              <w:t>corresponding_author_figure4_ack; figure_caption_source_audit</w:t>
+            </w:r>
+          </w:p>
+        </w:tc>
+      </w:tr>
+      <w:tr>
+        <w:tc>
+          <w:tcPr>
+            <w:tcW w:type="dxa" w:w="2016"/>
+          </w:tcPr>
+          <w:p>
+            <w:r>
+              <w:t>reporting_summary_author_check</w:t>
+            </w:r>
+          </w:p>
+        </w:tc>
+        <w:tc>
+          <w:tcPr>
+            <w:tcW w:type="dxa" w:w="2016"/>
+          </w:tcPr>
+          <w:p>
+            <w:r>
+              <w:t>Corresponding authors</w:t>
+            </w:r>
+          </w:p>
+        </w:tc>
+        <w:tc>
+          <w:tcPr>
+            <w:tcW w:type="dxa" w:w="2016"/>
+          </w:tcPr>
+          <w:p>
+            <w:r>
+              <w:t>pending_author_verification</w:t>
+            </w:r>
+          </w:p>
+        </w:tc>
+        <w:tc>
+          <w:tcPr>
+            <w:tcW w:type="dxa" w:w="2016"/>
+          </w:tcPr>
+          <w:p>
+            <w:r>
+              <w:t>Check statistics, multiple testing, software, data availability, ethics, and AI-use entries against the final manuscript.</w:t>
+            </w:r>
+          </w:p>
+        </w:tc>
+        <w:tc>
+          <w:tcPr>
+            <w:tcW w:type="dxa" w:w="2016"/>
+          </w:tcPr>
+          <w:p>
+            <w:r>
+              <w:t>reporting_summary</w:t>
+            </w:r>
+          </w:p>
+        </w:tc>
+      </w:tr>
+      <w:tr>
+        <w:tc>
+          <w:tcPr>
+            <w:tcW w:type="dxa" w:w="2016"/>
+          </w:tcPr>
+          <w:p>
+            <w:r>
+              <w:t>title_page_author_metadata_check</w:t>
+            </w:r>
+          </w:p>
+        </w:tc>
+        <w:tc>
+          <w:tcPr>
+            <w:tcW w:type="dxa" w:w="2016"/>
+          </w:tcPr>
+          <w:p>
+            <w:r>
+              <w:t>All authors</w:t>
+            </w:r>
+          </w:p>
+        </w:tc>
+        <w:tc>
+          <w:tcPr>
+            <w:tcW w:type="dxa" w:w="2016"/>
+          </w:tcPr>
+          <w:p>
+            <w:r>
+              <w:t>author_provided_with_pending_checks</w:t>
+            </w:r>
+          </w:p>
+        </w:tc>
+        <w:tc>
+          <w:tcPr>
+            <w:tcW w:type="dxa" w:w="2016"/>
+          </w:tcPr>
+          <w:p>
+            <w:r>
+              <w:t>Confirm final author order, corresponding-author order, institutional name, emails, and ORCID IDs.</w:t>
+            </w:r>
+          </w:p>
+        </w:tc>
+        <w:tc>
+          <w:tcPr>
+            <w:tcW w:type="dxa" w:w="2016"/>
+          </w:tcPr>
+          <w:p>
+            <w:r>
+              <w:t>author_declarations</w:t>
+            </w:r>
+          </w:p>
+        </w:tc>
+      </w:tr>
+    </w:tbl>
+    <w:p>
+      <w:pPr>
+        <w:pStyle w:val="Heading2"/>
+      </w:pPr>
+      <w:r>
+        <w:t>Exact Confirmation Text To Send</w:t>
+      </w:r>
+    </w:p>
+    <w:p>
+      <w:r>
+        <w:t>Authors can reply by editing the text below or by sending written confirmation. Save replies under metadata/author_reply_evidence/.</w:t>
+      </w:r>
+    </w:p>
+    <w:p>
+      <w:pPr>
+        <w:pStyle w:val="Heading3"/>
+      </w:pPr>
+      <w:r>
+        <w:t>postal_code_final</w:t>
+      </w:r>
+    </w:p>
+    <w:p>
+      <w:r>
+        <w:t>Owner: Chongfa Chen and corresponding authors</w:t>
+      </w:r>
+    </w:p>
+    <w:p>
+      <w:r>
+        <w:t>Question: Which postal code should appear in the title page and submission metadata?</w:t>
+      </w:r>
+    </w:p>
+    <w:p>
+      <w:r>
+        <w:t>Current value: author_provided=350000; public_candidate=210019</w:t>
+      </w:r>
+    </w:p>
+    <w:p>
+      <w:r>
+        <w:t>Confirmation response:</w:t>
+      </w:r>
+    </w:p>
+    <w:p>
+      <w:r>
+        <w:rPr>
+          <w:rFonts w:ascii="Courier New" w:hAnsi="Courier New"/>
+          <w:sz w:val="17"/>
+        </w:rPr>
+        <w:t>I confirm this item as written.</w:t>
+      </w:r>
+    </w:p>
+    <w:p>
+      <w:r>
+        <w:rPr>
+          <w:rFonts w:ascii="Courier New" w:hAnsi="Courier New"/>
+          <w:sz w:val="17"/>
+        </w:rPr>
+        <w:t>OR</w:t>
+      </w:r>
+    </w:p>
+    <w:p>
+      <w:r>
+        <w:rPr>
+          <w:rFonts w:ascii="Courier New" w:hAnsi="Courier New"/>
+          <w:sz w:val="17"/>
+        </w:rPr>
+        <w:t>Please revise this item as follows: [author edits here].</w:t>
+      </w:r>
+    </w:p>
+    <w:p>
+      <w:r>
+        <w:t>Evidence to save: metadata/author_reply_evidence/postal_code_confirmation.*</w:t>
+      </w:r>
+    </w:p>
+    <w:p>
+      <w:pPr>
+        <w:pStyle w:val="Heading3"/>
+      </w:pPr>
+      <w:r>
+        <w:t>credit_roles_all_authors</w:t>
+      </w:r>
+    </w:p>
+    <w:p>
+      <w:r>
+        <w:t>Owner: All authors</w:t>
+      </w:r>
+    </w:p>
+    <w:p>
+      <w:r>
+        <w:t>Question: Do all authors approve these CRediT roles and contribution levels?</w:t>
+      </w:r>
+    </w:p>
+    <w:p>
+      <w:r>
+        <w:t>Current value: Chongfa Chen: Conceptualization (lead), Methodology (lead), Software (lead), Formal analysis (lead), Data curation (lead), Validation (lead), Visualization (lead), Writing - original draft (lead), Writing - review &amp; editing (lead) | Han Yan: Conceptualization (supporting), Methodology (supporting), Resources (supporting), Supervision (supporting), Validation (supporting), Writing - review &amp; editing (supporting) | Yi Miao: Conceptualization (supporting), Resources (lead), Supervision (lead), Project administration (lead), Writing - review &amp; editing (supporting), Funding acquisition (unknown)</w:t>
+      </w:r>
+    </w:p>
+    <w:p>
+      <w:r>
+        <w:t>Confirmation response:</w:t>
+      </w:r>
+    </w:p>
+    <w:p>
+      <w:r>
+        <w:rPr>
+          <w:rFonts w:ascii="Courier New" w:hAnsi="Courier New"/>
+          <w:sz w:val="17"/>
+        </w:rPr>
+        <w:t>I confirm this item as written.</w:t>
+      </w:r>
+    </w:p>
+    <w:p>
+      <w:r>
+        <w:rPr>
+          <w:rFonts w:ascii="Courier New" w:hAnsi="Courier New"/>
+          <w:sz w:val="17"/>
+        </w:rPr>
+        <w:t>OR</w:t>
+      </w:r>
+    </w:p>
+    <w:p>
+      <w:r>
+        <w:rPr>
+          <w:rFonts w:ascii="Courier New" w:hAnsi="Courier New"/>
+          <w:sz w:val="17"/>
+        </w:rPr>
+        <w:t>Please revise this item as follows: [author edits here].</w:t>
+      </w:r>
+    </w:p>
+    <w:p>
+      <w:r>
+        <w:t>Evidence to save: metadata/author_reply_evidence/credit_roles_confirmation.*</w:t>
+      </w:r>
+    </w:p>
+    <w:p>
+      <w:pPr>
+        <w:pStyle w:val="Heading3"/>
+      </w:pPr>
+      <w:r>
+        <w:t>funding_statement_final</w:t>
+      </w:r>
+    </w:p>
+    <w:p>
+      <w:r>
+        <w:t>Owner: Corresponding authors</w:t>
+      </w:r>
+    </w:p>
+    <w:p>
+      <w:r>
+        <w:t>Question: Was this work supported by specific grants or should we state that no specific funding was received?</w:t>
+      </w:r>
+    </w:p>
+    <w:p>
+      <w:r>
+        <w:t>Current value: TO CONFIRM: grant details or no specific funding.</w:t>
+      </w:r>
+    </w:p>
+    <w:p>
+      <w:r>
+        <w:t>Confirmation response:</w:t>
+      </w:r>
+    </w:p>
+    <w:p>
+      <w:r>
+        <w:rPr>
+          <w:rFonts w:ascii="Courier New" w:hAnsi="Courier New"/>
+          <w:sz w:val="17"/>
+        </w:rPr>
+        <w:t>I confirm this item as written.</w:t>
+      </w:r>
+    </w:p>
+    <w:p>
+      <w:r>
+        <w:rPr>
+          <w:rFonts w:ascii="Courier New" w:hAnsi="Courier New"/>
+          <w:sz w:val="17"/>
+        </w:rPr>
+        <w:t>OR</w:t>
+      </w:r>
+    </w:p>
+    <w:p>
+      <w:r>
+        <w:rPr>
+          <w:rFonts w:ascii="Courier New" w:hAnsi="Courier New"/>
+          <w:sz w:val="17"/>
+        </w:rPr>
+        <w:t>Please revise this item as follows: [author edits here].</w:t>
+      </w:r>
+    </w:p>
+    <w:p>
+      <w:r>
+        <w:t>Evidence to save: metadata/author_reply_evidence/funding_statement_confirmation.*</w:t>
+      </w:r>
+    </w:p>
+    <w:p>
+      <w:pPr>
+        <w:pStyle w:val="Heading3"/>
+      </w:pPr>
+      <w:r>
+        <w:t>competing_interests_final</w:t>
+      </w:r>
+    </w:p>
+    <w:p>
+      <w:r>
+        <w:t>Owner: All authors</w:t>
+      </w:r>
+    </w:p>
+    <w:p>
+      <w:r>
+        <w:t>Question: Can all authors confirm that there are no financial or non-financial competing interests?</w:t>
+      </w:r>
+    </w:p>
+    <w:p>
+      <w:r>
+        <w:t>Current value: The authors declare no competing interests.</w:t>
+      </w:r>
+    </w:p>
+    <w:p>
+      <w:r>
+        <w:t>Confirmation response:</w:t>
+      </w:r>
+    </w:p>
+    <w:p>
+      <w:r>
+        <w:rPr>
+          <w:rFonts w:ascii="Courier New" w:hAnsi="Courier New"/>
+          <w:sz w:val="17"/>
+        </w:rPr>
+        <w:t>I confirm this item as written.</w:t>
+      </w:r>
+    </w:p>
+    <w:p>
+      <w:r>
+        <w:rPr>
+          <w:rFonts w:ascii="Courier New" w:hAnsi="Courier New"/>
+          <w:sz w:val="17"/>
+        </w:rPr>
+        <w:t>OR</w:t>
+      </w:r>
+    </w:p>
+    <w:p>
+      <w:r>
+        <w:rPr>
+          <w:rFonts w:ascii="Courier New" w:hAnsi="Courier New"/>
+          <w:sz w:val="17"/>
+        </w:rPr>
+        <w:t>Please revise this item as follows: [author edits here].</w:t>
+      </w:r>
+    </w:p>
+    <w:p>
+      <w:r>
+        <w:t>Evidence to save: metadata/author_reply_evidence/competing_interests_confirmation.*</w:t>
+      </w:r>
+    </w:p>
+    <w:p>
+      <w:pPr>
+        <w:pStyle w:val="Heading3"/>
+      </w:pPr>
+      <w:r>
+        <w:t>ethics_public_data_final</w:t>
+      </w:r>
+    </w:p>
+    <w:p>
+      <w:r>
+        <w:t>Owner: Corresponding authors</w:t>
+      </w:r>
+    </w:p>
+    <w:p>
+      <w:r>
+        <w:t>Question: Can the corresponding authors confirm that the manuscript uses only public, de-identified datasets and no new private clinical data?</w:t>
+      </w:r>
+    </w:p>
+    <w:p>
+      <w:r>
+        <w:t>Current value: This study uses public, de-identified datasets and does not include newly collected private clinical data. Dataset-specific consent and ethics approvals were reported by the original studies.</w:t>
+      </w:r>
+    </w:p>
+    <w:p>
+      <w:r>
+        <w:t>Confirmation response:</w:t>
+      </w:r>
+    </w:p>
+    <w:p>
+      <w:r>
+        <w:rPr>
+          <w:rFonts w:ascii="Courier New" w:hAnsi="Courier New"/>
+          <w:sz w:val="17"/>
+        </w:rPr>
+        <w:t>I confirm this item as written.</w:t>
+      </w:r>
+    </w:p>
+    <w:p>
+      <w:r>
+        <w:rPr>
+          <w:rFonts w:ascii="Courier New" w:hAnsi="Courier New"/>
+          <w:sz w:val="17"/>
+        </w:rPr>
+        <w:t>OR</w:t>
+      </w:r>
+    </w:p>
+    <w:p>
+      <w:r>
+        <w:rPr>
+          <w:rFonts w:ascii="Courier New" w:hAnsi="Courier New"/>
+          <w:sz w:val="17"/>
+        </w:rPr>
+        <w:t>Please revise this item as follows: [author edits here].</w:t>
+      </w:r>
+    </w:p>
+    <w:p>
+      <w:r>
+        <w:t>Evidence to save: metadata/author_reply_evidence/ethics_public_data_confirmation.*</w:t>
+      </w:r>
+    </w:p>
+    <w:p>
+      <w:pPr>
+        <w:pStyle w:val="Heading3"/>
+      </w:pPr>
+      <w:r>
+        <w:t>figure4_bounded_wording_ack</w:t>
+      </w:r>
+    </w:p>
+    <w:p>
+      <w:r>
+        <w:t>Owner: Yi Miao and Han Yan</w:t>
+      </w:r>
+    </w:p>
+    <w:p>
+      <w:r>
+        <w:t>Question: Do the corresponding authors approve the bounded Figure 4 wording as a public-data use case with no mechanism or clinical claim?</w:t>
       </w:r>
     </w:p>
     <w:p>

</xml_diff>

<commit_message>
Refresh author declaration gate outputs
</commit_message>
<xml_diff>
--- a/output/doc/RMTGuard_external_review_packet_2026-05-12.docx
+++ b/output/doc/RMTGuard_external_review_packet_2026-05-12.docx
@@ -27,7 +27,7 @@
     </w:p>
     <w:p>
       <w:r>
-        <w:t>Generated: 2026-05-12 13:40:17</w:t>
+        <w:t>Generated: 2026-05-12 13:41:38</w:t>
       </w:r>
     </w:p>
     <w:tbl>
@@ -2527,7 +2527,7 @@
         <w:pStyle w:val="ListBullet"/>
       </w:pPr>
       <w:r>
-        <w:t>Commits after v0.1.0: 46.</w:t>
+        <w:t>Commits after v0.1.0: 49.</w:t>
       </w:r>
     </w:p>
     <w:p>
@@ -2535,7 +2535,7 @@
         <w:pStyle w:val="ListBullet"/>
       </w:pPr>
       <w:r>
-        <w:t>Changed files after v0.1.0: 260.</w:t>
+        <w:t>Changed files after v0.1.0: 264.</w:t>
       </w:r>
     </w:p>
     <w:p>
@@ -2543,7 +2543,7 @@
         <w:pStyle w:val="ListBullet"/>
       </w:pPr>
       <w:r>
-        <w:t>Manuscript-facing changed files: 250.</w:t>
+        <w:t>Manuscript-facing changed files: 254.</w:t>
       </w:r>
     </w:p>
     <w:p>
@@ -2714,7 +2714,7 @@
           </w:tcPr>
           <w:p>
             <w:r>
-              <w:t>171c0cf665ef8599a449bbb7f2952f0371f6c7d9</w:t>
+              <w:t>d70a84e8e8352c9cbcc5c3e3fe2d6f91821f49f4</w:t>
             </w:r>
           </w:p>
         </w:tc>
@@ -2734,7 +2734,7 @@
           </w:tcPr>
           <w:p>
             <w:r>
-              <w:t>46 commits after v0.1.0.</w:t>
+              <w:t>49 commits after v0.1.0.</w:t>
             </w:r>
           </w:p>
         </w:tc>
@@ -2818,7 +2818,7 @@
           </w:tcPr>
           <w:p>
             <w:r>
-              <w:t>250</w:t>
+              <w:t>254</w:t>
             </w:r>
           </w:p>
         </w:tc>
@@ -2922,7 +2922,7 @@
           </w:tcPr>
           <w:p>
             <w:r>
-              <w:t>50</w:t>
+              <w:t>51</w:t>
             </w:r>
           </w:p>
         </w:tc>
@@ -3189,7 +3189,7 @@
           </w:tcPr>
           <w:p>
             <w:r>
-              <w:t>3</w:t>
+              <w:t>4</w:t>
             </w:r>
           </w:p>
         </w:tc>
@@ -3343,7 +3343,7 @@
           </w:tcPr>
           <w:p>
             <w:r>
-              <w:t>46</w:t>
+              <w:t>47</w:t>
             </w:r>
           </w:p>
         </w:tc>
@@ -3453,7 +3453,7 @@
           </w:tcPr>
           <w:p>
             <w:r>
-              <w:t>53</w:t>
+              <w:t>54</w:t>
             </w:r>
           </w:p>
         </w:tc>
@@ -3475,7 +3475,7 @@
           </w:tcPr>
           <w:p>
             <w:r>
-              <w:t>38</w:t>
+              <w:t>39</w:t>
             </w:r>
           </w:p>
         </w:tc>
@@ -3560,7 +3560,7 @@
           </w:tcPr>
           <w:p>
             <w:r>
-              <w:t>218</w:t>
+              <w:t>222</w:t>
             </w:r>
           </w:p>
         </w:tc>
@@ -3934,7 +3934,7 @@
           </w:tcPr>
           <w:p>
             <w:r>
-              <w:t>M</w:t>
+              <w:t>A</w:t>
             </w:r>
           </w:p>
         </w:tc>
@@ -3954,7 +3954,7 @@
           </w:tcPr>
           <w:p>
             <w:r>
-              <w:t>docs/author_declarations_and_credit_roles.md</w:t>
+              <w:t>docs/author_declaration_confirmation_packet.md</w:t>
             </w:r>
           </w:p>
         </w:tc>
@@ -3986,7 +3986,7 @@
           </w:tcPr>
           <w:p>
             <w:r>
-              <w:t>docs/author_metadata_status.md</w:t>
+              <w:t>docs/author_declarations_and_credit_roles.md</w:t>
             </w:r>
           </w:p>
         </w:tc>
@@ -4018,7 +4018,7 @@
           </w:tcPr>
           <w:p>
             <w:r>
-              <w:t>docs/author_release_execution_packet.md</w:t>
+              <w:t>docs/author_metadata_status.md</w:t>
             </w:r>
           </w:p>
         </w:tc>
@@ -4030,7 +4030,7 @@
           </w:tcPr>
           <w:p>
             <w:r>
-              <w:t>A</w:t>
+              <w:t>M</w:t>
             </w:r>
           </w:p>
         </w:tc>
@@ -4050,7 +4050,7 @@
           </w:tcPr>
           <w:p>
             <w:r>
-              <w:t>docs/benchmark_upgrade_from_concord_sclens_2026-05-12.md</w:t>
+              <w:t>docs/author_release_execution_packet.md</w:t>
             </w:r>
           </w:p>
         </w:tc>
@@ -4062,7 +4062,7 @@
           </w:tcPr>
           <w:p>
             <w:r>
-              <w:t>M</w:t>
+              <w:t>A</w:t>
             </w:r>
           </w:p>
         </w:tc>
@@ -4082,7 +4082,7 @@
           </w:tcPr>
           <w:p>
             <w:r>
-              <w:t>docs/claim_boundary_lint.md</w:t>
+              <w:t>docs/benchmark_upgrade_from_concord_sclens_2026-05-12.md</w:t>
             </w:r>
           </w:p>
         </w:tc>
@@ -4114,7 +4114,7 @@
           </w:tcPr>
           <w:p>
             <w:r>
-              <w:t>docs/claim_traceability.md</w:t>
+              <w:t>docs/claim_boundary_lint.md</w:t>
             </w:r>
           </w:p>
         </w:tc>
@@ -4126,7 +4126,7 @@
           </w:tcPr>
           <w:p>
             <w:r>
-              <w:t>A</w:t>
+              <w:t>M</w:t>
             </w:r>
           </w:p>
         </w:tc>
@@ -4146,7 +4146,7 @@
           </w:tcPr>
           <w:p>
             <w:r>
-              <w:t>docs/competitor_positioning_concord_sclens_2026-05-12.md</w:t>
+              <w:t>docs/claim_traceability.md</w:t>
             </w:r>
           </w:p>
         </w:tc>
@@ -4158,7 +4158,7 @@
           </w:tcPr>
           <w:p>
             <w:r>
-              <w:t>M</w:t>
+              <w:t>A</w:t>
             </w:r>
           </w:p>
         </w:tc>
@@ -4178,7 +4178,7 @@
           </w:tcPr>
           <w:p>
             <w:r>
-              <w:t>docs/component_ablation_benchmark.md</w:t>
+              <w:t>docs/competitor_positioning_concord_sclens_2026-05-12.md</w:t>
             </w:r>
           </w:p>
         </w:tc>
@@ -4190,7 +4190,7 @@
           </w:tcPr>
           <w:p>
             <w:r>
-              <w:t>A</w:t>
+              <w:t>M</w:t>
             </w:r>
           </w:p>
         </w:tc>
@@ -4210,7 +4210,7 @@
           </w:tcPr>
           <w:p>
             <w:r>
-              <w:t>docs/corresponding_author_proxy_assumption.md</w:t>
+              <w:t>docs/component_ablation_benchmark.md</w:t>
             </w:r>
           </w:p>
         </w:tc>
@@ -4242,7 +4242,7 @@
           </w:tcPr>
           <w:p>
             <w:r>
-              <w:t>docs/corresponding_author_reply_intake_runbook.md</w:t>
+              <w:t>docs/corresponding_author_proxy_assumption.md</w:t>
             </w:r>
           </w:p>
         </w:tc>
@@ -4274,7 +4274,7 @@
           </w:tcPr>
           <w:p>
             <w:r>
-              <w:t>docs/corresponding_author_signoff_tracker.md</w:t>
+              <w:t>docs/corresponding_author_reply_intake_runbook.md</w:t>
             </w:r>
           </w:p>
         </w:tc>
@@ -4306,7 +4306,7 @@
           </w:tcPr>
           <w:p>
             <w:r>
-              <w:t>docs/current_evidence_freeze_2026-05-12.md</w:t>
+              <w:t>docs/corresponding_author_signoff_tracker.md</w:t>
             </w:r>
           </w:p>
         </w:tc>
@@ -4318,7 +4318,7 @@
           </w:tcPr>
           <w:p>
             <w:r>
-              <w:t>M</w:t>
+              <w:t>A</w:t>
             </w:r>
           </w:p>
         </w:tc>
@@ -4338,7 +4338,7 @@
           </w:tcPr>
           <w:p>
             <w:r>
-              <w:t>docs/editorial_presubmission_packet.md</w:t>
+              <w:t>docs/current_evidence_freeze_2026-05-12.md</w:t>
             </w:r>
           </w:p>
         </w:tc>
@@ -4350,7 +4350,7 @@
           </w:tcPr>
           <w:p>
             <w:r>
-              <w:t>A</w:t>
+              <w:t>M</w:t>
             </w:r>
           </w:p>
         </w:tc>
@@ -4370,7 +4370,7 @@
           </w:tcPr>
           <w:p>
             <w:r>
-              <w:t>docs/figure4_pdac_tme_wording_freeze.md</w:t>
+              <w:t>docs/editorial_presubmission_packet.md</w:t>
             </w:r>
           </w:p>
         </w:tc>
@@ -4402,7 +4402,7 @@
           </w:tcPr>
           <w:p>
             <w:r>
-              <w:t>docs/figure4_strengthened_text_audit.md</w:t>
+              <w:t>docs/figure4_pdac_tme_wording_freeze.md</w:t>
             </w:r>
           </w:p>
         </w:tc>
@@ -4434,7 +4434,7 @@
           </w:tcPr>
           <w:p>
             <w:r>
-              <w:t>docs/figure_caption_source_audit.md</w:t>
+              <w:t>docs/figure4_strengthened_text_audit.md</w:t>
             </w:r>
           </w:p>
         </w:tc>
@@ -4466,7 +4466,7 @@
           </w:tcPr>
           <w:p>
             <w:r>
-              <w:t>docs/genome_biology_fallback_v2_packet.md</w:t>
+              <w:t>docs/figure_caption_source_audit.md</w:t>
             </w:r>
           </w:p>
         </w:tc>
@@ -4478,7 +4478,7 @@
           </w:tcPr>
           <w:p>
             <w:r>
-              <w:t>M</w:t>
+              <w:t>A</w:t>
             </w:r>
           </w:p>
         </w:tc>
@@ -4498,7 +4498,7 @@
           </w:tcPr>
           <w:p>
             <w:r>
-              <w:t>docs/jif20_50_gap_assessment.md</w:t>
+              <w:t>docs/genome_biology_fallback_v2_packet.md</w:t>
             </w:r>
           </w:p>
         </w:tc>
@@ -4530,7 +4530,7 @@
           </w:tcPr>
           <w:p>
             <w:r>
-              <w:t>docs/manual_author_execution_steps.md</w:t>
+              <w:t>docs/jif20_50_gap_assessment.md</w:t>
             </w:r>
           </w:p>
         </w:tc>
@@ -4542,7 +4542,7 @@
           </w:tcPr>
           <w:p>
             <w:r>
-              <w:t>A</w:t>
+              <w:t>M</w:t>
             </w:r>
           </w:p>
         </w:tc>
@@ -4562,7 +4562,7 @@
           </w:tcPr>
           <w:p>
             <w:r>
-              <w:t>docs/manual_next_actions_20_50.md</w:t>
+              <w:t>docs/manual_author_execution_steps.md</w:t>
             </w:r>
           </w:p>
         </w:tc>
@@ -4594,7 +4594,7 @@
           </w:tcPr>
           <w:p>
             <w:r>
-              <w:t>docs/manuscript_grade_null_power_grid_design.md</w:t>
+              <w:t>docs/manual_next_actions_20_50.md</w:t>
             </w:r>
           </w:p>
         </w:tc>
@@ -4626,7 +4626,7 @@
           </w:tcPr>
           <w:p>
             <w:r>
-              <w:t>docs/mentor_journal_decision_2026-05-10.md</w:t>
+              <w:t>docs/manuscript_grade_null_power_grid_design.md</w:t>
             </w:r>
           </w:p>
         </w:tc>
@@ -4658,7 +4658,7 @@
           </w:tcPr>
           <w:p>
             <w:r>
-              <w:t>docs/nature_methods_48h_execution_packet.md</w:t>
+              <w:t>docs/mentor_journal_decision_2026-05-10.md</w:t>
             </w:r>
           </w:p>
         </w:tc>
@@ -4690,7 +4690,7 @@
           </w:tcPr>
           <w:p>
             <w:r>
-              <w:t>docs/nature_methods_go_no_go_final.md</w:t>
+              <w:t>docs/nature_methods_48h_execution_packet.md</w:t>
             </w:r>
           </w:p>
         </w:tc>
@@ -4722,7 +4722,7 @@
           </w:tcPr>
           <w:p>
             <w:r>
-              <w:t>docs/nature_methods_next_round_gate_board.md</w:t>
+              <w:t>docs/nature_methods_go_no_go_final.md</w:t>
             </w:r>
           </w:p>
         </w:tc>
@@ -4754,7 +4754,7 @@
           </w:tcPr>
           <w:p>
             <w:r>
-              <w:t>docs/nature_methods_official_route_verification.md</w:t>
+              <w:t>docs/nature_methods_next_round_gate_board.md</w:t>
             </w:r>
           </w:p>
         </w:tc>
@@ -4786,7 +4786,7 @@
           </w:tcPr>
           <w:p>
             <w:r>
-              <w:t>docs/nature_methods_presubmission_send_runbook.md</w:t>
+              <w:t>docs/nature_methods_official_route_verification.md</w:t>
             </w:r>
           </w:p>
         </w:tc>
@@ -4798,7 +4798,7 @@
           </w:tcPr>
           <w:p>
             <w:r>
-              <w:t>M</w:t>
+              <w:t>A</w:t>
             </w:r>
           </w:p>
         </w:tc>
@@ -4818,7 +4818,7 @@
           </w:tcPr>
           <w:p>
             <w:r>
-              <w:t>docs/nature_reporting_summary_draft.md</w:t>
+              <w:t>docs/nature_methods_presubmission_send_runbook.md</w:t>
             </w:r>
           </w:p>
         </w:tc>
@@ -4850,7 +4850,7 @@
           </w:tcPr>
           <w:p>
             <w:r>
-              <w:t>docs/no_call_decision_map.md</w:t>
+              <w:t>docs/nature_reporting_summary_draft.md</w:t>
             </w:r>
           </w:p>
         </w:tc>
@@ -4862,7 +4862,7 @@
           </w:tcPr>
           <w:p>
             <w:r>
-              <w:t>A</w:t>
+              <w:t>M</w:t>
             </w:r>
           </w:p>
         </w:tc>
@@ -4882,7 +4882,7 @@
           </w:tcPr>
           <w:p>
             <w:r>
-              <w:t>docs/p0_benchmark_upgrade_status_2026-05-12.md</w:t>
+              <w:t>docs/no_call_decision_map.md</w:t>
             </w:r>
           </w:p>
         </w:tc>
@@ -4914,7 +4914,7 @@
           </w:tcPr>
           <w:p>
             <w:r>
-              <w:t>docs/p0_component_ablation_run_sheet.md</w:t>
+              <w:t>docs/p0_benchmark_upgrade_status_2026-05-12.md</w:t>
             </w:r>
           </w:p>
         </w:tc>
@@ -5542,7 +5542,7 @@
           </w:tcPr>
           <w:p>
             <w:r>
-              <w:t>M Makefile; M README.md; M docs/current_evidence_freeze_2026-05-12.md; M docs/shared_info_export_manifest.md; M figures/project_management/rmtguard_project_gantt.pdf; M figures/project_management/rmtguard_project_gantt.png; M output/doc/RMTGuard_external_review_packet_2026-05-12.docx; M results/project_management/rmtguard_project_gantt.md; M results/project_management/rmtguard_project_gantt.tsv; M results/shared_info/rmtguard_shared_export_manifest.tsv; M results/submission/current_evidence_freeze_manifest.tsv; M scripts/build_current_evidence_freeze.py; M scripts/build_external_review_docx.py; M scripts/build_project_gantt.py; M scripts/build_v0_1_1_release_preflight.py; M scripts/export_shared_project_info.py;?? docs/author_declaration_confirmation_packet.md;?? output/doc/RMTGuard_author_declaration_confirmation_packet.docx;?? scripts/build_author_declaration_confirmation_packet.py</w:t>
+              <w:t>M docs/post_release_version_coverage_audit.md; M output/doc/RMTGuard_author_declaration_confirmation_packet.docx; M results/submission/post_release_changed_files.tsv; M results/submission/post_release_version_coverage_audit.tsv</w:t>
             </w:r>
           </w:p>
         </w:tc>

</xml_diff>

<commit_message>
Add high-impact submission dashboard
</commit_message>
<xml_diff>
--- a/output/doc/RMTGuard_external_review_packet_2026-05-12.docx
+++ b/output/doc/RMTGuard_external_review_packet_2026-05-12.docx
@@ -27,7 +27,7 @@
     </w:p>
     <w:p>
       <w:r>
-        <w:t>Generated: 2026-05-12 13:41:38</w:t>
+        <w:t>Generated: 2026-05-12 13:48:31</w:t>
       </w:r>
     </w:p>
     <w:tbl>
@@ -221,7 +221,7 @@
       <w:r>
         <w:drawing>
           <wp:inline xmlns:a="http://schemas.openxmlformats.org/drawingml/2006/main" xmlns:pic="http://schemas.openxmlformats.org/drawingml/2006/picture">
-            <wp:extent cx="5120640" cy="8619872"/>
+            <wp:extent cx="5120640" cy="8776485"/>
             <wp:docPr id="1" name="Picture 1"/>
             <wp:cNvGraphicFramePr>
               <a:graphicFrameLocks noChangeAspect="1"/>
@@ -242,7 +242,7 @@
                   <pic:spPr>
                     <a:xfrm>
                       <a:off x="0" y="0"/>
-                      <a:ext cx="5120640" cy="8619872"/>
+                      <a:ext cx="5120640" cy="8776485"/>
                     </a:xfrm>
                     <a:prstGeom prst="rect"/>
                   </pic:spPr>
@@ -330,7 +330,7 @@
         <w:pStyle w:val="ListBullet"/>
       </w:pPr>
       <w:r>
-        <w:t>Items checked: 32</w:t>
+        <w:t>Items checked: 33</w:t>
       </w:r>
     </w:p>
     <w:p>
@@ -378,7 +378,7 @@
         <w:pStyle w:val="ListBullet"/>
       </w:pPr>
       <w:r>
-        <w:t>journal_route: 3</w:t>
+        <w:t>journal_route: 4</w:t>
       </w:r>
     </w:p>
     <w:p>
@@ -499,6 +499,1626 @@
     <w:p>
       <w:r>
         <w:t xml:space="preserve">  Nature Methods remains the preferred route.</w:t>
+      </w:r>
+    </w:p>
+    <w:p>
+      <w:pPr>
+        <w:pStyle w:val="Heading1"/>
+      </w:pPr>
+      <w:r>
+        <w:t>High-impact submission dashboard</w:t>
+      </w:r>
+    </w:p>
+    <w:p>
+      <w:pPr>
+        <w:pStyle w:val="Heading2"/>
+      </w:pPr>
+      <w:r>
+        <w:t>RMTGuard high-impact submission dashboard</w:t>
+      </w:r>
+    </w:p>
+    <w:p>
+      <w:r>
+        <w:t>Generated: 2026-05-12</w:t>
+      </w:r>
+    </w:p>
+    <w:p>
+      <w:r>
+        <w:t>Generated by python scripts/build_high_impact_submission_dashboard.py.</w:t>
+      </w:r>
+    </w:p>
+    <w:p>
+      <w:pPr>
+        <w:pStyle w:val="Heading2"/>
+      </w:pPr>
+      <w:r>
+        <w:t>Mentor Decision</w:t>
+      </w:r>
+    </w:p>
+    <w:p>
+      <w:pPr>
+        <w:pStyle w:val="ListBullet"/>
+      </w:pPr>
+      <w:r>
+        <w:t>Current action: continue_development_do_not_submit.</w:t>
+      </w:r>
+    </w:p>
+    <w:p>
+      <w:pPr>
+        <w:pStyle w:val="ListBullet"/>
+      </w:pPr>
+      <w:r>
+        <w:t>Strict 20-50 JIF route: Nature Methods only after gate recovery.</w:t>
+      </w:r>
+    </w:p>
+    <w:p>
+      <w:pPr>
+        <w:pStyle w:val="ListBullet"/>
+      </w:pPr>
+      <w:r>
+        <w:t>Realistic fallback: Genome Biology-style reproducible workflow, if strict 20-50 is relaxed.</w:t>
+      </w:r>
+    </w:p>
+    <w:p>
+      <w:pPr>
+        <w:pStyle w:val="ListBullet"/>
+      </w:pPr>
+      <w:r>
+        <w:t>Acceptance guarantee: impossible.</w:t>
+      </w:r>
+    </w:p>
+    <w:p>
+      <w:pPr>
+        <w:pStyle w:val="Heading2"/>
+      </w:pPr>
+      <w:r>
+        <w:t>Severity Counts</w:t>
+      </w:r>
+    </w:p>
+    <w:p>
+      <w:pPr>
+        <w:pStyle w:val="ListBullet"/>
+      </w:pPr>
+      <w:r>
+        <w:t>controlled: 4</w:t>
+      </w:r>
+    </w:p>
+    <w:p>
+      <w:pPr>
+        <w:pStyle w:val="ListBullet"/>
+      </w:pPr>
+      <w:r>
+        <w:t>controlled_with_boundary: 1</w:t>
+      </w:r>
+    </w:p>
+    <w:p>
+      <w:pPr>
+        <w:pStyle w:val="ListBullet"/>
+      </w:pPr>
+      <w:r>
+        <w:t>fallback_ready_with_reframe: 1</w:t>
+      </w:r>
+    </w:p>
+    <w:p>
+      <w:pPr>
+        <w:pStyle w:val="ListBullet"/>
+      </w:pPr>
+      <w:r>
+        <w:t>hard_stop: 2</w:t>
+      </w:r>
+    </w:p>
+    <w:p>
+      <w:pPr>
+        <w:pStyle w:val="ListBullet"/>
+      </w:pPr>
+      <w:r>
+        <w:t>major_hold: 1</w:t>
+      </w:r>
+    </w:p>
+    <w:p>
+      <w:pPr>
+        <w:pStyle w:val="ListBullet"/>
+      </w:pPr>
+      <w:r>
+        <w:t>manual_blocker: 3</w:t>
+      </w:r>
+    </w:p>
+    <w:p>
+      <w:pPr>
+        <w:pStyle w:val="ListBullet"/>
+      </w:pPr>
+      <w:r>
+        <w:t>manual_hold: 2</w:t>
+      </w:r>
+    </w:p>
+    <w:p>
+      <w:pPr>
+        <w:pStyle w:val="ListBullet"/>
+      </w:pPr>
+      <w:r>
+        <w:t>release_hold: 1</w:t>
+      </w:r>
+    </w:p>
+    <w:p>
+      <w:pPr>
+        <w:pStyle w:val="ListBullet"/>
+      </w:pPr>
+      <w:r>
+        <w:t>science_gap: 1</w:t>
+      </w:r>
+    </w:p>
+    <w:p>
+      <w:pPr>
+        <w:pStyle w:val="Heading2"/>
+      </w:pPr>
+      <w:r>
+        <w:t>Dashboard</w:t>
+      </w:r>
+    </w:p>
+    <w:tbl>
+      <w:tblPr>
+        <w:tblStyle w:val="TableGrid"/>
+        <w:tblW w:type="auto" w:w="0"/>
+        <w:tblLook w:firstColumn="1" w:firstRow="1" w:lastColumn="0" w:lastRow="0" w:noHBand="0" w:noVBand="1" w:val="04A0"/>
+      </w:tblPr>
+      <w:tblGrid>
+        <w:gridCol w:w="1680"/>
+        <w:gridCol w:w="1680"/>
+        <w:gridCol w:w="1680"/>
+        <w:gridCol w:w="1680"/>
+        <w:gridCol w:w="1680"/>
+        <w:gridCol w:w="1680"/>
+      </w:tblGrid>
+      <w:tr>
+        <w:tc>
+          <w:tcPr>
+            <w:tcW w:type="dxa" w:w="1680"/>
+          </w:tcPr>
+          <w:p>
+            <w:r>
+              <w:t>Lane</w:t>
+            </w:r>
+          </w:p>
+        </w:tc>
+        <w:tc>
+          <w:tcPr>
+            <w:tcW w:type="dxa" w:w="1680"/>
+          </w:tcPr>
+          <w:p>
+            <w:r>
+              <w:t>Status</w:t>
+            </w:r>
+          </w:p>
+        </w:tc>
+        <w:tc>
+          <w:tcPr>
+            <w:tcW w:type="dxa" w:w="1680"/>
+          </w:tcPr>
+          <w:p>
+            <w:r>
+              <w:t>Severity</w:t>
+            </w:r>
+          </w:p>
+        </w:tc>
+        <w:tc>
+          <w:tcPr>
+            <w:tcW w:type="dxa" w:w="1680"/>
+          </w:tcPr>
+          <w:p>
+            <w:r>
+              <w:t>Blocker</w:t>
+            </w:r>
+          </w:p>
+        </w:tc>
+        <w:tc>
+          <w:tcPr>
+            <w:tcW w:type="dxa" w:w="1680"/>
+          </w:tcPr>
+          <w:p>
+            <w:r>
+              <w:t>Next action</w:t>
+            </w:r>
+          </w:p>
+        </w:tc>
+        <w:tc>
+          <w:tcPr>
+            <w:tcW w:type="dxa" w:w="1680"/>
+          </w:tcPr>
+          <w:p>
+            <w:r>
+              <w:t>Owner</w:t>
+            </w:r>
+          </w:p>
+        </w:tc>
+      </w:tr>
+      <w:tr>
+        <w:tc>
+          <w:tcPr>
+            <w:tcW w:type="dxa" w:w="1680"/>
+          </w:tcPr>
+          <w:p>
+            <w:r>
+              <w:t>overall_20_50_readiness</w:t>
+            </w:r>
+          </w:p>
+        </w:tc>
+        <w:tc>
+          <w:tcPr>
+            <w:tcW w:type="dxa" w:w="1680"/>
+          </w:tcPr>
+          <w:p>
+            <w:r>
+              <w:t>strong_but_blocked</w:t>
+            </w:r>
+          </w:p>
+        </w:tc>
+        <w:tc>
+          <w:tcPr>
+            <w:tcW w:type="dxa" w:w="1680"/>
+          </w:tcPr>
+          <w:p>
+            <w:r>
+              <w:t>major_hold</w:t>
+            </w:r>
+          </w:p>
+        </w:tc>
+        <w:tc>
+          <w:tcPr>
+            <w:tcW w:type="dxa" w:w="1680"/>
+          </w:tcPr>
+          <w:p>
+            <w:r>
+              <w:t>readiness=90/100; strict 20-50 status remains not ready</w:t>
+            </w:r>
+          </w:p>
+        </w:tc>
+        <w:tc>
+          <w:tcPr>
+            <w:tcW w:type="dxa" w:w="1680"/>
+          </w:tcPr>
+          <w:p>
+            <w:r>
+              <w:t>Treat Nature Methods as the only strict 20-50 target and keep Genome Biology as fallback.</w:t>
+            </w:r>
+          </w:p>
+        </w:tc>
+        <w:tc>
+          <w:tcPr>
+            <w:tcW w:type="dxa" w:w="1680"/>
+          </w:tcPr>
+          <w:p>
+            <w:r>
+              <w:t>Codex + authors</w:t>
+            </w:r>
+          </w:p>
+        </w:tc>
+      </w:tr>
+      <w:tr>
+        <w:tc>
+          <w:tcPr>
+            <w:tcW w:type="dxa" w:w="1680"/>
+          </w:tcPr>
+          <w:p>
+            <w:r>
+              <w:t>nature_methods_full_submission</w:t>
+            </w:r>
+          </w:p>
+        </w:tc>
+        <w:tc>
+          <w:tcPr>
+            <w:tcW w:type="dxa" w:w="1680"/>
+          </w:tcPr>
+          <w:p>
+            <w:r>
+              <w:t>no_go</w:t>
+            </w:r>
+          </w:p>
+        </w:tc>
+        <w:tc>
+          <w:tcPr>
+            <w:tcW w:type="dxa" w:w="1680"/>
+          </w:tcPr>
+          <w:p>
+            <w:r>
+              <w:t>hard_stop</w:t>
+            </w:r>
+          </w:p>
+        </w:tc>
+        <w:tc>
+          <w:tcPr>
+            <w:tcW w:type="dxa" w:w="1680"/>
+          </w:tcPr>
+          <w:p>
+            <w:r>
+              <w:t>Full submission remains blocked because active blockers include stability_advantage;PDAC_TME_corresponding_author_acknowledgement;editorial_send_status;nature_methods_route.</w:t>
+            </w:r>
+          </w:p>
+        </w:tc>
+        <w:tc>
+          <w:tcPr>
+            <w:tcW w:type="dxa" w:w="1680"/>
+          </w:tcPr>
+          <w:p>
+            <w:r>
+              <w:t>Do not submit a full manuscript until stability-superiority claims are removed or new evidence supports them, and final source-data/reporting-summary checks are frozen.</w:t>
+            </w:r>
+          </w:p>
+        </w:tc>
+        <w:tc>
+          <w:tcPr>
+            <w:tcW w:type="dxa" w:w="1680"/>
+          </w:tcPr>
+          <w:p>
+            <w:r>
+              <w:t>Codex + corresponding authors</w:t>
+            </w:r>
+          </w:p>
+        </w:tc>
+      </w:tr>
+      <w:tr>
+        <w:tc>
+          <w:tcPr>
+            <w:tcW w:type="dxa" w:w="1680"/>
+          </w:tcPr>
+          <w:p>
+            <w:r>
+              <w:t>nature_methods_presubmission</w:t>
+            </w:r>
+          </w:p>
+        </w:tc>
+        <w:tc>
+          <w:tcPr>
+            <w:tcW w:type="dxa" w:w="1680"/>
+          </w:tcPr>
+          <w:p>
+            <w:r>
+              <w:t>conditional_go_after_author_ack</w:t>
+            </w:r>
+          </w:p>
+        </w:tc>
+        <w:tc>
+          <w:tcPr>
+            <w:tcW w:type="dxa" w:w="1680"/>
+          </w:tcPr>
+          <w:p>
+            <w:r>
+              <w:t>manual_hold</w:t>
+            </w:r>
+          </w:p>
+        </w:tc>
+        <w:tc>
+          <w:tcPr>
+            <w:tcW w:type="dxa" w:w="1680"/>
+          </w:tcPr>
+          <w:p>
+            <w:r>
+              <w:t>Readiness score is 90/100; release status is pass; claim lint violations=0; traceability violations=0; Figure 4 wording freeze present=True; send_status=do_not_send; author_acknowledgement=pending_author_reply (0/2); proxy_working_assumption=2/2.</w:t>
+            </w:r>
+          </w:p>
+        </w:tc>
+        <w:tc>
+          <w:tcPr>
+            <w:tcW w:type="dxa" w:w="1680"/>
+          </w:tcPr>
+          <w:p>
+            <w:r>
+              <w:t>Obtain corresponding-author Figure 4 acknowledgement, then do one final route-policy check.</w:t>
+            </w:r>
+          </w:p>
+        </w:tc>
+        <w:tc>
+          <w:tcPr>
+            <w:tcW w:type="dxa" w:w="1680"/>
+          </w:tcPr>
+          <w:p>
+            <w:r>
+              <w:t>Corresponding authors</w:t>
+            </w:r>
+          </w:p>
+        </w:tc>
+      </w:tr>
+      <w:tr>
+        <w:tc>
+          <w:tcPr>
+            <w:tcW w:type="dxa" w:w="1680"/>
+          </w:tcPr>
+          <w:p>
+            <w:r>
+              <w:t>genome_biology_fallback</w:t>
+            </w:r>
+          </w:p>
+        </w:tc>
+        <w:tc>
+          <w:tcPr>
+            <w:tcW w:type="dxa" w:w="1680"/>
+          </w:tcPr>
+          <w:p>
+            <w:r>
+              <w:t>ready_if_nature_methods_not_encouraging</w:t>
+            </w:r>
+          </w:p>
+        </w:tc>
+        <w:tc>
+          <w:tcPr>
+            <w:tcW w:type="dxa" w:w="1680"/>
+          </w:tcPr>
+          <w:p>
+            <w:r>
+              <w:t>fallback_ready_with_reframe</w:t>
+            </w:r>
+          </w:p>
+        </w:tc>
+        <w:tc>
+          <w:tcPr>
+            <w:tcW w:type="dxa" w:w="1680"/>
+          </w:tcPr>
+          <w:p>
+            <w:r>
+              <w:t>Fallback is scientifically realistic but not strict 20-50 by current JIF.</w:t>
+            </w:r>
+          </w:p>
+        </w:tc>
+        <w:tc>
+          <w:tcPr>
+            <w:tcW w:type="dxa" w:w="1680"/>
+          </w:tcPr>
+          <w:p>
+            <w:r>
+              <w:t>Keep a Genome Biology-style reproducible workflow framing ready.</w:t>
+            </w:r>
+          </w:p>
+        </w:tc>
+        <w:tc>
+          <w:tcPr>
+            <w:tcW w:type="dxa" w:w="1680"/>
+          </w:tcPr>
+          <w:p>
+            <w:r>
+              <w:t>Codex</w:t>
+            </w:r>
+          </w:p>
+        </w:tc>
+      </w:tr>
+      <w:tr>
+        <w:tc>
+          <w:tcPr>
+            <w:tcW w:type="dxa" w:w="1680"/>
+          </w:tcPr>
+          <w:p>
+            <w:r>
+              <w:t>author_declarations</w:t>
+            </w:r>
+          </w:p>
+        </w:tc>
+        <w:tc>
+          <w:tcPr>
+            <w:tcW w:type="dxa" w:w="1680"/>
+          </w:tcPr>
+          <w:p>
+            <w:r>
+              <w:t>blocked</w:t>
+            </w:r>
+          </w:p>
+        </w:tc>
+        <w:tc>
+          <w:tcPr>
+            <w:tcW w:type="dxa" w:w="1680"/>
+          </w:tcPr>
+          <w:p>
+            <w:r>
+              <w:t>manual_blocker</w:t>
+            </w:r>
+          </w:p>
+        </w:tc>
+        <w:tc>
+          <w:tcPr>
+            <w:tcW w:type="dxa" w:w="1680"/>
+          </w:tcPr>
+          <w:p>
+            <w:r>
+              <w:t>8 author-confirmation items remain.</w:t>
+            </w:r>
+          </w:p>
+        </w:tc>
+        <w:tc>
+          <w:tcPr>
+            <w:tcW w:type="dxa" w:w="1680"/>
+          </w:tcPr>
+          <w:p>
+            <w:r>
+              <w:t>Send/verify the author declaration confirmation packet and save written replies.</w:t>
+            </w:r>
+          </w:p>
+        </w:tc>
+        <w:tc>
+          <w:tcPr>
+            <w:tcW w:type="dxa" w:w="1680"/>
+          </w:tcPr>
+          <w:p>
+            <w:r>
+              <w:t>All authors</w:t>
+            </w:r>
+          </w:p>
+        </w:tc>
+      </w:tr>
+      <w:tr>
+        <w:tc>
+          <w:tcPr>
+            <w:tcW w:type="dxa" w:w="1680"/>
+          </w:tcPr>
+          <w:p>
+            <w:r>
+              <w:t>figure4_author_acknowledgement</w:t>
+            </w:r>
+          </w:p>
+        </w:tc>
+        <w:tc>
+          <w:tcPr>
+            <w:tcW w:type="dxa" w:w="1680"/>
+          </w:tcPr>
+          <w:p>
+            <w:r>
+              <w:t>blocked</w:t>
+            </w:r>
+          </w:p>
+        </w:tc>
+        <w:tc>
+          <w:tcPr>
+            <w:tcW w:type="dxa" w:w="1680"/>
+          </w:tcPr>
+          <w:p>
+            <w:r>
+              <w:t>manual_blocker</w:t>
+            </w:r>
+          </w:p>
+        </w:tc>
+        <w:tc>
+          <w:tcPr>
+            <w:tcW w:type="dxa" w:w="1680"/>
+          </w:tcPr>
+          <w:p>
+            <w:r>
+              <w:t>1 display item needs author acknowledgement.</w:t>
+            </w:r>
+          </w:p>
+        </w:tc>
+        <w:tc>
+          <w:tcPr>
+            <w:tcW w:type="dxa" w:w="1680"/>
+          </w:tcPr>
+          <w:p>
+            <w:r>
+              <w:t>Yi Miao and Han Yan must confirm bounded Figure 4 wording in writing.</w:t>
+            </w:r>
+          </w:p>
+        </w:tc>
+        <w:tc>
+          <w:tcPr>
+            <w:tcW w:type="dxa" w:w="1680"/>
+          </w:tcPr>
+          <w:p>
+            <w:r>
+              <w:t>Yi Miao; Han Yan</w:t>
+            </w:r>
+          </w:p>
+        </w:tc>
+      </w:tr>
+      <w:tr>
+        <w:tc>
+          <w:tcPr>
+            <w:tcW w:type="dxa" w:w="1680"/>
+          </w:tcPr>
+          <w:p>
+            <w:r>
+              <w:t>reporting_summary</w:t>
+            </w:r>
+          </w:p>
+        </w:tc>
+        <w:tc>
+          <w:tcPr>
+            <w:tcW w:type="dxa" w:w="1680"/>
+          </w:tcPr>
+          <w:p>
+            <w:r>
+              <w:t>pending_author_verification</w:t>
+            </w:r>
+          </w:p>
+        </w:tc>
+        <w:tc>
+          <w:tcPr>
+            <w:tcW w:type="dxa" w:w="1680"/>
+          </w:tcPr>
+          <w:p>
+            <w:r>
+              <w:t>manual_blocker</w:t>
+            </w:r>
+          </w:p>
+        </w:tc>
+        <w:tc>
+          <w:tcPr>
+            <w:tcW w:type="dxa" w:w="1680"/>
+          </w:tcPr>
+          <w:p>
+            <w:r>
+              <w:t>2 reporting-summary rows need author/manual verification.</w:t>
+            </w:r>
+          </w:p>
+        </w:tc>
+        <w:tc>
+          <w:tcPr>
+            <w:tcW w:type="dxa" w:w="1680"/>
+          </w:tcPr>
+          <w:p>
+            <w:r>
+              <w:t>Verify statistics, multiple testing, software, data availability, ethics, and AI-use rows.</w:t>
+            </w:r>
+          </w:p>
+        </w:tc>
+        <w:tc>
+          <w:tcPr>
+            <w:tcW w:type="dxa" w:w="1680"/>
+          </w:tcPr>
+          <w:p>
+            <w:r>
+              <w:t>Corresponding authors</w:t>
+            </w:r>
+          </w:p>
+        </w:tc>
+      </w:tr>
+      <w:tr>
+        <w:tc>
+          <w:tcPr>
+            <w:tcW w:type="dxa" w:w="1680"/>
+          </w:tcPr>
+          <w:p>
+            <w:r>
+              <w:t>v0_1_1_release_coverage</w:t>
+            </w:r>
+          </w:p>
+        </w:tc>
+        <w:tc>
+          <w:tcPr>
+            <w:tcW w:type="dxa" w:w="1680"/>
+          </w:tcPr>
+          <w:p>
+            <w:r>
+              <w:t>ready_after_manual_blockers</w:t>
+            </w:r>
+          </w:p>
+        </w:tc>
+        <w:tc>
+          <w:tcPr>
+            <w:tcW w:type="dxa" w:w="1680"/>
+          </w:tcPr>
+          <w:p>
+            <w:r>
+              <w:t>release_hold</w:t>
+            </w:r>
+          </w:p>
+        </w:tc>
+        <w:tc>
+          <w:tcPr>
+            <w:tcW w:type="dxa" w:w="1680"/>
+          </w:tcPr>
+          <w:p>
+            <w:r>
+              <w:t>recommendation=prepare_v0.1.1_after_author_ack;worktree=clean</w:t>
+            </w:r>
+          </w:p>
+        </w:tc>
+        <w:tc>
+          <w:tcPr>
+            <w:tcW w:type="dxa" w:w="1680"/>
+          </w:tcPr>
+          <w:p>
+            <w:r>
+              <w:t>Do not tag or archive v0.1.1 until author declarations and final figure/source freeze are complete.</w:t>
+            </w:r>
+          </w:p>
+        </w:tc>
+        <w:tc>
+          <w:tcPr>
+            <w:tcW w:type="dxa" w:w="1680"/>
+          </w:tcPr>
+          <w:p>
+            <w:r>
+              <w:t>Codex</w:t>
+            </w:r>
+          </w:p>
+        </w:tc>
+      </w:tr>
+      <w:tr>
+        <w:tc>
+          <w:tcPr>
+            <w:tcW w:type="dxa" w:w="1680"/>
+          </w:tcPr>
+          <w:p>
+            <w:r>
+              <w:t>git_cleanliness</w:t>
+            </w:r>
+          </w:p>
+        </w:tc>
+        <w:tc>
+          <w:tcPr>
+            <w:tcW w:type="dxa" w:w="1680"/>
+          </w:tcPr>
+          <w:p>
+            <w:r>
+              <w:t>pass</w:t>
+            </w:r>
+          </w:p>
+        </w:tc>
+        <w:tc>
+          <w:tcPr>
+            <w:tcW w:type="dxa" w:w="1680"/>
+          </w:tcPr>
+          <w:p>
+            <w:r>
+              <w:t>controlled</w:t>
+            </w:r>
+          </w:p>
+        </w:tc>
+        <w:tc>
+          <w:tcPr>
+            <w:tcW w:type="dxa" w:w="1680"/>
+          </w:tcPr>
+          <w:p>
+            <w:r>
+              <w:t>Worktree is clean except self-generated preflight outputs.</w:t>
+            </w:r>
+          </w:p>
+        </w:tc>
+        <w:tc>
+          <w:tcPr>
+            <w:tcW w:type="dxa" w:w="1680"/>
+          </w:tcPr>
+          <w:p>
+            <w:r>
+              <w:t>Keep committing generated control artifacts after each change.</w:t>
+            </w:r>
+          </w:p>
+        </w:tc>
+        <w:tc>
+          <w:tcPr>
+            <w:tcW w:type="dxa" w:w="1680"/>
+          </w:tcPr>
+          <w:p>
+            <w:r>
+              <w:t>Codex</w:t>
+            </w:r>
+          </w:p>
+        </w:tc>
+      </w:tr>
+      <w:tr>
+        <w:tc>
+          <w:tcPr>
+            <w:tcW w:type="dxa" w:w="1680"/>
+          </w:tcPr>
+          <w:p>
+            <w:r>
+              <w:t>scientific_core</w:t>
+            </w:r>
+          </w:p>
+        </w:tc>
+        <w:tc>
+          <w:tcPr>
+            <w:tcW w:type="dxa" w:w="1680"/>
+          </w:tcPr>
+          <w:p>
+            <w:r>
+              <w:t>partial</w:t>
+            </w:r>
+          </w:p>
+        </w:tc>
+        <w:tc>
+          <w:tcPr>
+            <w:tcW w:type="dxa" w:w="1680"/>
+          </w:tcPr>
+          <w:p>
+            <w:r>
+              <w:t>science_gap</w:t>
+            </w:r>
+          </w:p>
+        </w:tc>
+        <w:tc>
+          <w:tcPr>
+            <w:tcW w:type="dxa" w:w="1680"/>
+          </w:tcPr>
+          <w:p>
+            <w:r>
+              <w:t>stability_advantage</w:t>
+            </w:r>
+          </w:p>
+        </w:tc>
+        <w:tc>
+          <w:tcPr>
+            <w:tcW w:type="dxa" w:w="1680"/>
+          </w:tcPr>
+          <w:p>
+            <w:r>
+              <w:t>Stability-superiority is still not supported; either improve the algorithm against the strongest comparator or reframe the main claim as callability-aware noise control rather than stability superiority.</w:t>
+            </w:r>
+          </w:p>
+        </w:tc>
+        <w:tc>
+          <w:tcPr>
+            <w:tcW w:type="dxa" w:w="1680"/>
+          </w:tcPr>
+          <w:p>
+            <w:r>
+              <w:t>Codex</w:t>
+            </w:r>
+          </w:p>
+        </w:tc>
+      </w:tr>
+      <w:tr>
+        <w:tc>
+          <w:tcPr>
+            <w:tcW w:type="dxa" w:w="1680"/>
+          </w:tcPr>
+          <w:p>
+            <w:r>
+              <w:t>benchmark_breadth_and_baselines</w:t>
+            </w:r>
+          </w:p>
+        </w:tc>
+        <w:tc>
+          <w:tcPr>
+            <w:tcW w:type="dxa" w:w="1680"/>
+          </w:tcPr>
+          <w:p>
+            <w:r>
+              <w:t>controlled</w:t>
+            </w:r>
+          </w:p>
+        </w:tc>
+        <w:tc>
+          <w:tcPr>
+            <w:tcW w:type="dxa" w:w="1680"/>
+          </w:tcPr>
+          <w:p>
+            <w:r>
+              <w:t>controlled_with_boundary</w:t>
+            </w:r>
+          </w:p>
+        </w:tc>
+        <w:tc>
+          <w:tcPr>
+            <w:tcW w:type="dxa" w:w="1680"/>
+          </w:tcPr>
+          <w:p>
+            <w:r>
+              <w:t>none</w:t>
+            </w:r>
+          </w:p>
+        </w:tc>
+        <w:tc>
+          <w:tcPr>
+            <w:tcW w:type="dxa" w:w="1680"/>
+          </w:tcPr>
+          <w:p>
+            <w:r>
+              <w:t>Freeze the final comparator table.</w:t>
+            </w:r>
+          </w:p>
+        </w:tc>
+        <w:tc>
+          <w:tcPr>
+            <w:tcW w:type="dxa" w:w="1680"/>
+          </w:tcPr>
+          <w:p>
+            <w:r>
+              <w:t>Codex</w:t>
+            </w:r>
+          </w:p>
+        </w:tc>
+      </w:tr>
+      <w:tr>
+        <w:tc>
+          <w:tcPr>
+            <w:tcW w:type="dxa" w:w="1680"/>
+          </w:tcPr>
+          <w:p>
+            <w:r>
+              <w:t>calibration_statistics</w:t>
+            </w:r>
+          </w:p>
+        </w:tc>
+        <w:tc>
+          <w:tcPr>
+            <w:tcW w:type="dxa" w:w="1680"/>
+          </w:tcPr>
+          <w:p>
+            <w:r>
+              <w:t>manuscript_grade_calibration_done_limit_detected</w:t>
+            </w:r>
+          </w:p>
+        </w:tc>
+        <w:tc>
+          <w:tcPr>
+            <w:tcW w:type="dxa" w:w="1680"/>
+          </w:tcPr>
+          <w:p>
+            <w:r>
+              <w:t>controlled</w:t>
+            </w:r>
+          </w:p>
+        </w:tc>
+        <w:tc>
+          <w:tcPr>
+            <w:tcW w:type="dxa" w:w="1680"/>
+          </w:tcPr>
+          <w:p>
+            <w:r>
+              <w:t>none</w:t>
+            </w:r>
+          </w:p>
+        </w:tc>
+        <w:tc>
+          <w:tcPr>
+            <w:tcW w:type="dxa" w:w="1680"/>
+          </w:tcPr>
+          <w:p>
+            <w:r>
+              <w:t>Calibration source data and rare-state claim boundary are controlled; only add extra dropout/batch power grids if the Nature Methods rare-state claim remains central.</w:t>
+            </w:r>
+          </w:p>
+        </w:tc>
+        <w:tc>
+          <w:tcPr>
+            <w:tcW w:type="dxa" w:w="1680"/>
+          </w:tcPr>
+          <w:p>
+            <w:r>
+              <w:t>Codex</w:t>
+            </w:r>
+          </w:p>
+        </w:tc>
+      </w:tr>
+      <w:tr>
+        <w:tc>
+          <w:tcPr>
+            <w:tcW w:type="dxa" w:w="1680"/>
+          </w:tcPr>
+          <w:p>
+            <w:r>
+              <w:t>biological_showcase</w:t>
+            </w:r>
+          </w:p>
+        </w:tc>
+        <w:tc>
+          <w:tcPr>
+            <w:tcW w:type="dxa" w:w="1680"/>
+          </w:tcPr>
+          <w:p>
+            <w:r>
+              <w:t>pathway_atlas_supported_with_limits</w:t>
+            </w:r>
+          </w:p>
+        </w:tc>
+        <w:tc>
+          <w:tcPr>
+            <w:tcW w:type="dxa" w:w="1680"/>
+          </w:tcPr>
+          <w:p>
+            <w:r>
+              <w:t>manual_hold</w:t>
+            </w:r>
+          </w:p>
+        </w:tc>
+        <w:tc>
+          <w:tcPr>
+            <w:tcW w:type="dxa" w:w="1680"/>
+          </w:tcPr>
+          <w:p>
+            <w:r>
+              <w:t>PDAC_TME_corresponding_author_acknowledgement</w:t>
+            </w:r>
+          </w:p>
+        </w:tc>
+        <w:tc>
+          <w:tcPr>
+            <w:tcW w:type="dxa" w:w="1680"/>
+          </w:tcPr>
+          <w:p>
+            <w:r>
+              <w:t>Obtain corresponding-author acknowledgement and keep Figure 4 wording exactly within the bounded public-data showcase freeze.</w:t>
+            </w:r>
+          </w:p>
+        </w:tc>
+        <w:tc>
+          <w:tcPr>
+            <w:tcW w:type="dxa" w:w="1680"/>
+          </w:tcPr>
+          <w:p>
+            <w:r>
+              <w:t>Corresponding authors</w:t>
+            </w:r>
+          </w:p>
+        </w:tc>
+      </w:tr>
+      <w:tr>
+        <w:tc>
+          <w:tcPr>
+            <w:tcW w:type="dxa" w:w="1680"/>
+          </w:tcPr>
+          <w:p>
+            <w:r>
+              <w:t>claim_integrity</w:t>
+            </w:r>
+          </w:p>
+        </w:tc>
+        <w:tc>
+          <w:tcPr>
+            <w:tcW w:type="dxa" w:w="1680"/>
+          </w:tcPr>
+          <w:p>
+            <w:r>
+              <w:t>pass</w:t>
+            </w:r>
+          </w:p>
+        </w:tc>
+        <w:tc>
+          <w:tcPr>
+            <w:tcW w:type="dxa" w:w="1680"/>
+          </w:tcPr>
+          <w:p>
+            <w:r>
+              <w:t>controlled</w:t>
+            </w:r>
+          </w:p>
+        </w:tc>
+        <w:tc>
+          <w:tcPr>
+            <w:tcW w:type="dxa" w:w="1680"/>
+          </w:tcPr>
+          <w:p>
+            <w:r>
+              <w:t>lint_violations=0; trace_violations=0</w:t>
+            </w:r>
+          </w:p>
+        </w:tc>
+        <w:tc>
+          <w:tcPr>
+            <w:tcW w:type="dxa" w:w="1680"/>
+          </w:tcPr>
+          <w:p>
+            <w:r>
+              <w:t>Keep claim lint and traceability at zero after every manuscript change.</w:t>
+            </w:r>
+          </w:p>
+        </w:tc>
+        <w:tc>
+          <w:tcPr>
+            <w:tcW w:type="dxa" w:w="1680"/>
+          </w:tcPr>
+          <w:p>
+            <w:r>
+              <w:t>Codex</w:t>
+            </w:r>
+          </w:p>
+        </w:tc>
+      </w:tr>
+      <w:tr>
+        <w:tc>
+          <w:tcPr>
+            <w:tcW w:type="dxa" w:w="1680"/>
+          </w:tcPr>
+          <w:p>
+            <w:r>
+              <w:t>evidence_freeze</w:t>
+            </w:r>
+          </w:p>
+        </w:tc>
+        <w:tc>
+          <w:tcPr>
+            <w:tcW w:type="dxa" w:w="1680"/>
+          </w:tcPr>
+          <w:p>
+            <w:r>
+              <w:t>pass</w:t>
+            </w:r>
+          </w:p>
+        </w:tc>
+        <w:tc>
+          <w:tcPr>
+            <w:tcW w:type="dxa" w:w="1680"/>
+          </w:tcPr>
+          <w:p>
+            <w:r>
+              <w:t>controlled</w:t>
+            </w:r>
+          </w:p>
+        </w:tc>
+        <w:tc>
+          <w:tcPr>
+            <w:tcW w:type="dxa" w:w="1680"/>
+          </w:tcPr>
+          <w:p>
+            <w:r>
+              <w:t>missing_freeze_items=0</w:t>
+            </w:r>
+          </w:p>
+        </w:tc>
+        <w:tc>
+          <w:tcPr>
+            <w:tcW w:type="dxa" w:w="1680"/>
+          </w:tcPr>
+          <w:p>
+            <w:r>
+              <w:t>Refresh after every figure, manuscript, or release-control change.</w:t>
+            </w:r>
+          </w:p>
+        </w:tc>
+        <w:tc>
+          <w:tcPr>
+            <w:tcW w:type="dxa" w:w="1680"/>
+          </w:tcPr>
+          <w:p>
+            <w:r>
+              <w:t>Codex</w:t>
+            </w:r>
+          </w:p>
+        </w:tc>
+      </w:tr>
+      <w:tr>
+        <w:tc>
+          <w:tcPr>
+            <w:tcW w:type="dxa" w:w="1680"/>
+          </w:tcPr>
+          <w:p>
+            <w:r>
+              <w:t>submission_guard</w:t>
+            </w:r>
+          </w:p>
+        </w:tc>
+        <w:tc>
+          <w:tcPr>
+            <w:tcW w:type="dxa" w:w="1680"/>
+          </w:tcPr>
+          <w:p>
+            <w:r>
+              <w:t>do_not_submit</w:t>
+            </w:r>
+          </w:p>
+        </w:tc>
+        <w:tc>
+          <w:tcPr>
+            <w:tcW w:type="dxa" w:w="1680"/>
+          </w:tcPr>
+          <w:p>
+            <w:r>
+              <w:t>hard_stop</w:t>
+            </w:r>
+          </w:p>
+        </w:tc>
+        <w:tc>
+          <w:tcPr>
+            <w:tcW w:type="dxa" w:w="1680"/>
+          </w:tcPr>
+          <w:p>
+            <w:r>
+              <w:t>Submission guard remains the final local stop rule.</w:t>
+            </w:r>
+          </w:p>
+        </w:tc>
+        <w:tc>
+          <w:tcPr>
+            <w:tcW w:type="dxa" w:w="1680"/>
+          </w:tcPr>
+          <w:p>
+            <w:r>
+              <w:t>Run the submission guard again only after author confirmations and final evidence freeze.</w:t>
+            </w:r>
+          </w:p>
+        </w:tc>
+        <w:tc>
+          <w:tcPr>
+            <w:tcW w:type="dxa" w:w="1680"/>
+          </w:tcPr>
+          <w:p>
+            <w:r>
+              <w:t>Codex</w:t>
+            </w:r>
+          </w:p>
+        </w:tc>
+      </w:tr>
+    </w:tbl>
+    <w:p>
+      <w:pPr>
+        <w:pStyle w:val="Heading2"/>
+      </w:pPr>
+      <w:r>
+        <w:t>What This Means</w:t>
+      </w:r>
+    </w:p>
+    <w:p>
+      <w:r>
+        <w:t>The package is no longer blocked by public-code release engineering. The remaining blockers are concentrated in author-controlled declarations, Figure 4 acknowledgement, reporting-summary verification, and the scientific claim that real-data stability advantage is not yet strong enough for unrestricted Nature Methods language.</w:t>
+      </w:r>
+    </w:p>
+    <w:p>
+      <w:pPr>
+        <w:pStyle w:val="Heading2"/>
+      </w:pPr>
+      <w:r>
+        <w:t>What We Can Safely Say Now</w:t>
+      </w:r>
+    </w:p>
+    <w:p>
+      <w:pPr>
+        <w:pStyle w:val="ListBullet"/>
+      </w:pPr>
+      <w:r>
+        <w:t>RMTGuard is an open, DOI-archived, callability-aware random-matrix workflow for scRNA-seq noise-control diagnostics.</w:t>
+      </w:r>
+    </w:p>
+    <w:p>
+      <w:pPr>
+        <w:pStyle w:val="ListBullet"/>
+      </w:pPr>
+      <w:r>
+        <w:t>The current evidence supports transparent no-call/caveat reporting and bounded false-signal control under tested settings.</w:t>
+      </w:r>
+    </w:p>
+    <w:p>
+      <w:pPr>
+        <w:pStyle w:val="ListBullet"/>
+      </w:pPr>
+      <w:r>
+        <w:t>PDAC/TME can be shown only as a public-data application with pathway/atlas support, not as a mechanism, clinical, prognosis, treatment-response, spatial, or protein-validation discovery.</w:t>
+      </w:r>
+    </w:p>
+    <w:p>
+      <w:pPr>
+        <w:pStyle w:val="Heading2"/>
+      </w:pPr>
+      <w:r>
+        <w:t>What We Must Not Say Yet</w:t>
+      </w:r>
+    </w:p>
+    <w:p>
+      <w:pPr>
+        <w:pStyle w:val="ListBullet"/>
+      </w:pPr>
+      <w:r>
+        <w:t>Do not claim broad real-data stability superiority.</w:t>
+      </w:r>
+    </w:p>
+    <w:p>
+      <w:pPr>
+        <w:pStyle w:val="ListBullet"/>
+      </w:pPr>
+      <w:r>
+        <w:t>Do not claim Nature Methods submission readiness.</w:t>
+      </w:r>
+    </w:p>
+    <w:p>
+      <w:pPr>
+        <w:pStyle w:val="ListBullet"/>
+      </w:pPr>
+      <w:r>
+        <w:t>Do not claim v0.1.1 DOI coverage until a new release is actually tagged and archived.</w:t>
+      </w:r>
+    </w:p>
+    <w:p>
+      <w:pPr>
+        <w:pStyle w:val="ListBullet"/>
+      </w:pPr>
+      <w:r>
+        <w:t>Do not send the presubmission inquiry while Figure 4 acknowledgement is missing.</w:t>
+      </w:r>
+    </w:p>
+    <w:p>
+      <w:pPr>
+        <w:pStyle w:val="Heading2"/>
+      </w:pPr>
+      <w:r>
+        <w:t>Next Execution Order</w:t>
+      </w:r>
+    </w:p>
+    <w:p>
+      <w:pPr>
+        <w:pStyle w:val="ListNumber"/>
+      </w:pPr>
+      <w:r>
+        <w:t>Close author declarations and Figure 4 acknowledgement.</w:t>
+      </w:r>
+    </w:p>
+    <w:p>
+      <w:pPr>
+        <w:pStyle w:val="ListNumber"/>
+      </w:pPr>
+      <w:r>
+        <w:t>Refresh reporting summary and v0.1.1 preflight.</w:t>
+      </w:r>
+    </w:p>
+    <w:p>
+      <w:pPr>
+        <w:pStyle w:val="ListNumber"/>
+      </w:pPr>
+      <w:r>
+        <w:t>Decide whether to add one more high-value science experiment or route directly to presubmission.</w:t>
+      </w:r>
+    </w:p>
+    <w:p>
+      <w:pPr>
+        <w:pStyle w:val="ListNumber"/>
+      </w:pPr>
+      <w:r>
+        <w:t>If authors confirm, prepare v0.1.1 GitHub Release and Zenodo archive.</w:t>
+      </w:r>
+    </w:p>
+    <w:p>
+      <w:pPr>
+        <w:pStyle w:val="ListNumber"/>
+      </w:pPr>
+      <w:r>
+        <w:t>Re-run claim lint, traceability, evidence freeze, Gantt, and shared export.</w:t>
+      </w:r>
+    </w:p>
+    <w:p>
+      <w:pPr>
+        <w:pStyle w:val="Heading2"/>
+      </w:pPr>
+      <w:r>
+        <w:t>Immediate Blockers</w:t>
+      </w:r>
+    </w:p>
+    <w:p>
+      <w:pPr>
+        <w:pStyle w:val="ListBullet"/>
+      </w:pPr>
+      <w:r>
+        <w:t>nature_methods_full_submission: Full submission remains blocked because active blockers include stability_advantage;PDAC_TME_corresponding_author_acknowledgement;editorial_send_status;nature_methods_route. Next: Do not submit a full manuscript until stability-superiority claims are removed or new evidence supports them, and final source-data/reporting-summary checks are frozen.</w:t>
+      </w:r>
+    </w:p>
+    <w:p>
+      <w:pPr>
+        <w:pStyle w:val="ListBullet"/>
+      </w:pPr>
+      <w:r>
+        <w:t>nature_methods_presubmission: Readiness score is 90/100; release status is pass; claim lint violations=0; traceability violations=0; Figure 4 wording freeze present=True; send_status=do_not_send; author_acknowledgement=pending_author_reply (0/2); proxy_working_assumption=2/2. Next: Obtain corresponding-author Figure 4 acknowledgement, then do one final route-policy check.</w:t>
+      </w:r>
+    </w:p>
+    <w:p>
+      <w:pPr>
+        <w:pStyle w:val="ListBullet"/>
+      </w:pPr>
+      <w:r>
+        <w:t>author_declarations: 8 author-confirmation items remain. Next: Send/verify the author declaration confirmation packet and save written replies.</w:t>
+      </w:r>
+    </w:p>
+    <w:p>
+      <w:pPr>
+        <w:pStyle w:val="ListBullet"/>
+      </w:pPr>
+      <w:r>
+        <w:t>figure4_author_acknowledgement: 1 display item needs author acknowledgement. Next: Yi Miao and Han Yan must confirm bounded Figure 4 wording in writing.</w:t>
+      </w:r>
+    </w:p>
+    <w:p>
+      <w:pPr>
+        <w:pStyle w:val="ListBullet"/>
+      </w:pPr>
+      <w:r>
+        <w:t>reporting_summary: 2 reporting-summary rows need author/manual verification. Next: Verify statistics, multiple testing, software, data availability, ethics, and AI-use rows.</w:t>
+      </w:r>
+    </w:p>
+    <w:p>
+      <w:pPr>
+        <w:pStyle w:val="ListBullet"/>
+      </w:pPr>
+      <w:r>
+        <w:t>scientific_core: stability_advantage Next: Stability-superiority is still not supported; either improve the algorithm against the strongest comparator or reframe the main claim as callability-aware noise control rather than stability superiority.</w:t>
+      </w:r>
+    </w:p>
+    <w:p>
+      <w:pPr>
+        <w:pStyle w:val="ListBullet"/>
+      </w:pPr>
+      <w:r>
+        <w:t>biological_showcase: PDAC_TME_corresponding_author_acknowledgement Next: Obtain corresponding-author acknowledgement and keep Figure 4 wording exactly within the bounded public-data showcase freeze.</w:t>
+      </w:r>
+    </w:p>
+    <w:p>
+      <w:pPr>
+        <w:pStyle w:val="ListBullet"/>
+      </w:pPr>
+      <w:r>
+        <w:t>submission_guard: Submission guard remains the final local stop rule. Next: Run the submission guard again only after author confirmations and final evidence freeze.</w:t>
+      </w:r>
+    </w:p>
+    <w:p>
+      <w:pPr>
+        <w:pStyle w:val="Heading2"/>
+      </w:pPr>
+      <w:r>
+        <w:t>Source Files</w:t>
+      </w:r>
+    </w:p>
+    <w:p>
+      <w:pPr>
+        <w:pStyle w:val="ListBullet"/>
+      </w:pPr>
+      <w:r>
+        <w:t>results/submission/jif20_50_gap_assessment.tsv</w:t>
+      </w:r>
+    </w:p>
+    <w:p>
+      <w:pPr>
+        <w:pStyle w:val="ListBullet"/>
+      </w:pPr>
+      <w:r>
+        <w:t>results/submission/nature_methods_go_no_go_final.tsv</w:t>
+      </w:r>
+    </w:p>
+    <w:p>
+      <w:pPr>
+        <w:pStyle w:val="ListBullet"/>
+      </w:pPr>
+      <w:r>
+        <w:t>results/submission/author_declaration_confirmation_checklist.tsv</w:t>
+      </w:r>
+    </w:p>
+    <w:p>
+      <w:pPr>
+        <w:pStyle w:val="ListBullet"/>
+      </w:pPr>
+      <w:r>
+        <w:t>docs/author_declaration_confirmation_packet.md</w:t>
+      </w:r>
+    </w:p>
+    <w:p>
+      <w:pPr>
+        <w:pStyle w:val="ListBullet"/>
+      </w:pPr>
+      <w:r>
+        <w:t>results/submission/figure_caption_source_audit.tsv</w:t>
+      </w:r>
+    </w:p>
+    <w:p>
+      <w:pPr>
+        <w:pStyle w:val="ListBullet"/>
+      </w:pPr>
+      <w:r>
+        <w:t>results/submission/reporting_summary_draft.tsv</w:t>
+      </w:r>
+    </w:p>
+    <w:p>
+      <w:pPr>
+        <w:pStyle w:val="ListBullet"/>
+      </w:pPr>
+      <w:r>
+        <w:t>results/submission/v0_1_1_release_preflight.tsv</w:t>
+      </w:r>
+    </w:p>
+    <w:p>
+      <w:pPr>
+        <w:pStyle w:val="ListBullet"/>
+      </w:pPr>
+      <w:r>
+        <w:t>results/gates/gate_report.tsv</w:t>
+      </w:r>
+    </w:p>
+    <w:p>
+      <w:pPr>
+        <w:pStyle w:val="ListBullet"/>
+      </w:pPr>
+      <w:r>
+        <w:t>results/submission/external_review_action_plan.tsv</w:t>
+      </w:r>
+    </w:p>
+    <w:p>
+      <w:pPr>
+        <w:pStyle w:val="ListBullet"/>
+      </w:pPr>
+      <w:r>
+        <w:t>results/manuscript_stability_benchmarks/manuscript_stability_statistics.tsv</w:t>
+      </w:r>
+    </w:p>
+    <w:p>
+      <w:pPr>
+        <w:pStyle w:val="ListBullet"/>
+      </w:pPr>
+      <w:r>
+        <w:t>results/calibration/rare_state_power_summary.tsv</w:t>
+      </w:r>
+    </w:p>
+    <w:p>
+      <w:pPr>
+        <w:pStyle w:val="ListBullet"/>
+      </w:pPr>
+      <w:r>
+        <w:t>results/ablation/component_ablation_evidence.tsv</w:t>
+      </w:r>
+    </w:p>
+    <w:p>
+      <w:pPr>
+        <w:pStyle w:val="ListBullet"/>
+      </w:pPr>
+      <w:r>
+        <w:t>docs/pdac_tme_showcase_depth.md</w:t>
+      </w:r>
+    </w:p>
+    <w:p>
+      <w:pPr>
+        <w:pStyle w:val="ListBullet"/>
+      </w:pPr>
+      <w:r>
+        <w:t>docs/pdac_tme_route_decision_packet.md</w:t>
+      </w:r>
+    </w:p>
+    <w:p>
+      <w:pPr>
+        <w:pStyle w:val="ListBullet"/>
+      </w:pPr>
+      <w:r>
+        <w:t>docs/pdac_tme_dual_route_preflight.md</w:t>
+      </w:r>
+    </w:p>
+    <w:p>
+      <w:pPr>
+        <w:pStyle w:val="ListBullet"/>
+      </w:pPr>
+      <w:r>
+        <w:t>docs/pdac_tme_dual_route_runbook.md</w:t>
+      </w:r>
+    </w:p>
+    <w:p>
+      <w:pPr>
+        <w:pStyle w:val="ListBullet"/>
+      </w:pPr>
+      <w:r>
+        <w:t>docs/pdac_tme_deep_validation.md</w:t>
+      </w:r>
+    </w:p>
+    <w:p>
+      <w:pPr>
+        <w:pStyle w:val="ListBullet"/>
+      </w:pPr>
+      <w:r>
+        <w:t>docs/pdac_tme_pathway_atlas_validation.md</w:t>
+      </w:r>
+    </w:p>
+    <w:p>
+      <w:pPr>
+        <w:pStyle w:val="ListBullet"/>
+      </w:pPr>
+      <w:r>
+        <w:t>docs/figure4_pdac_tme_wording_freeze.md</w:t>
+      </w:r>
+    </w:p>
+    <w:p>
+      <w:pPr>
+        <w:pStyle w:val="ListBullet"/>
+      </w:pPr>
+      <w:r>
+        <w:t>results/submission/claim_boundary_lint.tsv</w:t>
+      </w:r>
+    </w:p>
+    <w:p>
+      <w:pPr>
+        <w:pStyle w:val="ListBullet"/>
+      </w:pPr>
+      <w:r>
+        <w:t>results/submission/claim_traceability.tsv</w:t>
+      </w:r>
+    </w:p>
+    <w:p>
+      <w:pPr>
+        <w:pStyle w:val="ListBullet"/>
+      </w:pPr>
+      <w:r>
+        <w:t>results/submission/current_evidence_freeze_manifest.tsv</w:t>
+      </w:r>
+    </w:p>
+    <w:p>
+      <w:pPr>
+        <w:pStyle w:val="ListBullet"/>
+      </w:pPr>
+      <w:r>
+        <w:t>results/submission/submission_guard.tsv</w:t>
       </w:r>
     </w:p>
     <w:p>
@@ -5007,7 +6627,7 @@
         <w:pStyle w:val="ListBullet"/>
       </w:pPr>
       <w:r>
-        <w:t>Blocking or holding gates: author_declarations;corresponding_author_figure4_ack;figure_caption_source_audit;git_worktree_clean.</w:t>
+        <w:t>Blocking or holding gates: author_declarations;corresponding_author_figure4_ack;figure_caption_source_audit.</w:t>
       </w:r>
     </w:p>
     <w:p>
@@ -5031,7 +6651,7 @@
         <w:pStyle w:val="ListBullet"/>
       </w:pPr>
       <w:r>
-        <w:t>blocked: 4</w:t>
+        <w:t>blocked: 3</w:t>
       </w:r>
     </w:p>
     <w:p>
@@ -5039,7 +6659,7 @@
         <w:pStyle w:val="ListBullet"/>
       </w:pPr>
       <w:r>
-        <w:t>pass: 2</w:t>
+        <w:t>pass: 3</w:t>
       </w:r>
     </w:p>
     <w:p>
@@ -5512,7 +7132,7 @@
           </w:tcPr>
           <w:p>
             <w:r>
-              <w:t>blocked</w:t>
+              <w:t>pass</w:t>
             </w:r>
           </w:p>
         </w:tc>
@@ -5522,7 +7142,7 @@
           </w:tcPr>
           <w:p>
             <w:r>
-              <w:t>release_blocker</w:t>
+              <w:t>controlled</w:t>
             </w:r>
           </w:p>
         </w:tc>
@@ -5532,7 +7152,7 @@
           </w:tcPr>
           <w:p>
             <w:r>
-              <w:t>Commit all release-facing changes before creating a tag.</w:t>
+              <w:t>No action.</w:t>
             </w:r>
           </w:p>
         </w:tc>
@@ -5542,7 +7162,7 @@
           </w:tcPr>
           <w:p>
             <w:r>
-              <w:t>M docs/post_release_version_coverage_audit.md; M output/doc/RMTGuard_author_declaration_confirmation_packet.docx; M results/submission/post_release_changed_files.tsv; M results/submission/post_release_version_coverage_audit.tsv</w:t>
+              <w:t>Worktree is clean except self-generated preflight outputs.</w:t>
             </w:r>
           </w:p>
         </w:tc>

</xml_diff>

<commit_message>
Refresh dashboard-linked preflight outputs
</commit_message>
<xml_diff>
--- a/output/doc/RMTGuard_external_review_packet_2026-05-12.docx
+++ b/output/doc/RMTGuard_external_review_packet_2026-05-12.docx
@@ -27,7 +27,7 @@
     </w:p>
     <w:p>
       <w:r>
-        <w:t>Generated: 2026-05-12 13:48:31</w:t>
+        <w:t>Generated: 2026-05-12 13:50:39</w:t>
       </w:r>
     </w:p>
     <w:tbl>
@@ -4147,7 +4147,7 @@
         <w:pStyle w:val="ListBullet"/>
       </w:pPr>
       <w:r>
-        <w:t>Commits after v0.1.0: 49.</w:t>
+        <w:t>Commits after v0.1.0: 52.</w:t>
       </w:r>
     </w:p>
     <w:p>
@@ -4155,7 +4155,7 @@
         <w:pStyle w:val="ListBullet"/>
       </w:pPr>
       <w:r>
-        <w:t>Changed files after v0.1.0: 264.</w:t>
+        <w:t>Changed files after v0.1.0: 267.</w:t>
       </w:r>
     </w:p>
     <w:p>
@@ -4163,7 +4163,7 @@
         <w:pStyle w:val="ListBullet"/>
       </w:pPr>
       <w:r>
-        <w:t>Manuscript-facing changed files: 254.</w:t>
+        <w:t>Manuscript-facing changed files: 257.</w:t>
       </w:r>
     </w:p>
     <w:p>
@@ -4334,7 +4334,7 @@
           </w:tcPr>
           <w:p>
             <w:r>
-              <w:t>d70a84e8e8352c9cbcc5c3e3fe2d6f91821f49f4</w:t>
+              <w:t>f6c3b2e918300d83462893beaf0048461e4e22f3</w:t>
             </w:r>
           </w:p>
         </w:tc>
@@ -4354,7 +4354,7 @@
           </w:tcPr>
           <w:p>
             <w:r>
-              <w:t>49 commits after v0.1.0.</w:t>
+              <w:t>52 commits after v0.1.0.</w:t>
             </w:r>
           </w:p>
         </w:tc>
@@ -4438,7 +4438,7 @@
           </w:tcPr>
           <w:p>
             <w:r>
-              <w:t>254</w:t>
+              <w:t>257</w:t>
             </w:r>
           </w:p>
         </w:tc>
@@ -4542,7 +4542,7 @@
           </w:tcPr>
           <w:p>
             <w:r>
-              <w:t>51</w:t>
+              <w:t>52</w:t>
             </w:r>
           </w:p>
         </w:tc>
@@ -4963,7 +4963,7 @@
           </w:tcPr>
           <w:p>
             <w:r>
-              <w:t>47</w:t>
+              <w:t>48</w:t>
             </w:r>
           </w:p>
         </w:tc>
@@ -5073,7 +5073,7 @@
           </w:tcPr>
           <w:p>
             <w:r>
-              <w:t>54</w:t>
+              <w:t>55</w:t>
             </w:r>
           </w:p>
         </w:tc>
@@ -5095,7 +5095,7 @@
           </w:tcPr>
           <w:p>
             <w:r>
-              <w:t>39</w:t>
+              <w:t>40</w:t>
             </w:r>
           </w:p>
         </w:tc>
@@ -5180,7 +5180,7 @@
           </w:tcPr>
           <w:p>
             <w:r>
-              <w:t>222</w:t>
+              <w:t>225</w:t>
             </w:r>
           </w:p>
         </w:tc>
@@ -6130,7 +6130,7 @@
           </w:tcPr>
           <w:p>
             <w:r>
-              <w:t>M</w:t>
+              <w:t>A</w:t>
             </w:r>
           </w:p>
         </w:tc>
@@ -6150,7 +6150,7 @@
           </w:tcPr>
           <w:p>
             <w:r>
-              <w:t>docs/jif20_50_gap_assessment.md</w:t>
+              <w:t>docs/high_impact_submission_dashboard.md</w:t>
             </w:r>
           </w:p>
         </w:tc>
@@ -6182,7 +6182,7 @@
           </w:tcPr>
           <w:p>
             <w:r>
-              <w:t>docs/manual_author_execution_steps.md</w:t>
+              <w:t>docs/jif20_50_gap_assessment.md</w:t>
             </w:r>
           </w:p>
         </w:tc>
@@ -6194,7 +6194,7 @@
           </w:tcPr>
           <w:p>
             <w:r>
-              <w:t>A</w:t>
+              <w:t>M</w:t>
             </w:r>
           </w:p>
         </w:tc>
@@ -6214,7 +6214,7 @@
           </w:tcPr>
           <w:p>
             <w:r>
-              <w:t>docs/manual_next_actions_20_50.md</w:t>
+              <w:t>docs/manual_author_execution_steps.md</w:t>
             </w:r>
           </w:p>
         </w:tc>
@@ -6246,7 +6246,7 @@
           </w:tcPr>
           <w:p>
             <w:r>
-              <w:t>docs/manuscript_grade_null_power_grid_design.md</w:t>
+              <w:t>docs/manual_next_actions_20_50.md</w:t>
             </w:r>
           </w:p>
         </w:tc>
@@ -6278,7 +6278,7 @@
           </w:tcPr>
           <w:p>
             <w:r>
-              <w:t>docs/mentor_journal_decision_2026-05-10.md</w:t>
+              <w:t>docs/manuscript_grade_null_power_grid_design.md</w:t>
             </w:r>
           </w:p>
         </w:tc>
@@ -6310,7 +6310,7 @@
           </w:tcPr>
           <w:p>
             <w:r>
-              <w:t>docs/nature_methods_48h_execution_packet.md</w:t>
+              <w:t>docs/mentor_journal_decision_2026-05-10.md</w:t>
             </w:r>
           </w:p>
         </w:tc>
@@ -6342,7 +6342,7 @@
           </w:tcPr>
           <w:p>
             <w:r>
-              <w:t>docs/nature_methods_go_no_go_final.md</w:t>
+              <w:t>docs/nature_methods_48h_execution_packet.md</w:t>
             </w:r>
           </w:p>
         </w:tc>
@@ -6374,7 +6374,7 @@
           </w:tcPr>
           <w:p>
             <w:r>
-              <w:t>docs/nature_methods_next_round_gate_board.md</w:t>
+              <w:t>docs/nature_methods_go_no_go_final.md</w:t>
             </w:r>
           </w:p>
         </w:tc>
@@ -6406,7 +6406,7 @@
           </w:tcPr>
           <w:p>
             <w:r>
-              <w:t>docs/nature_methods_official_route_verification.md</w:t>
+              <w:t>docs/nature_methods_next_round_gate_board.md</w:t>
             </w:r>
           </w:p>
         </w:tc>
@@ -6438,7 +6438,7 @@
           </w:tcPr>
           <w:p>
             <w:r>
-              <w:t>docs/nature_methods_presubmission_send_runbook.md</w:t>
+              <w:t>docs/nature_methods_official_route_verification.md</w:t>
             </w:r>
           </w:p>
         </w:tc>
@@ -6450,7 +6450,7 @@
           </w:tcPr>
           <w:p>
             <w:r>
-              <w:t>M</w:t>
+              <w:t>A</w:t>
             </w:r>
           </w:p>
         </w:tc>
@@ -6470,7 +6470,7 @@
           </w:tcPr>
           <w:p>
             <w:r>
-              <w:t>docs/nature_reporting_summary_draft.md</w:t>
+              <w:t>docs/nature_methods_presubmission_send_runbook.md</w:t>
             </w:r>
           </w:p>
         </w:tc>
@@ -6502,7 +6502,7 @@
           </w:tcPr>
           <w:p>
             <w:r>
-              <w:t>docs/no_call_decision_map.md</w:t>
+              <w:t>docs/nature_reporting_summary_draft.md</w:t>
             </w:r>
           </w:p>
         </w:tc>
@@ -6514,7 +6514,7 @@
           </w:tcPr>
           <w:p>
             <w:r>
-              <w:t>A</w:t>
+              <w:t>M</w:t>
             </w:r>
           </w:p>
         </w:tc>
@@ -6534,7 +6534,7 @@
           </w:tcPr>
           <w:p>
             <w:r>
-              <w:t>docs/p0_benchmark_upgrade_status_2026-05-12.md</w:t>
+              <w:t>docs/no_call_decision_map.md</w:t>
             </w:r>
           </w:p>
         </w:tc>
@@ -7110,7 +7110,7 @@
           </w:tcPr>
           <w:p>
             <w:r>
-              <w:t>32 frozen evidence items exist.</w:t>
+              <w:t>33 frozen evidence items exist.</w:t>
             </w:r>
           </w:p>
         </w:tc>

</xml_diff>

<commit_message>
Add author declaration email packet
</commit_message>
<xml_diff>
--- a/output/doc/RMTGuard_external_review_packet_2026-05-12.docx
+++ b/output/doc/RMTGuard_external_review_packet_2026-05-12.docx
@@ -27,7 +27,7 @@
     </w:p>
     <w:p>
       <w:r>
-        <w:t>Generated: 2026-05-12 13:50:39</w:t>
+        <w:t>Generated: 2026-05-12 13:56:38</w:t>
       </w:r>
     </w:p>
     <w:tbl>
@@ -221,7 +221,7 @@
       <w:r>
         <w:drawing>
           <wp:inline xmlns:a="http://schemas.openxmlformats.org/drawingml/2006/main" xmlns:pic="http://schemas.openxmlformats.org/drawingml/2006/picture">
-            <wp:extent cx="5120640" cy="8776485"/>
+            <wp:extent cx="5120640" cy="8933099"/>
             <wp:docPr id="1" name="Picture 1"/>
             <wp:cNvGraphicFramePr>
               <a:graphicFrameLocks noChangeAspect="1"/>
@@ -242,7 +242,7 @@
                   <pic:spPr>
                     <a:xfrm>
                       <a:off x="0" y="0"/>
-                      <a:ext cx="5120640" cy="8776485"/>
+                      <a:ext cx="5120640" cy="8933099"/>
                     </a:xfrm>
                     <a:prstGeom prst="rect"/>
                   </pic:spPr>
@@ -330,7 +330,7 @@
         <w:pStyle w:val="ListBullet"/>
       </w:pPr>
       <w:r>
-        <w:t>Items checked: 33</w:t>
+        <w:t>Items checked: 34</w:t>
       </w:r>
     </w:p>
     <w:p>
@@ -386,7 +386,7 @@
         <w:pStyle w:val="ListBullet"/>
       </w:pPr>
       <w:r>
-        <w:t>manual_blocker: 2</w:t>
+        <w:t>manual_blocker: 3</w:t>
       </w:r>
     </w:p>
     <w:p>
@@ -1026,7 +1026,7 @@
           </w:tcPr>
           <w:p>
             <w:r>
-              <w:t>Send/verify the author declaration confirmation packet and save written replies.</w:t>
+              <w:t>Send the author declaration email or WeChat draft with the Word packet, then save written replies.</w:t>
             </w:r>
           </w:p>
         </w:tc>
@@ -1886,7 +1886,7 @@
         <w:pStyle w:val="ListBullet"/>
       </w:pPr>
       <w:r>
-        <w:t>author_declarations: 8 author-confirmation items remain. Next: Send/verify the author declaration confirmation packet and save written replies.</w:t>
+        <w:t>author_declarations: 8 author-confirmation items remain. Next: Send the author declaration email or WeChat draft with the Word packet, then save written replies.</w:t>
       </w:r>
     </w:p>
     <w:p>
@@ -1967,6 +1967,14 @@
       </w:pPr>
       <w:r>
         <w:t>docs/author_declaration_confirmation_packet.md</w:t>
+      </w:r>
+    </w:p>
+    <w:p>
+      <w:pPr>
+        <w:pStyle w:val="ListBullet"/>
+      </w:pPr>
+      <w:r>
+        <w:t>manuscript/author_declaration_confirmation_email_draft.md</w:t>
       </w:r>
     </w:p>
     <w:p>

</xml_diff>

<commit_message>
Refresh preflight after author email packet
</commit_message>
<xml_diff>
--- a/output/doc/RMTGuard_external_review_packet_2026-05-12.docx
+++ b/output/doc/RMTGuard_external_review_packet_2026-05-12.docx
@@ -27,7 +27,7 @@
     </w:p>
     <w:p>
       <w:r>
-        <w:t>Generated: 2026-05-12 13:56:38</w:t>
+        <w:t>Generated: 2026-05-12 13:59:13</w:t>
       </w:r>
     </w:p>
     <w:tbl>
@@ -4155,7 +4155,7 @@
         <w:pStyle w:val="ListBullet"/>
       </w:pPr>
       <w:r>
-        <w:t>Commits after v0.1.0: 52.</w:t>
+        <w:t>Commits after v0.1.0: 55.</w:t>
       </w:r>
     </w:p>
     <w:p>
@@ -4163,7 +4163,7 @@
         <w:pStyle w:val="ListBullet"/>
       </w:pPr>
       <w:r>
-        <w:t>Changed files after v0.1.0: 267.</w:t>
+        <w:t>Changed files after v0.1.0: 272.</w:t>
       </w:r>
     </w:p>
     <w:p>
@@ -4171,7 +4171,7 @@
         <w:pStyle w:val="ListBullet"/>
       </w:pPr>
       <w:r>
-        <w:t>Manuscript-facing changed files: 257.</w:t>
+        <w:t>Manuscript-facing changed files: 262.</w:t>
       </w:r>
     </w:p>
     <w:p>
@@ -4342,7 +4342,7 @@
           </w:tcPr>
           <w:p>
             <w:r>
-              <w:t>f6c3b2e918300d83462893beaf0048461e4e22f3</w:t>
+              <w:t>2c35393cb67be4aa51a0e54ed278e9a90ac85712</w:t>
             </w:r>
           </w:p>
         </w:tc>
@@ -4362,7 +4362,7 @@
           </w:tcPr>
           <w:p>
             <w:r>
-              <w:t>52 commits after v0.1.0.</w:t>
+              <w:t>55 commits after v0.1.0.</w:t>
             </w:r>
           </w:p>
         </w:tc>
@@ -4446,7 +4446,7 @@
           </w:tcPr>
           <w:p>
             <w:r>
-              <w:t>257</w:t>
+              <w:t>262</w:t>
             </w:r>
           </w:p>
         </w:tc>
@@ -4550,7 +4550,7 @@
           </w:tcPr>
           <w:p>
             <w:r>
-              <w:t>52</w:t>
+              <w:t>53</w:t>
             </w:r>
           </w:p>
         </w:tc>
@@ -4839,7 +4839,7 @@
           </w:tcPr>
           <w:p>
             <w:r>
-              <w:t>3</w:t>
+              <w:t>4</w:t>
             </w:r>
           </w:p>
         </w:tc>
@@ -4883,7 +4883,7 @@
           </w:tcPr>
           <w:p>
             <w:r>
-              <w:t>16</w:t>
+              <w:t>18</w:t>
             </w:r>
           </w:p>
         </w:tc>
@@ -4971,7 +4971,7 @@
           </w:tcPr>
           <w:p>
             <w:r>
-              <w:t>48</w:t>
+              <w:t>49</w:t>
             </w:r>
           </w:p>
         </w:tc>
@@ -5081,7 +5081,7 @@
           </w:tcPr>
           <w:p>
             <w:r>
-              <w:t>55</w:t>
+              <w:t>56</w:t>
             </w:r>
           </w:p>
         </w:tc>
@@ -5188,7 +5188,7 @@
           </w:tcPr>
           <w:p>
             <w:r>
-              <w:t>225</w:t>
+              <w:t>230</w:t>
             </w:r>
           </w:p>
         </w:tc>
@@ -5594,7 +5594,7 @@
           </w:tcPr>
           <w:p>
             <w:r>
-              <w:t>M</w:t>
+              <w:t>A</w:t>
             </w:r>
           </w:p>
         </w:tc>
@@ -5614,7 +5614,7 @@
           </w:tcPr>
           <w:p>
             <w:r>
-              <w:t>docs/author_declarations_and_credit_roles.md</w:t>
+              <w:t>docs/author_declaration_reply_intake_runbook.md</w:t>
             </w:r>
           </w:p>
         </w:tc>
@@ -5646,7 +5646,7 @@
           </w:tcPr>
           <w:p>
             <w:r>
-              <w:t>docs/author_metadata_status.md</w:t>
+              <w:t>docs/author_declarations_and_credit_roles.md</w:t>
             </w:r>
           </w:p>
         </w:tc>
@@ -5678,7 +5678,7 @@
           </w:tcPr>
           <w:p>
             <w:r>
-              <w:t>docs/author_release_execution_packet.md</w:t>
+              <w:t>docs/author_metadata_status.md</w:t>
             </w:r>
           </w:p>
         </w:tc>
@@ -5690,7 +5690,7 @@
           </w:tcPr>
           <w:p>
             <w:r>
-              <w:t>A</w:t>
+              <w:t>M</w:t>
             </w:r>
           </w:p>
         </w:tc>
@@ -5710,7 +5710,7 @@
           </w:tcPr>
           <w:p>
             <w:r>
-              <w:t>docs/benchmark_upgrade_from_concord_sclens_2026-05-12.md</w:t>
+              <w:t>docs/author_release_execution_packet.md</w:t>
             </w:r>
           </w:p>
         </w:tc>
@@ -5722,7 +5722,7 @@
           </w:tcPr>
           <w:p>
             <w:r>
-              <w:t>M</w:t>
+              <w:t>A</w:t>
             </w:r>
           </w:p>
         </w:tc>
@@ -5742,7 +5742,7 @@
           </w:tcPr>
           <w:p>
             <w:r>
-              <w:t>docs/claim_boundary_lint.md</w:t>
+              <w:t>docs/benchmark_upgrade_from_concord_sclens_2026-05-12.md</w:t>
             </w:r>
           </w:p>
         </w:tc>
@@ -5774,7 +5774,7 @@
           </w:tcPr>
           <w:p>
             <w:r>
-              <w:t>docs/claim_traceability.md</w:t>
+              <w:t>docs/claim_boundary_lint.md</w:t>
             </w:r>
           </w:p>
         </w:tc>
@@ -5786,7 +5786,7 @@
           </w:tcPr>
           <w:p>
             <w:r>
-              <w:t>A</w:t>
+              <w:t>M</w:t>
             </w:r>
           </w:p>
         </w:tc>
@@ -5806,7 +5806,7 @@
           </w:tcPr>
           <w:p>
             <w:r>
-              <w:t>docs/competitor_positioning_concord_sclens_2026-05-12.md</w:t>
+              <w:t>docs/claim_traceability.md</w:t>
             </w:r>
           </w:p>
         </w:tc>
@@ -5818,7 +5818,7 @@
           </w:tcPr>
           <w:p>
             <w:r>
-              <w:t>M</w:t>
+              <w:t>A</w:t>
             </w:r>
           </w:p>
         </w:tc>
@@ -5838,7 +5838,7 @@
           </w:tcPr>
           <w:p>
             <w:r>
-              <w:t>docs/component_ablation_benchmark.md</w:t>
+              <w:t>docs/competitor_positioning_concord_sclens_2026-05-12.md</w:t>
             </w:r>
           </w:p>
         </w:tc>
@@ -5850,7 +5850,7 @@
           </w:tcPr>
           <w:p>
             <w:r>
-              <w:t>A</w:t>
+              <w:t>M</w:t>
             </w:r>
           </w:p>
         </w:tc>
@@ -5870,7 +5870,7 @@
           </w:tcPr>
           <w:p>
             <w:r>
-              <w:t>docs/corresponding_author_proxy_assumption.md</w:t>
+              <w:t>docs/component_ablation_benchmark.md</w:t>
             </w:r>
           </w:p>
         </w:tc>
@@ -5902,7 +5902,7 @@
           </w:tcPr>
           <w:p>
             <w:r>
-              <w:t>docs/corresponding_author_reply_intake_runbook.md</w:t>
+              <w:t>docs/corresponding_author_proxy_assumption.md</w:t>
             </w:r>
           </w:p>
         </w:tc>
@@ -5934,7 +5934,7 @@
           </w:tcPr>
           <w:p>
             <w:r>
-              <w:t>docs/corresponding_author_signoff_tracker.md</w:t>
+              <w:t>docs/corresponding_author_reply_intake_runbook.md</w:t>
             </w:r>
           </w:p>
         </w:tc>
@@ -5966,7 +5966,7 @@
           </w:tcPr>
           <w:p>
             <w:r>
-              <w:t>docs/current_evidence_freeze_2026-05-12.md</w:t>
+              <w:t>docs/corresponding_author_signoff_tracker.md</w:t>
             </w:r>
           </w:p>
         </w:tc>
@@ -5978,7 +5978,7 @@
           </w:tcPr>
           <w:p>
             <w:r>
-              <w:t>M</w:t>
+              <w:t>A</w:t>
             </w:r>
           </w:p>
         </w:tc>
@@ -5998,7 +5998,7 @@
           </w:tcPr>
           <w:p>
             <w:r>
-              <w:t>docs/editorial_presubmission_packet.md</w:t>
+              <w:t>docs/current_evidence_freeze_2026-05-12.md</w:t>
             </w:r>
           </w:p>
         </w:tc>
@@ -6010,7 +6010,7 @@
           </w:tcPr>
           <w:p>
             <w:r>
-              <w:t>A</w:t>
+              <w:t>M</w:t>
             </w:r>
           </w:p>
         </w:tc>
@@ -6030,7 +6030,7 @@
           </w:tcPr>
           <w:p>
             <w:r>
-              <w:t>docs/figure4_pdac_tme_wording_freeze.md</w:t>
+              <w:t>docs/editorial_presubmission_packet.md</w:t>
             </w:r>
           </w:p>
         </w:tc>
@@ -6062,7 +6062,7 @@
           </w:tcPr>
           <w:p>
             <w:r>
-              <w:t>docs/figure4_strengthened_text_audit.md</w:t>
+              <w:t>docs/figure4_pdac_tme_wording_freeze.md</w:t>
             </w:r>
           </w:p>
         </w:tc>
@@ -6094,7 +6094,7 @@
           </w:tcPr>
           <w:p>
             <w:r>
-              <w:t>docs/figure_caption_source_audit.md</w:t>
+              <w:t>docs/figure4_strengthened_text_audit.md</w:t>
             </w:r>
           </w:p>
         </w:tc>
@@ -6126,7 +6126,7 @@
           </w:tcPr>
           <w:p>
             <w:r>
-              <w:t>docs/genome_biology_fallback_v2_packet.md</w:t>
+              <w:t>docs/figure_caption_source_audit.md</w:t>
             </w:r>
           </w:p>
         </w:tc>
@@ -6158,7 +6158,7 @@
           </w:tcPr>
           <w:p>
             <w:r>
-              <w:t>docs/high_impact_submission_dashboard.md</w:t>
+              <w:t>docs/genome_biology_fallback_v2_packet.md</w:t>
             </w:r>
           </w:p>
         </w:tc>
@@ -6170,7 +6170,7 @@
           </w:tcPr>
           <w:p>
             <w:r>
-              <w:t>M</w:t>
+              <w:t>A</w:t>
             </w:r>
           </w:p>
         </w:tc>
@@ -6190,7 +6190,7 @@
           </w:tcPr>
           <w:p>
             <w:r>
-              <w:t>docs/jif20_50_gap_assessment.md</w:t>
+              <w:t>docs/high_impact_submission_dashboard.md</w:t>
             </w:r>
           </w:p>
         </w:tc>
@@ -6222,7 +6222,7 @@
           </w:tcPr>
           <w:p>
             <w:r>
-              <w:t>docs/manual_author_execution_steps.md</w:t>
+              <w:t>docs/jif20_50_gap_assessment.md</w:t>
             </w:r>
           </w:p>
         </w:tc>
@@ -6234,7 +6234,7 @@
           </w:tcPr>
           <w:p>
             <w:r>
-              <w:t>A</w:t>
+              <w:t>M</w:t>
             </w:r>
           </w:p>
         </w:tc>
@@ -6254,7 +6254,7 @@
           </w:tcPr>
           <w:p>
             <w:r>
-              <w:t>docs/manual_next_actions_20_50.md</w:t>
+              <w:t>docs/manual_author_execution_steps.md</w:t>
             </w:r>
           </w:p>
         </w:tc>
@@ -6286,7 +6286,7 @@
           </w:tcPr>
           <w:p>
             <w:r>
-              <w:t>docs/manuscript_grade_null_power_grid_design.md</w:t>
+              <w:t>docs/manual_next_actions_20_50.md</w:t>
             </w:r>
           </w:p>
         </w:tc>
@@ -6318,7 +6318,7 @@
           </w:tcPr>
           <w:p>
             <w:r>
-              <w:t>docs/mentor_journal_decision_2026-05-10.md</w:t>
+              <w:t>docs/manuscript_grade_null_power_grid_design.md</w:t>
             </w:r>
           </w:p>
         </w:tc>
@@ -6350,7 +6350,7 @@
           </w:tcPr>
           <w:p>
             <w:r>
-              <w:t>docs/nature_methods_48h_execution_packet.md</w:t>
+              <w:t>docs/mentor_journal_decision_2026-05-10.md</w:t>
             </w:r>
           </w:p>
         </w:tc>
@@ -6382,7 +6382,7 @@
           </w:tcPr>
           <w:p>
             <w:r>
-              <w:t>docs/nature_methods_go_no_go_final.md</w:t>
+              <w:t>docs/nature_methods_48h_execution_packet.md</w:t>
             </w:r>
           </w:p>
         </w:tc>
@@ -6414,7 +6414,7 @@
           </w:tcPr>
           <w:p>
             <w:r>
-              <w:t>docs/nature_methods_next_round_gate_board.md</w:t>
+              <w:t>docs/nature_methods_go_no_go_final.md</w:t>
             </w:r>
           </w:p>
         </w:tc>
@@ -6446,7 +6446,7 @@
           </w:tcPr>
           <w:p>
             <w:r>
-              <w:t>docs/nature_methods_official_route_verification.md</w:t>
+              <w:t>docs/nature_methods_next_round_gate_board.md</w:t>
             </w:r>
           </w:p>
         </w:tc>
@@ -6478,7 +6478,7 @@
           </w:tcPr>
           <w:p>
             <w:r>
-              <w:t>docs/nature_methods_presubmission_send_runbook.md</w:t>
+              <w:t>docs/nature_methods_official_route_verification.md</w:t>
             </w:r>
           </w:p>
         </w:tc>
@@ -6490,7 +6490,7 @@
           </w:tcPr>
           <w:p>
             <w:r>
-              <w:t>M</w:t>
+              <w:t>A</w:t>
             </w:r>
           </w:p>
         </w:tc>
@@ -6510,7 +6510,7 @@
           </w:tcPr>
           <w:p>
             <w:r>
-              <w:t>docs/nature_reporting_summary_draft.md</w:t>
+              <w:t>docs/nature_methods_presubmission_send_runbook.md</w:t>
             </w:r>
           </w:p>
         </w:tc>
@@ -6542,7 +6542,7 @@
           </w:tcPr>
           <w:p>
             <w:r>
-              <w:t>docs/no_call_decision_map.md</w:t>
+              <w:t>docs/nature_reporting_summary_draft.md</w:t>
             </w:r>
           </w:p>
         </w:tc>
@@ -7118,7 +7118,7 @@
           </w:tcPr>
           <w:p>
             <w:r>
-              <w:t>33 frozen evidence items exist.</w:t>
+              <w:t>34 frozen evidence items exist.</w:t>
             </w:r>
           </w:p>
         </w:tc>

</xml_diff>

<commit_message>
Add author confirmation delivery bundle
</commit_message>
<xml_diff>
--- a/output/doc/RMTGuard_external_review_packet_2026-05-12.docx
+++ b/output/doc/RMTGuard_external_review_packet_2026-05-12.docx
@@ -27,7 +27,7 @@
     </w:p>
     <w:p>
       <w:r>
-        <w:t>Generated: 2026-05-12 13:59:13</w:t>
+        <w:t>Generated: 2026-05-12 14:07:10</w:t>
       </w:r>
     </w:p>
     <w:tbl>
@@ -221,7 +221,7 @@
       <w:r>
         <w:drawing>
           <wp:inline xmlns:a="http://schemas.openxmlformats.org/drawingml/2006/main" xmlns:pic="http://schemas.openxmlformats.org/drawingml/2006/picture">
-            <wp:extent cx="5120640" cy="8933099"/>
+            <wp:extent cx="5120640" cy="9089712"/>
             <wp:docPr id="1" name="Picture 1"/>
             <wp:cNvGraphicFramePr>
               <a:graphicFrameLocks noChangeAspect="1"/>
@@ -242,7 +242,7 @@
                   <pic:spPr>
                     <a:xfrm>
                       <a:off x="0" y="0"/>
-                      <a:ext cx="5120640" cy="8933099"/>
+                      <a:ext cx="5120640" cy="9089712"/>
                     </a:xfrm>
                     <a:prstGeom prst="rect"/>
                   </pic:spPr>
@@ -330,7 +330,7 @@
         <w:pStyle w:val="ListBullet"/>
       </w:pPr>
       <w:r>
-        <w:t>Items checked: 34</w:t>
+        <w:t>Items checked: 35</w:t>
       </w:r>
     </w:p>
     <w:p>
@@ -386,7 +386,7 @@
         <w:pStyle w:val="ListBullet"/>
       </w:pPr>
       <w:r>
-        <w:t>manual_blocker: 3</w:t>
+        <w:t>manual_blocker: 4</w:t>
       </w:r>
     </w:p>
     <w:p>
@@ -1026,7 +1026,7 @@
           </w:tcPr>
           <w:p>
             <w:r>
-              <w:t>Send the author declaration email or WeChat draft with the Word packet, then save written replies.</w:t>
+              <w:t>Send the author confirmation delivery ZIP or the Word packet plus email/WeChat draft, then save written replies.</w:t>
             </w:r>
           </w:p>
         </w:tc>
@@ -1886,7 +1886,7 @@
         <w:pStyle w:val="ListBullet"/>
       </w:pPr>
       <w:r>
-        <w:t>author_declarations: 8 author-confirmation items remain. Next: Send the author declaration email or WeChat draft with the Word packet, then save written replies.</w:t>
+        <w:t>author_declarations: 8 author-confirmation items remain. Next: Send the author confirmation delivery ZIP or the Word packet plus email/WeChat draft, then save written replies.</w:t>
       </w:r>
     </w:p>
     <w:p>
@@ -1975,6 +1975,14 @@
       </w:pPr>
       <w:r>
         <w:t>manuscript/author_declaration_confirmation_email_draft.md</w:t>
+      </w:r>
+    </w:p>
+    <w:p>
+      <w:pPr>
+        <w:pStyle w:val="ListBullet"/>
+      </w:pPr>
+      <w:r>
+        <w:t>output/delivery/RMTGuard_author_confirmation_delivery_2026-05-12.zip</w:t>
       </w:r>
     </w:p>
     <w:p>

</xml_diff>

<commit_message>
Refresh preflight after delivery bundle
</commit_message>
<xml_diff>
--- a/output/doc/RMTGuard_external_review_packet_2026-05-12.docx
+++ b/output/doc/RMTGuard_external_review_packet_2026-05-12.docx
@@ -27,7 +27,7 @@
     </w:p>
     <w:p>
       <w:r>
-        <w:t>Generated: 2026-05-12 14:07:10</w:t>
+        <w:t>Generated: 2026-05-12 14:09:43</w:t>
       </w:r>
     </w:p>
     <w:tbl>
@@ -4163,7 +4163,7 @@
         <w:pStyle w:val="ListBullet"/>
       </w:pPr>
       <w:r>
-        <w:t>Commits after v0.1.0: 55.</w:t>
+        <w:t>Commits after v0.1.0: 58.</w:t>
       </w:r>
     </w:p>
     <w:p>
@@ -4171,7 +4171,7 @@
         <w:pStyle w:val="ListBullet"/>
       </w:pPr>
       <w:r>
-        <w:t>Changed files after v0.1.0: 272.</w:t>
+        <w:t>Changed files after v0.1.0: 276.</w:t>
       </w:r>
     </w:p>
     <w:p>
@@ -4179,7 +4179,7 @@
         <w:pStyle w:val="ListBullet"/>
       </w:pPr>
       <w:r>
-        <w:t>Manuscript-facing changed files: 262.</w:t>
+        <w:t>Manuscript-facing changed files: 265.</w:t>
       </w:r>
     </w:p>
     <w:p>
@@ -4350,7 +4350,7 @@
           </w:tcPr>
           <w:p>
             <w:r>
-              <w:t>2c35393cb67be4aa51a0e54ed278e9a90ac85712</w:t>
+              <w:t>7a6c87368f350887a9f6dcb0a715cdb1452d534d</w:t>
             </w:r>
           </w:p>
         </w:tc>
@@ -4370,7 +4370,7 @@
           </w:tcPr>
           <w:p>
             <w:r>
-              <w:t>55 commits after v0.1.0.</w:t>
+              <w:t>58 commits after v0.1.0.</w:t>
             </w:r>
           </w:p>
         </w:tc>
@@ -4454,7 +4454,7 @@
           </w:tcPr>
           <w:p>
             <w:r>
-              <w:t>262</w:t>
+              <w:t>265</w:t>
             </w:r>
           </w:p>
         </w:tc>
@@ -4558,7 +4558,7 @@
           </w:tcPr>
           <w:p>
             <w:r>
-              <w:t>53</w:t>
+              <w:t>54</w:t>
             </w:r>
           </w:p>
         </w:tc>
@@ -4935,7 +4935,7 @@
           </w:tcPr>
           <w:p>
             <w:r>
-              <w:t>9</w:t>
+              <w:t>10</w:t>
             </w:r>
           </w:p>
         </w:tc>
@@ -4979,7 +4979,7 @@
           </w:tcPr>
           <w:p>
             <w:r>
-              <w:t>49</w:t>
+              <w:t>50</w:t>
             </w:r>
           </w:p>
         </w:tc>
@@ -5089,7 +5089,7 @@
           </w:tcPr>
           <w:p>
             <w:r>
-              <w:t>56</w:t>
+              <w:t>57</w:t>
             </w:r>
           </w:p>
         </w:tc>
@@ -5111,7 +5111,7 @@
           </w:tcPr>
           <w:p>
             <w:r>
-              <w:t>40</w:t>
+              <w:t>41</w:t>
             </w:r>
           </w:p>
         </w:tc>
@@ -5196,7 +5196,7 @@
           </w:tcPr>
           <w:p>
             <w:r>
-              <w:t>230</w:t>
+              <w:t>234</w:t>
             </w:r>
           </w:p>
         </w:tc>
@@ -5590,7 +5590,7 @@
           </w:tcPr>
           <w:p>
             <w:r>
-              <w:t>docs/author_declaration_confirmation_packet.md</w:t>
+              <w:t>docs/author_confirmation_delivery_bundle.md</w:t>
             </w:r>
           </w:p>
         </w:tc>
@@ -5622,7 +5622,7 @@
           </w:tcPr>
           <w:p>
             <w:r>
-              <w:t>docs/author_declaration_reply_intake_runbook.md</w:t>
+              <w:t>docs/author_declaration_confirmation_packet.md</w:t>
             </w:r>
           </w:p>
         </w:tc>
@@ -5634,7 +5634,7 @@
           </w:tcPr>
           <w:p>
             <w:r>
-              <w:t>M</w:t>
+              <w:t>A</w:t>
             </w:r>
           </w:p>
         </w:tc>
@@ -5654,7 +5654,7 @@
           </w:tcPr>
           <w:p>
             <w:r>
-              <w:t>docs/author_declarations_and_credit_roles.md</w:t>
+              <w:t>docs/author_declaration_reply_intake_runbook.md</w:t>
             </w:r>
           </w:p>
         </w:tc>
@@ -5686,7 +5686,7 @@
           </w:tcPr>
           <w:p>
             <w:r>
-              <w:t>docs/author_metadata_status.md</w:t>
+              <w:t>docs/author_declarations_and_credit_roles.md</w:t>
             </w:r>
           </w:p>
         </w:tc>
@@ -5718,7 +5718,7 @@
           </w:tcPr>
           <w:p>
             <w:r>
-              <w:t>docs/author_release_execution_packet.md</w:t>
+              <w:t>docs/author_metadata_status.md</w:t>
             </w:r>
           </w:p>
         </w:tc>
@@ -5730,7 +5730,7 @@
           </w:tcPr>
           <w:p>
             <w:r>
-              <w:t>A</w:t>
+              <w:t>M</w:t>
             </w:r>
           </w:p>
         </w:tc>
@@ -5750,7 +5750,7 @@
           </w:tcPr>
           <w:p>
             <w:r>
-              <w:t>docs/benchmark_upgrade_from_concord_sclens_2026-05-12.md</w:t>
+              <w:t>docs/author_release_execution_packet.md</w:t>
             </w:r>
           </w:p>
         </w:tc>
@@ -5762,7 +5762,7 @@
           </w:tcPr>
           <w:p>
             <w:r>
-              <w:t>M</w:t>
+              <w:t>A</w:t>
             </w:r>
           </w:p>
         </w:tc>
@@ -5782,7 +5782,7 @@
           </w:tcPr>
           <w:p>
             <w:r>
-              <w:t>docs/claim_boundary_lint.md</w:t>
+              <w:t>docs/benchmark_upgrade_from_concord_sclens_2026-05-12.md</w:t>
             </w:r>
           </w:p>
         </w:tc>
@@ -5814,7 +5814,7 @@
           </w:tcPr>
           <w:p>
             <w:r>
-              <w:t>docs/claim_traceability.md</w:t>
+              <w:t>docs/claim_boundary_lint.md</w:t>
             </w:r>
           </w:p>
         </w:tc>
@@ -5826,7 +5826,7 @@
           </w:tcPr>
           <w:p>
             <w:r>
-              <w:t>A</w:t>
+              <w:t>M</w:t>
             </w:r>
           </w:p>
         </w:tc>
@@ -5846,7 +5846,7 @@
           </w:tcPr>
           <w:p>
             <w:r>
-              <w:t>docs/competitor_positioning_concord_sclens_2026-05-12.md</w:t>
+              <w:t>docs/claim_traceability.md</w:t>
             </w:r>
           </w:p>
         </w:tc>
@@ -5858,7 +5858,7 @@
           </w:tcPr>
           <w:p>
             <w:r>
-              <w:t>M</w:t>
+              <w:t>A</w:t>
             </w:r>
           </w:p>
         </w:tc>
@@ -5878,7 +5878,7 @@
           </w:tcPr>
           <w:p>
             <w:r>
-              <w:t>docs/component_ablation_benchmark.md</w:t>
+              <w:t>docs/competitor_positioning_concord_sclens_2026-05-12.md</w:t>
             </w:r>
           </w:p>
         </w:tc>
@@ -5890,7 +5890,7 @@
           </w:tcPr>
           <w:p>
             <w:r>
-              <w:t>A</w:t>
+              <w:t>M</w:t>
             </w:r>
           </w:p>
         </w:tc>
@@ -5910,7 +5910,7 @@
           </w:tcPr>
           <w:p>
             <w:r>
-              <w:t>docs/corresponding_author_proxy_assumption.md</w:t>
+              <w:t>docs/component_ablation_benchmark.md</w:t>
             </w:r>
           </w:p>
         </w:tc>
@@ -5942,7 +5942,7 @@
           </w:tcPr>
           <w:p>
             <w:r>
-              <w:t>docs/corresponding_author_reply_intake_runbook.md</w:t>
+              <w:t>docs/corresponding_author_proxy_assumption.md</w:t>
             </w:r>
           </w:p>
         </w:tc>
@@ -5974,7 +5974,7 @@
           </w:tcPr>
           <w:p>
             <w:r>
-              <w:t>docs/corresponding_author_signoff_tracker.md</w:t>
+              <w:t>docs/corresponding_author_reply_intake_runbook.md</w:t>
             </w:r>
           </w:p>
         </w:tc>
@@ -6006,7 +6006,7 @@
           </w:tcPr>
           <w:p>
             <w:r>
-              <w:t>docs/current_evidence_freeze_2026-05-12.md</w:t>
+              <w:t>docs/corresponding_author_signoff_tracker.md</w:t>
             </w:r>
           </w:p>
         </w:tc>
@@ -6018,7 +6018,7 @@
           </w:tcPr>
           <w:p>
             <w:r>
-              <w:t>M</w:t>
+              <w:t>A</w:t>
             </w:r>
           </w:p>
         </w:tc>
@@ -6038,7 +6038,7 @@
           </w:tcPr>
           <w:p>
             <w:r>
-              <w:t>docs/editorial_presubmission_packet.md</w:t>
+              <w:t>docs/current_evidence_freeze_2026-05-12.md</w:t>
             </w:r>
           </w:p>
         </w:tc>
@@ -6050,7 +6050,7 @@
           </w:tcPr>
           <w:p>
             <w:r>
-              <w:t>A</w:t>
+              <w:t>M</w:t>
             </w:r>
           </w:p>
         </w:tc>
@@ -6070,7 +6070,7 @@
           </w:tcPr>
           <w:p>
             <w:r>
-              <w:t>docs/figure4_pdac_tme_wording_freeze.md</w:t>
+              <w:t>docs/editorial_presubmission_packet.md</w:t>
             </w:r>
           </w:p>
         </w:tc>
@@ -6102,7 +6102,7 @@
           </w:tcPr>
           <w:p>
             <w:r>
-              <w:t>docs/figure4_strengthened_text_audit.md</w:t>
+              <w:t>docs/figure4_pdac_tme_wording_freeze.md</w:t>
             </w:r>
           </w:p>
         </w:tc>
@@ -6134,7 +6134,7 @@
           </w:tcPr>
           <w:p>
             <w:r>
-              <w:t>docs/figure_caption_source_audit.md</w:t>
+              <w:t>docs/figure4_strengthened_text_audit.md</w:t>
             </w:r>
           </w:p>
         </w:tc>
@@ -6166,7 +6166,7 @@
           </w:tcPr>
           <w:p>
             <w:r>
-              <w:t>docs/genome_biology_fallback_v2_packet.md</w:t>
+              <w:t>docs/figure_caption_source_audit.md</w:t>
             </w:r>
           </w:p>
         </w:tc>
@@ -6198,7 +6198,7 @@
           </w:tcPr>
           <w:p>
             <w:r>
-              <w:t>docs/high_impact_submission_dashboard.md</w:t>
+              <w:t>docs/genome_biology_fallback_v2_packet.md</w:t>
             </w:r>
           </w:p>
         </w:tc>
@@ -6210,7 +6210,7 @@
           </w:tcPr>
           <w:p>
             <w:r>
-              <w:t>M</w:t>
+              <w:t>A</w:t>
             </w:r>
           </w:p>
         </w:tc>
@@ -6230,7 +6230,7 @@
           </w:tcPr>
           <w:p>
             <w:r>
-              <w:t>docs/jif20_50_gap_assessment.md</w:t>
+              <w:t>docs/high_impact_submission_dashboard.md</w:t>
             </w:r>
           </w:p>
         </w:tc>
@@ -6262,7 +6262,7 @@
           </w:tcPr>
           <w:p>
             <w:r>
-              <w:t>docs/manual_author_execution_steps.md</w:t>
+              <w:t>docs/jif20_50_gap_assessment.md</w:t>
             </w:r>
           </w:p>
         </w:tc>
@@ -6274,7 +6274,7 @@
           </w:tcPr>
           <w:p>
             <w:r>
-              <w:t>A</w:t>
+              <w:t>M</w:t>
             </w:r>
           </w:p>
         </w:tc>
@@ -6294,7 +6294,7 @@
           </w:tcPr>
           <w:p>
             <w:r>
-              <w:t>docs/manual_next_actions_20_50.md</w:t>
+              <w:t>docs/manual_author_execution_steps.md</w:t>
             </w:r>
           </w:p>
         </w:tc>
@@ -6326,7 +6326,7 @@
           </w:tcPr>
           <w:p>
             <w:r>
-              <w:t>docs/manuscript_grade_null_power_grid_design.md</w:t>
+              <w:t>docs/manual_next_actions_20_50.md</w:t>
             </w:r>
           </w:p>
         </w:tc>
@@ -6358,7 +6358,7 @@
           </w:tcPr>
           <w:p>
             <w:r>
-              <w:t>docs/mentor_journal_decision_2026-05-10.md</w:t>
+              <w:t>docs/manuscript_grade_null_power_grid_design.md</w:t>
             </w:r>
           </w:p>
         </w:tc>
@@ -6390,7 +6390,7 @@
           </w:tcPr>
           <w:p>
             <w:r>
-              <w:t>docs/nature_methods_48h_execution_packet.md</w:t>
+              <w:t>docs/mentor_journal_decision_2026-05-10.md</w:t>
             </w:r>
           </w:p>
         </w:tc>
@@ -6422,7 +6422,7 @@
           </w:tcPr>
           <w:p>
             <w:r>
-              <w:t>docs/nature_methods_go_no_go_final.md</w:t>
+              <w:t>docs/nature_methods_48h_execution_packet.md</w:t>
             </w:r>
           </w:p>
         </w:tc>
@@ -6454,7 +6454,7 @@
           </w:tcPr>
           <w:p>
             <w:r>
-              <w:t>docs/nature_methods_next_round_gate_board.md</w:t>
+              <w:t>docs/nature_methods_go_no_go_final.md</w:t>
             </w:r>
           </w:p>
         </w:tc>
@@ -6486,7 +6486,7 @@
           </w:tcPr>
           <w:p>
             <w:r>
-              <w:t>docs/nature_methods_official_route_verification.md</w:t>
+              <w:t>docs/nature_methods_next_round_gate_board.md</w:t>
             </w:r>
           </w:p>
         </w:tc>
@@ -6518,7 +6518,7 @@
           </w:tcPr>
           <w:p>
             <w:r>
-              <w:t>docs/nature_methods_presubmission_send_runbook.md</w:t>
+              <w:t>docs/nature_methods_official_route_verification.md</w:t>
             </w:r>
           </w:p>
         </w:tc>
@@ -6530,7 +6530,7 @@
           </w:tcPr>
           <w:p>
             <w:r>
-              <w:t>M</w:t>
+              <w:t>A</w:t>
             </w:r>
           </w:p>
         </w:tc>
@@ -6550,7 +6550,7 @@
           </w:tcPr>
           <w:p>
             <w:r>
-              <w:t>docs/nature_reporting_summary_draft.md</w:t>
+              <w:t>docs/nature_methods_presubmission_send_runbook.md</w:t>
             </w:r>
           </w:p>
         </w:tc>
@@ -7126,7 +7126,7 @@
           </w:tcPr>
           <w:p>
             <w:r>
-              <w:t>34 frozen evidence items exist.</w:t>
+              <w:t>35 frozen evidence items exist.</w:t>
             </w:r>
           </w:p>
         </w:tc>

</xml_diff>

<commit_message>
Record preliminary mentor author reply
</commit_message>
<xml_diff>
--- a/output/doc/RMTGuard_external_review_packet_2026-05-12.docx
+++ b/output/doc/RMTGuard_external_review_packet_2026-05-12.docx
@@ -27,7 +27,7 @@
     </w:p>
     <w:p>
       <w:r>
-        <w:t>Generated: 2026-05-12 14:09:43</w:t>
+        <w:t>Generated: 2026-05-12 14:35:31</w:t>
       </w:r>
     </w:p>
     <w:tbl>
@@ -221,7 +221,7 @@
       <w:r>
         <w:drawing>
           <wp:inline xmlns:a="http://schemas.openxmlformats.org/drawingml/2006/main" xmlns:pic="http://schemas.openxmlformats.org/drawingml/2006/picture">
-            <wp:extent cx="5120640" cy="9089712"/>
+            <wp:extent cx="5120640" cy="9246325"/>
             <wp:docPr id="1" name="Picture 1"/>
             <wp:cNvGraphicFramePr>
               <a:graphicFrameLocks noChangeAspect="1"/>
@@ -242,7 +242,7 @@
                   <pic:spPr>
                     <a:xfrm>
                       <a:off x="0" y="0"/>
-                      <a:ext cx="5120640" cy="9089712"/>
+                      <a:ext cx="5120640" cy="9246325"/>
                     </a:xfrm>
                     <a:prstGeom prst="rect"/>
                   </pic:spPr>
@@ -330,7 +330,7 @@
         <w:pStyle w:val="ListBullet"/>
       </w:pPr>
       <w:r>
-        <w:t>Items checked: 35</w:t>
+        <w:t>Items checked: 36</w:t>
       </w:r>
     </w:p>
     <w:p>
@@ -386,7 +386,7 @@
         <w:pStyle w:val="ListBullet"/>
       </w:pPr>
       <w:r>
-        <w:t>manual_blocker: 4</w:t>
+        <w:t>manual_blocker: 5</w:t>
       </w:r>
     </w:p>
     <w:p>
@@ -1026,7 +1026,7 @@
           </w:tcPr>
           <w:p>
             <w:r>
-              <w:t>Send the author confirmation delivery ZIP or the Word packet plus email/WeChat draft, then save written replies.</w:t>
+              <w:t>A preliminary mentor OK is recorded; obtain explicit final wording for funding, COI, postal code, CRediT, reporting summary, and named Figure 4 acknowledgement.</w:t>
             </w:r>
           </w:p>
         </w:tc>
@@ -1886,7 +1886,7 @@
         <w:pStyle w:val="ListBullet"/>
       </w:pPr>
       <w:r>
-        <w:t>author_declarations: 8 author-confirmation items remain. Next: Send the author confirmation delivery ZIP or the Word packet plus email/WeChat draft, then save written replies.</w:t>
+        <w:t>author_declarations: 8 author-confirmation items remain. Next: A preliminary mentor OK is recorded; obtain explicit final wording for funding, COI, postal code, CRediT, reporting summary, and named Figure 4 acknowledgement.</w:t>
       </w:r>
     </w:p>
     <w:p>
@@ -1983,6 +1983,14 @@
       </w:pPr>
       <w:r>
         <w:t>output/delivery/RMTGuard_author_confirmation_delivery_2026-05-12.zip</w:t>
+      </w:r>
+    </w:p>
+    <w:p>
+      <w:pPr>
+        <w:pStyle w:val="ListBullet"/>
+      </w:pPr>
+      <w:r>
+        <w:t>docs/author_reply_triage.md</w:t>
       </w:r>
     </w:p>
     <w:p>

</xml_diff>

<commit_message>
Refresh gates after preliminary mentor reply
</commit_message>
<xml_diff>
--- a/output/doc/RMTGuard_external_review_packet_2026-05-12.docx
+++ b/output/doc/RMTGuard_external_review_packet_2026-05-12.docx
@@ -27,7 +27,7 @@
     </w:p>
     <w:p>
       <w:r>
-        <w:t>Generated: 2026-05-12 14:35:31</w:t>
+        <w:t>Generated: 2026-05-12 14:38:43</w:t>
       </w:r>
     </w:p>
     <w:tbl>
@@ -1244,7 +1244,7 @@
           </w:tcPr>
           <w:p>
             <w:r>
-              <w:t>pass</w:t>
+              <w:t>blocked</w:t>
             </w:r>
           </w:p>
         </w:tc>
@@ -1264,7 +1264,7 @@
           </w:tcPr>
           <w:p>
             <w:r>
-              <w:t>Worktree is clean except self-generated preflight outputs.</w:t>
+              <w:t>M docs/post_release_version_coverage_audit.md; M results/submission/post_release_changed_files.tsv; M results/submission/post_release_version_coverage_audit.tsv</w:t>
             </w:r>
           </w:p>
         </w:tc>
@@ -4171,7 +4171,7 @@
         <w:pStyle w:val="ListBullet"/>
       </w:pPr>
       <w:r>
-        <w:t>Commits after v0.1.0: 58.</w:t>
+        <w:t>Commits after v0.1.0: 61.</w:t>
       </w:r>
     </w:p>
     <w:p>
@@ -4179,7 +4179,7 @@
         <w:pStyle w:val="ListBullet"/>
       </w:pPr>
       <w:r>
-        <w:t>Changed files after v0.1.0: 276.</w:t>
+        <w:t>Changed files after v0.1.0: 281.</w:t>
       </w:r>
     </w:p>
     <w:p>
@@ -4187,7 +4187,7 @@
         <w:pStyle w:val="ListBullet"/>
       </w:pPr>
       <w:r>
-        <w:t>Manuscript-facing changed files: 265.</w:t>
+        <w:t>Manuscript-facing changed files: 270.</w:t>
       </w:r>
     </w:p>
     <w:p>
@@ -4358,7 +4358,7 @@
           </w:tcPr>
           <w:p>
             <w:r>
-              <w:t>7a6c87368f350887a9f6dcb0a715cdb1452d534d</w:t>
+              <w:t>3eaa218103be71c154ad3a15f10d64efdbd249ba</w:t>
             </w:r>
           </w:p>
         </w:tc>
@@ -4378,7 +4378,7 @@
           </w:tcPr>
           <w:p>
             <w:r>
-              <w:t>58 commits after v0.1.0.</w:t>
+              <w:t>61 commits after v0.1.0.</w:t>
             </w:r>
           </w:p>
         </w:tc>
@@ -4462,7 +4462,7 @@
           </w:tcPr>
           <w:p>
             <w:r>
-              <w:t>265</w:t>
+              <w:t>270</w:t>
             </w:r>
           </w:p>
         </w:tc>
@@ -4566,7 +4566,7 @@
           </w:tcPr>
           <w:p>
             <w:r>
-              <w:t>54</w:t>
+              <w:t>55</w:t>
             </w:r>
           </w:p>
         </w:tc>
@@ -4921,7 +4921,7 @@
           </w:tcPr>
           <w:p>
             <w:r>
-              <w:t>4</w:t>
+              <w:t>6</w:t>
             </w:r>
           </w:p>
         </w:tc>
@@ -4987,7 +4987,7 @@
           </w:tcPr>
           <w:p>
             <w:r>
-              <w:t>50</w:t>
+              <w:t>51</w:t>
             </w:r>
           </w:p>
         </w:tc>
@@ -5097,7 +5097,7 @@
           </w:tcPr>
           <w:p>
             <w:r>
-              <w:t>57</w:t>
+              <w:t>58</w:t>
             </w:r>
           </w:p>
         </w:tc>
@@ -5119,7 +5119,7 @@
           </w:tcPr>
           <w:p>
             <w:r>
-              <w:t>41</w:t>
+              <w:t>42</w:t>
             </w:r>
           </w:p>
         </w:tc>
@@ -5204,7 +5204,7 @@
           </w:tcPr>
           <w:p>
             <w:r>
-              <w:t>234</w:t>
+              <w:t>239</w:t>
             </w:r>
           </w:p>
         </w:tc>
@@ -5790,7 +5790,7 @@
           </w:tcPr>
           <w:p>
             <w:r>
-              <w:t>docs/benchmark_upgrade_from_concord_sclens_2026-05-12.md</w:t>
+              <w:t>docs/author_reply_triage.md</w:t>
             </w:r>
           </w:p>
         </w:tc>
@@ -5802,7 +5802,7 @@
           </w:tcPr>
           <w:p>
             <w:r>
-              <w:t>M</w:t>
+              <w:t>A</w:t>
             </w:r>
           </w:p>
         </w:tc>
@@ -5822,7 +5822,7 @@
           </w:tcPr>
           <w:p>
             <w:r>
-              <w:t>docs/claim_boundary_lint.md</w:t>
+              <w:t>docs/benchmark_upgrade_from_concord_sclens_2026-05-12.md</w:t>
             </w:r>
           </w:p>
         </w:tc>
@@ -5854,7 +5854,7 @@
           </w:tcPr>
           <w:p>
             <w:r>
-              <w:t>docs/claim_traceability.md</w:t>
+              <w:t>docs/claim_boundary_lint.md</w:t>
             </w:r>
           </w:p>
         </w:tc>
@@ -5866,7 +5866,7 @@
           </w:tcPr>
           <w:p>
             <w:r>
-              <w:t>A</w:t>
+              <w:t>M</w:t>
             </w:r>
           </w:p>
         </w:tc>
@@ -5886,7 +5886,7 @@
           </w:tcPr>
           <w:p>
             <w:r>
-              <w:t>docs/competitor_positioning_concord_sclens_2026-05-12.md</w:t>
+              <w:t>docs/claim_traceability.md</w:t>
             </w:r>
           </w:p>
         </w:tc>
@@ -5898,7 +5898,7 @@
           </w:tcPr>
           <w:p>
             <w:r>
-              <w:t>M</w:t>
+              <w:t>A</w:t>
             </w:r>
           </w:p>
         </w:tc>
@@ -5918,7 +5918,7 @@
           </w:tcPr>
           <w:p>
             <w:r>
-              <w:t>docs/component_ablation_benchmark.md</w:t>
+              <w:t>docs/competitor_positioning_concord_sclens_2026-05-12.md</w:t>
             </w:r>
           </w:p>
         </w:tc>
@@ -5930,7 +5930,7 @@
           </w:tcPr>
           <w:p>
             <w:r>
-              <w:t>A</w:t>
+              <w:t>M</w:t>
             </w:r>
           </w:p>
         </w:tc>
@@ -5950,7 +5950,7 @@
           </w:tcPr>
           <w:p>
             <w:r>
-              <w:t>docs/corresponding_author_proxy_assumption.md</w:t>
+              <w:t>docs/component_ablation_benchmark.md</w:t>
             </w:r>
           </w:p>
         </w:tc>
@@ -5982,7 +5982,7 @@
           </w:tcPr>
           <w:p>
             <w:r>
-              <w:t>docs/corresponding_author_reply_intake_runbook.md</w:t>
+              <w:t>docs/corresponding_author_proxy_assumption.md</w:t>
             </w:r>
           </w:p>
         </w:tc>
@@ -6014,7 +6014,7 @@
           </w:tcPr>
           <w:p>
             <w:r>
-              <w:t>docs/corresponding_author_signoff_tracker.md</w:t>
+              <w:t>docs/corresponding_author_reply_intake_runbook.md</w:t>
             </w:r>
           </w:p>
         </w:tc>
@@ -6046,7 +6046,7 @@
           </w:tcPr>
           <w:p>
             <w:r>
-              <w:t>docs/current_evidence_freeze_2026-05-12.md</w:t>
+              <w:t>docs/corresponding_author_signoff_tracker.md</w:t>
             </w:r>
           </w:p>
         </w:tc>
@@ -6058,7 +6058,7 @@
           </w:tcPr>
           <w:p>
             <w:r>
-              <w:t>M</w:t>
+              <w:t>A</w:t>
             </w:r>
           </w:p>
         </w:tc>
@@ -6078,7 +6078,7 @@
           </w:tcPr>
           <w:p>
             <w:r>
-              <w:t>docs/editorial_presubmission_packet.md</w:t>
+              <w:t>docs/current_evidence_freeze_2026-05-12.md</w:t>
             </w:r>
           </w:p>
         </w:tc>
@@ -6090,7 +6090,7 @@
           </w:tcPr>
           <w:p>
             <w:r>
-              <w:t>A</w:t>
+              <w:t>M</w:t>
             </w:r>
           </w:p>
         </w:tc>
@@ -6110,7 +6110,7 @@
           </w:tcPr>
           <w:p>
             <w:r>
-              <w:t>docs/figure4_pdac_tme_wording_freeze.md</w:t>
+              <w:t>docs/editorial_presubmission_packet.md</w:t>
             </w:r>
           </w:p>
         </w:tc>
@@ -6142,7 +6142,7 @@
           </w:tcPr>
           <w:p>
             <w:r>
-              <w:t>docs/figure4_strengthened_text_audit.md</w:t>
+              <w:t>docs/figure4_pdac_tme_wording_freeze.md</w:t>
             </w:r>
           </w:p>
         </w:tc>
@@ -6174,7 +6174,7 @@
           </w:tcPr>
           <w:p>
             <w:r>
-              <w:t>docs/figure_caption_source_audit.md</w:t>
+              <w:t>docs/figure4_strengthened_text_audit.md</w:t>
             </w:r>
           </w:p>
         </w:tc>
@@ -6206,7 +6206,7 @@
           </w:tcPr>
           <w:p>
             <w:r>
-              <w:t>docs/genome_biology_fallback_v2_packet.md</w:t>
+              <w:t>docs/figure_caption_source_audit.md</w:t>
             </w:r>
           </w:p>
         </w:tc>
@@ -6238,7 +6238,7 @@
           </w:tcPr>
           <w:p>
             <w:r>
-              <w:t>docs/high_impact_submission_dashboard.md</w:t>
+              <w:t>docs/genome_biology_fallback_v2_packet.md</w:t>
             </w:r>
           </w:p>
         </w:tc>
@@ -6250,7 +6250,7 @@
           </w:tcPr>
           <w:p>
             <w:r>
-              <w:t>M</w:t>
+              <w:t>A</w:t>
             </w:r>
           </w:p>
         </w:tc>
@@ -6270,7 +6270,7 @@
           </w:tcPr>
           <w:p>
             <w:r>
-              <w:t>docs/jif20_50_gap_assessment.md</w:t>
+              <w:t>docs/high_impact_submission_dashboard.md</w:t>
             </w:r>
           </w:p>
         </w:tc>
@@ -6302,7 +6302,7 @@
           </w:tcPr>
           <w:p>
             <w:r>
-              <w:t>docs/manual_author_execution_steps.md</w:t>
+              <w:t>docs/jif20_50_gap_assessment.md</w:t>
             </w:r>
           </w:p>
         </w:tc>
@@ -6314,7 +6314,7 @@
           </w:tcPr>
           <w:p>
             <w:r>
-              <w:t>A</w:t>
+              <w:t>M</w:t>
             </w:r>
           </w:p>
         </w:tc>
@@ -6334,7 +6334,7 @@
           </w:tcPr>
           <w:p>
             <w:r>
-              <w:t>docs/manual_next_actions_20_50.md</w:t>
+              <w:t>docs/manual_author_execution_steps.md</w:t>
             </w:r>
           </w:p>
         </w:tc>
@@ -6366,7 +6366,7 @@
           </w:tcPr>
           <w:p>
             <w:r>
-              <w:t>docs/manuscript_grade_null_power_grid_design.md</w:t>
+              <w:t>docs/manual_next_actions_20_50.md</w:t>
             </w:r>
           </w:p>
         </w:tc>
@@ -6398,7 +6398,7 @@
           </w:tcPr>
           <w:p>
             <w:r>
-              <w:t>docs/mentor_journal_decision_2026-05-10.md</w:t>
+              <w:t>docs/manuscript_grade_null_power_grid_design.md</w:t>
             </w:r>
           </w:p>
         </w:tc>
@@ -6430,7 +6430,7 @@
           </w:tcPr>
           <w:p>
             <w:r>
-              <w:t>docs/nature_methods_48h_execution_packet.md</w:t>
+              <w:t>docs/mentor_journal_decision_2026-05-10.md</w:t>
             </w:r>
           </w:p>
         </w:tc>
@@ -6462,7 +6462,7 @@
           </w:tcPr>
           <w:p>
             <w:r>
-              <w:t>docs/nature_methods_go_no_go_final.md</w:t>
+              <w:t>docs/nature_methods_48h_execution_packet.md</w:t>
             </w:r>
           </w:p>
         </w:tc>
@@ -6494,7 +6494,7 @@
           </w:tcPr>
           <w:p>
             <w:r>
-              <w:t>docs/nature_methods_next_round_gate_board.md</w:t>
+              <w:t>docs/nature_methods_go_no_go_final.md</w:t>
             </w:r>
           </w:p>
         </w:tc>
@@ -6526,7 +6526,7 @@
           </w:tcPr>
           <w:p>
             <w:r>
-              <w:t>docs/nature_methods_official_route_verification.md</w:t>
+              <w:t>docs/nature_methods_next_round_gate_board.md</w:t>
             </w:r>
           </w:p>
         </w:tc>
@@ -6558,7 +6558,7 @@
           </w:tcPr>
           <w:p>
             <w:r>
-              <w:t>docs/nature_methods_presubmission_send_runbook.md</w:t>
+              <w:t>docs/nature_methods_official_route_verification.md</w:t>
             </w:r>
           </w:p>
         </w:tc>
@@ -6651,7 +6651,7 @@
         <w:pStyle w:val="ListBullet"/>
       </w:pPr>
       <w:r>
-        <w:t>Blocking or holding gates: author_declarations;corresponding_author_figure4_ack;figure_caption_source_audit.</w:t>
+        <w:t>Blocking or holding gates: author_declarations;corresponding_author_figure4_ack;figure_caption_source_audit;git_worktree_clean.</w:t>
       </w:r>
     </w:p>
     <w:p>
@@ -6675,7 +6675,7 @@
         <w:pStyle w:val="ListBullet"/>
       </w:pPr>
       <w:r>
-        <w:t>blocked: 3</w:t>
+        <w:t>blocked: 4</w:t>
       </w:r>
     </w:p>
     <w:p>
@@ -6683,7 +6683,7 @@
         <w:pStyle w:val="ListBullet"/>
       </w:pPr>
       <w:r>
-        <w:t>pass: 3</w:t>
+        <w:t>pass: 2</w:t>
       </w:r>
     </w:p>
     <w:p>
@@ -7134,7 +7134,7 @@
           </w:tcPr>
           <w:p>
             <w:r>
-              <w:t>35 frozen evidence items exist.</w:t>
+              <w:t>36 frozen evidence items exist.</w:t>
             </w:r>
           </w:p>
         </w:tc>
@@ -7156,7 +7156,7 @@
           </w:tcPr>
           <w:p>
             <w:r>
-              <w:t>pass</w:t>
+              <w:t>blocked</w:t>
             </w:r>
           </w:p>
         </w:tc>
@@ -7166,7 +7166,7 @@
           </w:tcPr>
           <w:p>
             <w:r>
-              <w:t>controlled</w:t>
+              <w:t>release_blocker</w:t>
             </w:r>
           </w:p>
         </w:tc>
@@ -7176,7 +7176,7 @@
           </w:tcPr>
           <w:p>
             <w:r>
-              <w:t>No action.</w:t>
+              <w:t>Commit all release-facing changes before creating a tag.</w:t>
             </w:r>
           </w:p>
         </w:tc>
@@ -7186,7 +7186,7 @@
           </w:tcPr>
           <w:p>
             <w:r>
-              <w:t>Worktree is clean except self-generated preflight outputs.</w:t>
+              <w:t>M docs/post_release_version_coverage_audit.md; M results/submission/post_release_changed_files.tsv; M results/submission/post_release_version_coverage_audit.tsv</w:t>
             </w:r>
           </w:p>
         </w:tc>

</xml_diff>

<commit_message>
Refresh clean preflight after mentor reply
</commit_message>
<xml_diff>
--- a/output/doc/RMTGuard_external_review_packet_2026-05-12.docx
+++ b/output/doc/RMTGuard_external_review_packet_2026-05-12.docx
@@ -27,7 +27,7 @@
     </w:p>
     <w:p>
       <w:r>
-        <w:t>Generated: 2026-05-12 14:38:43</w:t>
+        <w:t>Generated: 2026-05-12 14:41:36</w:t>
       </w:r>
     </w:p>
     <w:tbl>
@@ -1244,7 +1244,7 @@
           </w:tcPr>
           <w:p>
             <w:r>
-              <w:t>blocked</w:t>
+              <w:t>pass</w:t>
             </w:r>
           </w:p>
         </w:tc>
@@ -1264,7 +1264,7 @@
           </w:tcPr>
           <w:p>
             <w:r>
-              <w:t>M docs/post_release_version_coverage_audit.md; M results/submission/post_release_changed_files.tsv; M results/submission/post_release_version_coverage_audit.tsv</w:t>
+              <w:t>Worktree is clean except self-generated preflight outputs.</w:t>
             </w:r>
           </w:p>
         </w:tc>
@@ -6651,7 +6651,7 @@
         <w:pStyle w:val="ListBullet"/>
       </w:pPr>
       <w:r>
-        <w:t>Blocking or holding gates: author_declarations;corresponding_author_figure4_ack;figure_caption_source_audit;git_worktree_clean.</w:t>
+        <w:t>Blocking or holding gates: author_declarations;corresponding_author_figure4_ack;figure_caption_source_audit.</w:t>
       </w:r>
     </w:p>
     <w:p>
@@ -6675,7 +6675,7 @@
         <w:pStyle w:val="ListBullet"/>
       </w:pPr>
       <w:r>
-        <w:t>blocked: 4</w:t>
+        <w:t>blocked: 3</w:t>
       </w:r>
     </w:p>
     <w:p>
@@ -6683,7 +6683,7 @@
         <w:pStyle w:val="ListBullet"/>
       </w:pPr>
       <w:r>
-        <w:t>pass: 2</w:t>
+        <w:t>pass: 3</w:t>
       </w:r>
     </w:p>
     <w:p>
@@ -7156,7 +7156,7 @@
           </w:tcPr>
           <w:p>
             <w:r>
-              <w:t>blocked</w:t>
+              <w:t>pass</w:t>
             </w:r>
           </w:p>
         </w:tc>
@@ -7166,7 +7166,7 @@
           </w:tcPr>
           <w:p>
             <w:r>
-              <w:t>release_blocker</w:t>
+              <w:t>controlled</w:t>
             </w:r>
           </w:p>
         </w:tc>
@@ -7176,7 +7176,7 @@
           </w:tcPr>
           <w:p>
             <w:r>
-              <w:t>Commit all release-facing changes before creating a tag.</w:t>
+              <w:t>No action.</w:t>
             </w:r>
           </w:p>
         </w:tc>
@@ -7186,7 +7186,7 @@
           </w:tcPr>
           <w:p>
             <w:r>
-              <w:t>M docs/post_release_version_coverage_audit.md; M results/submission/post_release_changed_files.tsv; M results/submission/post_release_version_coverage_audit.tsv</w:t>
+              <w:t>Worktree is clean except self-generated preflight outputs.</w:t>
             </w:r>
           </w:p>
         </w:tc>

</xml_diff>